<commit_message>
docs: reorganiza el README como portada del proyecto y la documentacion en docs/
El README presenta el proyecto y empieza por los comandos de ejecucion. El detalle tecnico pasa a docs/tecnico y docs/casos-minimos, los entregables a docs/entregables, con un indice en docs/README.md; se actualizan enlaces, rutas y afirmaciones desactualizadas en los documentos de detalle y en el documento tecnico.
</commit_message>
<xml_diff>
--- a/docs/entregables/documento-tecnico.docx
+++ b/docs/entregables/documento-tecnico.docx
@@ -104,7 +104,7 @@
           <w:r>
             <w:fldChar w:fldCharType="separate"/>
           </w:r>
-          <w:hyperlink w:anchor="_Toc243184674" w:history="1">
+          <w:hyperlink w:anchor="_Toc243205892" w:history="1">
             <w:r>
               <w:rPr>
                 <w:rStyle w:val="Hipervnculo"/>
@@ -131,7 +131,7 @@
                 <w:noProof/>
                 <w:webHidden/>
               </w:rPr>
-              <w:instrText xml:space="preserve"> PAGEREF _Toc243184674 \h </w:instrText>
+              <w:instrText xml:space="preserve"> PAGEREF _Toc243205892 \h </w:instrText>
             </w:r>
             <w:r>
               <w:rPr>
@@ -178,7 +178,7 @@
               <w14:ligatures w14:val="standardContextual"/>
             </w:rPr>
           </w:pPr>
-          <w:hyperlink w:anchor="_Toc243184675" w:history="1">
+          <w:hyperlink w:anchor="_Toc243205893" w:history="1">
             <w:r>
               <w:rPr>
                 <w:rStyle w:val="Hipervnculo"/>
@@ -205,7 +205,7 @@
                 <w:noProof/>
                 <w:webHidden/>
               </w:rPr>
-              <w:instrText xml:space="preserve"> PAGEREF _Toc243184675 \h </w:instrText>
+              <w:instrText xml:space="preserve"> PAGEREF _Toc243205893 \h </w:instrText>
             </w:r>
             <w:r>
               <w:rPr>
@@ -252,7 +252,7 @@
               <w14:ligatures w14:val="standardContextual"/>
             </w:rPr>
           </w:pPr>
-          <w:hyperlink w:anchor="_Toc243184676" w:history="1">
+          <w:hyperlink w:anchor="_Toc243205894" w:history="1">
             <w:r>
               <w:rPr>
                 <w:rStyle w:val="Hipervnculo"/>
@@ -279,7 +279,7 @@
                 <w:noProof/>
                 <w:webHidden/>
               </w:rPr>
-              <w:instrText xml:space="preserve"> PAGEREF _Toc243184676 \h </w:instrText>
+              <w:instrText xml:space="preserve"> PAGEREF _Toc243205894 \h </w:instrText>
             </w:r>
             <w:r>
               <w:rPr>
@@ -326,7 +326,7 @@
               <w14:ligatures w14:val="standardContextual"/>
             </w:rPr>
           </w:pPr>
-          <w:hyperlink w:anchor="_Toc243184677" w:history="1">
+          <w:hyperlink w:anchor="_Toc243205895" w:history="1">
             <w:r>
               <w:rPr>
                 <w:rStyle w:val="Hipervnculo"/>
@@ -353,7 +353,7 @@
                 <w:noProof/>
                 <w:webHidden/>
               </w:rPr>
-              <w:instrText xml:space="preserve"> PAGEREF _Toc243184677 \h </w:instrText>
+              <w:instrText xml:space="preserve"> PAGEREF _Toc243205895 \h </w:instrText>
             </w:r>
             <w:r>
               <w:rPr>
@@ -400,7 +400,7 @@
               <w14:ligatures w14:val="standardContextual"/>
             </w:rPr>
           </w:pPr>
-          <w:hyperlink w:anchor="_Toc243184678" w:history="1">
+          <w:hyperlink w:anchor="_Toc243205896" w:history="1">
             <w:r>
               <w:rPr>
                 <w:rStyle w:val="Hipervnculo"/>
@@ -427,7 +427,7 @@
                 <w:noProof/>
                 <w:webHidden/>
               </w:rPr>
-              <w:instrText xml:space="preserve"> PAGEREF _Toc243184678 \h </w:instrText>
+              <w:instrText xml:space="preserve"> PAGEREF _Toc243205896 \h </w:instrText>
             </w:r>
             <w:r>
               <w:rPr>
@@ -474,7 +474,7 @@
               <w14:ligatures w14:val="standardContextual"/>
             </w:rPr>
           </w:pPr>
-          <w:hyperlink w:anchor="_Toc243184679" w:history="1">
+          <w:hyperlink w:anchor="_Toc243205897" w:history="1">
             <w:r>
               <w:rPr>
                 <w:rStyle w:val="Hipervnculo"/>
@@ -501,7 +501,7 @@
                 <w:noProof/>
                 <w:webHidden/>
               </w:rPr>
-              <w:instrText xml:space="preserve"> PAGEREF _Toc243184679 \h </w:instrText>
+              <w:instrText xml:space="preserve"> PAGEREF _Toc243205897 \h </w:instrText>
             </w:r>
             <w:r>
               <w:rPr>
@@ -548,7 +548,7 @@
               <w14:ligatures w14:val="standardContextual"/>
             </w:rPr>
           </w:pPr>
-          <w:hyperlink w:anchor="_Toc243184680" w:history="1">
+          <w:hyperlink w:anchor="_Toc243205898" w:history="1">
             <w:r>
               <w:rPr>
                 <w:rStyle w:val="Hipervnculo"/>
@@ -575,7 +575,7 @@
                 <w:noProof/>
                 <w:webHidden/>
               </w:rPr>
-              <w:instrText xml:space="preserve"> PAGEREF _Toc243184680 \h </w:instrText>
+              <w:instrText xml:space="preserve"> PAGEREF _Toc243205898 \h </w:instrText>
             </w:r>
             <w:r>
               <w:rPr>
@@ -622,7 +622,7 @@
               <w14:ligatures w14:val="standardContextual"/>
             </w:rPr>
           </w:pPr>
-          <w:hyperlink w:anchor="_Toc243184681" w:history="1">
+          <w:hyperlink w:anchor="_Toc243205899" w:history="1">
             <w:r>
               <w:rPr>
                 <w:rStyle w:val="Hipervnculo"/>
@@ -649,7 +649,7 @@
                 <w:noProof/>
                 <w:webHidden/>
               </w:rPr>
-              <w:instrText xml:space="preserve"> PAGEREF _Toc243184681 \h </w:instrText>
+              <w:instrText xml:space="preserve"> PAGEREF _Toc243205899 \h </w:instrText>
             </w:r>
             <w:r>
               <w:rPr>
@@ -696,7 +696,7 @@
               <w14:ligatures w14:val="standardContextual"/>
             </w:rPr>
           </w:pPr>
-          <w:hyperlink w:anchor="_Toc243184682" w:history="1">
+          <w:hyperlink w:anchor="_Toc243205900" w:history="1">
             <w:r>
               <w:rPr>
                 <w:rStyle w:val="Hipervnculo"/>
@@ -723,7 +723,7 @@
                 <w:noProof/>
                 <w:webHidden/>
               </w:rPr>
-              <w:instrText xml:space="preserve"> PAGEREF _Toc243184682 \h </w:instrText>
+              <w:instrText xml:space="preserve"> PAGEREF _Toc243205900 \h </w:instrText>
             </w:r>
             <w:r>
               <w:rPr>
@@ -770,7 +770,7 @@
               <w14:ligatures w14:val="standardContextual"/>
             </w:rPr>
           </w:pPr>
-          <w:hyperlink w:anchor="_Toc243184683" w:history="1">
+          <w:hyperlink w:anchor="_Toc243205901" w:history="1">
             <w:r>
               <w:rPr>
                 <w:rStyle w:val="Hipervnculo"/>
@@ -797,7 +797,7 @@
                 <w:noProof/>
                 <w:webHidden/>
               </w:rPr>
-              <w:instrText xml:space="preserve"> PAGEREF _Toc243184683 \h </w:instrText>
+              <w:instrText xml:space="preserve"> PAGEREF _Toc243205901 \h </w:instrText>
             </w:r>
             <w:r>
               <w:rPr>
@@ -844,7 +844,7 @@
               <w14:ligatures w14:val="standardContextual"/>
             </w:rPr>
           </w:pPr>
-          <w:hyperlink w:anchor="_Toc243184684" w:history="1">
+          <w:hyperlink w:anchor="_Toc243205902" w:history="1">
             <w:r>
               <w:rPr>
                 <w:rStyle w:val="Hipervnculo"/>
@@ -871,7 +871,7 @@
                 <w:noProof/>
                 <w:webHidden/>
               </w:rPr>
-              <w:instrText xml:space="preserve"> PAGEREF _Toc243184684 \h </w:instrText>
+              <w:instrText xml:space="preserve"> PAGEREF _Toc243205902 \h </w:instrText>
             </w:r>
             <w:r>
               <w:rPr>
@@ -918,7 +918,7 @@
               <w14:ligatures w14:val="standardContextual"/>
             </w:rPr>
           </w:pPr>
-          <w:hyperlink w:anchor="_Toc243184685" w:history="1">
+          <w:hyperlink w:anchor="_Toc243205903" w:history="1">
             <w:r>
               <w:rPr>
                 <w:rStyle w:val="Hipervnculo"/>
@@ -945,7 +945,7 @@
                 <w:noProof/>
                 <w:webHidden/>
               </w:rPr>
-              <w:instrText xml:space="preserve"> PAGEREF _Toc243184685 \h </w:instrText>
+              <w:instrText xml:space="preserve"> PAGEREF _Toc243205903 \h </w:instrText>
             </w:r>
             <w:r>
               <w:rPr>
@@ -992,7 +992,7 @@
               <w14:ligatures w14:val="standardContextual"/>
             </w:rPr>
           </w:pPr>
-          <w:hyperlink w:anchor="_Toc243184686" w:history="1">
+          <w:hyperlink w:anchor="_Toc243205904" w:history="1">
             <w:r>
               <w:rPr>
                 <w:rStyle w:val="Hipervnculo"/>
@@ -1019,7 +1019,7 @@
                 <w:noProof/>
                 <w:webHidden/>
               </w:rPr>
-              <w:instrText xml:space="preserve"> PAGEREF _Toc243184686 \h </w:instrText>
+              <w:instrText xml:space="preserve"> PAGEREF _Toc243205904 \h </w:instrText>
             </w:r>
             <w:r>
               <w:rPr>
@@ -1066,7 +1066,7 @@
               <w14:ligatures w14:val="standardContextual"/>
             </w:rPr>
           </w:pPr>
-          <w:hyperlink w:anchor="_Toc243184687" w:history="1">
+          <w:hyperlink w:anchor="_Toc243205905" w:history="1">
             <w:r>
               <w:rPr>
                 <w:rStyle w:val="Hipervnculo"/>
@@ -1093,7 +1093,7 @@
                 <w:noProof/>
                 <w:webHidden/>
               </w:rPr>
-              <w:instrText xml:space="preserve"> PAGEREF _Toc243184687 \h </w:instrText>
+              <w:instrText xml:space="preserve"> PAGEREF _Toc243205905 \h </w:instrText>
             </w:r>
             <w:r>
               <w:rPr>
@@ -1140,7 +1140,7 @@
               <w14:ligatures w14:val="standardContextual"/>
             </w:rPr>
           </w:pPr>
-          <w:hyperlink w:anchor="_Toc243184688" w:history="1">
+          <w:hyperlink w:anchor="_Toc243205906" w:history="1">
             <w:r>
               <w:rPr>
                 <w:rStyle w:val="Hipervnculo"/>
@@ -1167,7 +1167,7 @@
                 <w:noProof/>
                 <w:webHidden/>
               </w:rPr>
-              <w:instrText xml:space="preserve"> PAGEREF _Toc243184688 \h </w:instrText>
+              <w:instrText xml:space="preserve"> PAGEREF _Toc243205906 \h </w:instrText>
             </w:r>
             <w:r>
               <w:rPr>
@@ -1214,7 +1214,7 @@
               <w14:ligatures w14:val="standardContextual"/>
             </w:rPr>
           </w:pPr>
-          <w:hyperlink w:anchor="_Toc243184689" w:history="1">
+          <w:hyperlink w:anchor="_Toc243205907" w:history="1">
             <w:r>
               <w:rPr>
                 <w:rStyle w:val="Hipervnculo"/>
@@ -1241,7 +1241,7 @@
                 <w:noProof/>
                 <w:webHidden/>
               </w:rPr>
-              <w:instrText xml:space="preserve"> PAGEREF _Toc243184689 \h </w:instrText>
+              <w:instrText xml:space="preserve"> PAGEREF _Toc243205907 \h </w:instrText>
             </w:r>
             <w:r>
               <w:rPr>
@@ -1288,7 +1288,7 @@
               <w14:ligatures w14:val="standardContextual"/>
             </w:rPr>
           </w:pPr>
-          <w:hyperlink w:anchor="_Toc243184690" w:history="1">
+          <w:hyperlink w:anchor="_Toc243205908" w:history="1">
             <w:r>
               <w:rPr>
                 <w:rStyle w:val="Hipervnculo"/>
@@ -1315,7 +1315,7 @@
                 <w:noProof/>
                 <w:webHidden/>
               </w:rPr>
-              <w:instrText xml:space="preserve"> PAGEREF _Toc243184690 \h </w:instrText>
+              <w:instrText xml:space="preserve"> PAGEREF _Toc243205908 \h </w:instrText>
             </w:r>
             <w:r>
               <w:rPr>
@@ -1362,7 +1362,7 @@
               <w14:ligatures w14:val="standardContextual"/>
             </w:rPr>
           </w:pPr>
-          <w:hyperlink w:anchor="_Toc243184691" w:history="1">
+          <w:hyperlink w:anchor="_Toc243205909" w:history="1">
             <w:r>
               <w:rPr>
                 <w:rStyle w:val="Hipervnculo"/>
@@ -1389,7 +1389,7 @@
                 <w:noProof/>
                 <w:webHidden/>
               </w:rPr>
-              <w:instrText xml:space="preserve"> PAGEREF _Toc243184691 \h </w:instrText>
+              <w:instrText xml:space="preserve"> PAGEREF _Toc243205909 \h </w:instrText>
             </w:r>
             <w:r>
               <w:rPr>
@@ -1436,7 +1436,7 @@
               <w14:ligatures w14:val="standardContextual"/>
             </w:rPr>
           </w:pPr>
-          <w:hyperlink w:anchor="_Toc243184692" w:history="1">
+          <w:hyperlink w:anchor="_Toc243205910" w:history="1">
             <w:r>
               <w:rPr>
                 <w:rStyle w:val="Hipervnculo"/>
@@ -1463,7 +1463,7 @@
                 <w:noProof/>
                 <w:webHidden/>
               </w:rPr>
-              <w:instrText xml:space="preserve"> PAGEREF _Toc243184692 \h </w:instrText>
+              <w:instrText xml:space="preserve"> PAGEREF _Toc243205910 \h </w:instrText>
             </w:r>
             <w:r>
               <w:rPr>
@@ -1510,7 +1510,7 @@
               <w14:ligatures w14:val="standardContextual"/>
             </w:rPr>
           </w:pPr>
-          <w:hyperlink w:anchor="_Toc243184693" w:history="1">
+          <w:hyperlink w:anchor="_Toc243205911" w:history="1">
             <w:r>
               <w:rPr>
                 <w:rStyle w:val="Hipervnculo"/>
@@ -1537,7 +1537,7 @@
                 <w:noProof/>
                 <w:webHidden/>
               </w:rPr>
-              <w:instrText xml:space="preserve"> PAGEREF _Toc243184693 \h </w:instrText>
+              <w:instrText xml:space="preserve"> PAGEREF _Toc243205911 \h </w:instrText>
             </w:r>
             <w:r>
               <w:rPr>
@@ -1584,7 +1584,7 @@
               <w14:ligatures w14:val="standardContextual"/>
             </w:rPr>
           </w:pPr>
-          <w:hyperlink w:anchor="_Toc243184694" w:history="1">
+          <w:hyperlink w:anchor="_Toc243205912" w:history="1">
             <w:r>
               <w:rPr>
                 <w:rStyle w:val="Hipervnculo"/>
@@ -1611,7 +1611,7 @@
                 <w:noProof/>
                 <w:webHidden/>
               </w:rPr>
-              <w:instrText xml:space="preserve"> PAGEREF _Toc243184694 \h </w:instrText>
+              <w:instrText xml:space="preserve"> PAGEREF _Toc243205912 \h </w:instrText>
             </w:r>
             <w:r>
               <w:rPr>
@@ -1658,7 +1658,7 @@
               <w14:ligatures w14:val="standardContextual"/>
             </w:rPr>
           </w:pPr>
-          <w:hyperlink w:anchor="_Toc243184695" w:history="1">
+          <w:hyperlink w:anchor="_Toc243205913" w:history="1">
             <w:r>
               <w:rPr>
                 <w:rStyle w:val="Hipervnculo"/>
@@ -1685,7 +1685,7 @@
                 <w:noProof/>
                 <w:webHidden/>
               </w:rPr>
-              <w:instrText xml:space="preserve"> PAGEREF _Toc243184695 \h </w:instrText>
+              <w:instrText xml:space="preserve"> PAGEREF _Toc243205913 \h </w:instrText>
             </w:r>
             <w:r>
               <w:rPr>
@@ -1732,7 +1732,7 @@
               <w14:ligatures w14:val="standardContextual"/>
             </w:rPr>
           </w:pPr>
-          <w:hyperlink w:anchor="_Toc243184696" w:history="1">
+          <w:hyperlink w:anchor="_Toc243205914" w:history="1">
             <w:r>
               <w:rPr>
                 <w:rStyle w:val="Hipervnculo"/>
@@ -1759,7 +1759,7 @@
                 <w:noProof/>
                 <w:webHidden/>
               </w:rPr>
-              <w:instrText xml:space="preserve"> PAGEREF _Toc243184696 \h </w:instrText>
+              <w:instrText xml:space="preserve"> PAGEREF _Toc243205914 \h </w:instrText>
             </w:r>
             <w:r>
               <w:rPr>
@@ -1806,7 +1806,7 @@
               <w14:ligatures w14:val="standardContextual"/>
             </w:rPr>
           </w:pPr>
-          <w:hyperlink w:anchor="_Toc243184697" w:history="1">
+          <w:hyperlink w:anchor="_Toc243205915" w:history="1">
             <w:r>
               <w:rPr>
                 <w:rStyle w:val="Hipervnculo"/>
@@ -1833,7 +1833,7 @@
                 <w:noProof/>
                 <w:webHidden/>
               </w:rPr>
-              <w:instrText xml:space="preserve"> PAGEREF _Toc243184697 \h </w:instrText>
+              <w:instrText xml:space="preserve"> PAGEREF _Toc243205915 \h </w:instrText>
             </w:r>
             <w:r>
               <w:rPr>
@@ -1880,7 +1880,7 @@
               <w14:ligatures w14:val="standardContextual"/>
             </w:rPr>
           </w:pPr>
-          <w:hyperlink w:anchor="_Toc243184698" w:history="1">
+          <w:hyperlink w:anchor="_Toc243205916" w:history="1">
             <w:r>
               <w:rPr>
                 <w:rStyle w:val="Hipervnculo"/>
@@ -1907,7 +1907,7 @@
                 <w:noProof/>
                 <w:webHidden/>
               </w:rPr>
-              <w:instrText xml:space="preserve"> PAGEREF _Toc243184698 \h </w:instrText>
+              <w:instrText xml:space="preserve"> PAGEREF _Toc243205916 \h </w:instrText>
             </w:r>
             <w:r>
               <w:rPr>
@@ -1954,7 +1954,7 @@
               <w14:ligatures w14:val="standardContextual"/>
             </w:rPr>
           </w:pPr>
-          <w:hyperlink w:anchor="_Toc243184699" w:history="1">
+          <w:hyperlink w:anchor="_Toc243205917" w:history="1">
             <w:r>
               <w:rPr>
                 <w:rStyle w:val="Hipervnculo"/>
@@ -1981,7 +1981,7 @@
                 <w:noProof/>
                 <w:webHidden/>
               </w:rPr>
-              <w:instrText xml:space="preserve"> PAGEREF _Toc243184699 \h </w:instrText>
+              <w:instrText xml:space="preserve"> PAGEREF _Toc243205917 \h </w:instrText>
             </w:r>
             <w:r>
               <w:rPr>
@@ -2028,7 +2028,7 @@
               <w14:ligatures w14:val="standardContextual"/>
             </w:rPr>
           </w:pPr>
-          <w:hyperlink w:anchor="_Toc243184700" w:history="1">
+          <w:hyperlink w:anchor="_Toc243205918" w:history="1">
             <w:r>
               <w:rPr>
                 <w:rStyle w:val="Hipervnculo"/>
@@ -2055,7 +2055,7 @@
                 <w:noProof/>
                 <w:webHidden/>
               </w:rPr>
-              <w:instrText xml:space="preserve"> PAGEREF _Toc243184700 \h </w:instrText>
+              <w:instrText xml:space="preserve"> PAGEREF _Toc243205918 \h </w:instrText>
             </w:r>
             <w:r>
               <w:rPr>
@@ -2102,7 +2102,7 @@
               <w14:ligatures w14:val="standardContextual"/>
             </w:rPr>
           </w:pPr>
-          <w:hyperlink w:anchor="_Toc243184701" w:history="1">
+          <w:hyperlink w:anchor="_Toc243205919" w:history="1">
             <w:r>
               <w:rPr>
                 <w:rStyle w:val="Hipervnculo"/>
@@ -2129,7 +2129,7 @@
                 <w:noProof/>
                 <w:webHidden/>
               </w:rPr>
-              <w:instrText xml:space="preserve"> PAGEREF _Toc243184701 \h </w:instrText>
+              <w:instrText xml:space="preserve"> PAGEREF _Toc243205919 \h </w:instrText>
             </w:r>
             <w:r>
               <w:rPr>
@@ -2176,7 +2176,7 @@
               <w14:ligatures w14:val="standardContextual"/>
             </w:rPr>
           </w:pPr>
-          <w:hyperlink w:anchor="_Toc243184702" w:history="1">
+          <w:hyperlink w:anchor="_Toc243205920" w:history="1">
             <w:r>
               <w:rPr>
                 <w:rStyle w:val="Hipervnculo"/>
@@ -2203,7 +2203,7 @@
                 <w:noProof/>
                 <w:webHidden/>
               </w:rPr>
-              <w:instrText xml:space="preserve"> PAGEREF _Toc243184702 \h </w:instrText>
+              <w:instrText xml:space="preserve"> PAGEREF _Toc243205920 \h </w:instrText>
             </w:r>
             <w:r>
               <w:rPr>
@@ -2250,7 +2250,7 @@
               <w14:ligatures w14:val="standardContextual"/>
             </w:rPr>
           </w:pPr>
-          <w:hyperlink w:anchor="_Toc243184703" w:history="1">
+          <w:hyperlink w:anchor="_Toc243205921" w:history="1">
             <w:r>
               <w:rPr>
                 <w:rStyle w:val="Hipervnculo"/>
@@ -2277,7 +2277,7 @@
                 <w:noProof/>
                 <w:webHidden/>
               </w:rPr>
-              <w:instrText xml:space="preserve"> PAGEREF _Toc243184703 \h </w:instrText>
+              <w:instrText xml:space="preserve"> PAGEREF _Toc243205921 \h </w:instrText>
             </w:r>
             <w:r>
               <w:rPr>
@@ -2324,7 +2324,7 @@
               <w14:ligatures w14:val="standardContextual"/>
             </w:rPr>
           </w:pPr>
-          <w:hyperlink w:anchor="_Toc243184704" w:history="1">
+          <w:hyperlink w:anchor="_Toc243205922" w:history="1">
             <w:r>
               <w:rPr>
                 <w:rStyle w:val="Hipervnculo"/>
@@ -2351,7 +2351,7 @@
                 <w:noProof/>
                 <w:webHidden/>
               </w:rPr>
-              <w:instrText xml:space="preserve"> PAGEREF _Toc243184704 \h </w:instrText>
+              <w:instrText xml:space="preserve"> PAGEREF _Toc243205922 \h </w:instrText>
             </w:r>
             <w:r>
               <w:rPr>
@@ -2398,7 +2398,7 @@
               <w14:ligatures w14:val="standardContextual"/>
             </w:rPr>
           </w:pPr>
-          <w:hyperlink w:anchor="_Toc243184705" w:history="1">
+          <w:hyperlink w:anchor="_Toc243205923" w:history="1">
             <w:r>
               <w:rPr>
                 <w:rStyle w:val="Hipervnculo"/>
@@ -2425,7 +2425,7 @@
                 <w:noProof/>
                 <w:webHidden/>
               </w:rPr>
-              <w:instrText xml:space="preserve"> PAGEREF _Toc243184705 \h </w:instrText>
+              <w:instrText xml:space="preserve"> PAGEREF _Toc243205923 \h </w:instrText>
             </w:r>
             <w:r>
               <w:rPr>
@@ -2472,7 +2472,7 @@
               <w14:ligatures w14:val="standardContextual"/>
             </w:rPr>
           </w:pPr>
-          <w:hyperlink w:anchor="_Toc243184706" w:history="1">
+          <w:hyperlink w:anchor="_Toc243205924" w:history="1">
             <w:r>
               <w:rPr>
                 <w:rStyle w:val="Hipervnculo"/>
@@ -2499,7 +2499,7 @@
                 <w:noProof/>
                 <w:webHidden/>
               </w:rPr>
-              <w:instrText xml:space="preserve"> PAGEREF _Toc243184706 \h </w:instrText>
+              <w:instrText xml:space="preserve"> PAGEREF _Toc243205924 \h </w:instrText>
             </w:r>
             <w:r>
               <w:rPr>
@@ -2546,7 +2546,7 @@
               <w14:ligatures w14:val="standardContextual"/>
             </w:rPr>
           </w:pPr>
-          <w:hyperlink w:anchor="_Toc243184707" w:history="1">
+          <w:hyperlink w:anchor="_Toc243205925" w:history="1">
             <w:r>
               <w:rPr>
                 <w:rStyle w:val="Hipervnculo"/>
@@ -2573,7 +2573,7 @@
                 <w:noProof/>
                 <w:webHidden/>
               </w:rPr>
-              <w:instrText xml:space="preserve"> PAGEREF _Toc243184707 \h </w:instrText>
+              <w:instrText xml:space="preserve"> PAGEREF _Toc243205925 \h </w:instrText>
             </w:r>
             <w:r>
               <w:rPr>
@@ -2620,7 +2620,7 @@
               <w14:ligatures w14:val="standardContextual"/>
             </w:rPr>
           </w:pPr>
-          <w:hyperlink w:anchor="_Toc243184708" w:history="1">
+          <w:hyperlink w:anchor="_Toc243205926" w:history="1">
             <w:r>
               <w:rPr>
                 <w:rStyle w:val="Hipervnculo"/>
@@ -2647,7 +2647,7 @@
                 <w:noProof/>
                 <w:webHidden/>
               </w:rPr>
-              <w:instrText xml:space="preserve"> PAGEREF _Toc243184708 \h </w:instrText>
+              <w:instrText xml:space="preserve"> PAGEREF _Toc243205926 \h </w:instrText>
             </w:r>
             <w:r>
               <w:rPr>
@@ -2694,7 +2694,7 @@
               <w14:ligatures w14:val="standardContextual"/>
             </w:rPr>
           </w:pPr>
-          <w:hyperlink w:anchor="_Toc243184709" w:history="1">
+          <w:hyperlink w:anchor="_Toc243205927" w:history="1">
             <w:r>
               <w:rPr>
                 <w:rStyle w:val="Hipervnculo"/>
@@ -2721,7 +2721,7 @@
                 <w:noProof/>
                 <w:webHidden/>
               </w:rPr>
-              <w:instrText xml:space="preserve"> PAGEREF _Toc243184709 \h </w:instrText>
+              <w:instrText xml:space="preserve"> PAGEREF _Toc243205927 \h </w:instrText>
             </w:r>
             <w:r>
               <w:rPr>
@@ -2768,7 +2768,7 @@
               <w14:ligatures w14:val="standardContextual"/>
             </w:rPr>
           </w:pPr>
-          <w:hyperlink w:anchor="_Toc243184710" w:history="1">
+          <w:hyperlink w:anchor="_Toc243205928" w:history="1">
             <w:r>
               <w:rPr>
                 <w:rStyle w:val="Hipervnculo"/>
@@ -2795,7 +2795,7 @@
                 <w:noProof/>
                 <w:webHidden/>
               </w:rPr>
-              <w:instrText xml:space="preserve"> PAGEREF _Toc243184710 \h </w:instrText>
+              <w:instrText xml:space="preserve"> PAGEREF _Toc243205928 \h </w:instrText>
             </w:r>
             <w:r>
               <w:rPr>
@@ -2842,7 +2842,7 @@
               <w14:ligatures w14:val="standardContextual"/>
             </w:rPr>
           </w:pPr>
-          <w:hyperlink w:anchor="_Toc243184711" w:history="1">
+          <w:hyperlink w:anchor="_Toc243205929" w:history="1">
             <w:r>
               <w:rPr>
                 <w:rStyle w:val="Hipervnculo"/>
@@ -2869,7 +2869,7 @@
                 <w:noProof/>
                 <w:webHidden/>
               </w:rPr>
-              <w:instrText xml:space="preserve"> PAGEREF _Toc243184711 \h </w:instrText>
+              <w:instrText xml:space="preserve"> PAGEREF _Toc243205929 \h </w:instrText>
             </w:r>
             <w:r>
               <w:rPr>
@@ -2916,7 +2916,7 @@
               <w14:ligatures w14:val="standardContextual"/>
             </w:rPr>
           </w:pPr>
-          <w:hyperlink w:anchor="_Toc243184712" w:history="1">
+          <w:hyperlink w:anchor="_Toc243205930" w:history="1">
             <w:r>
               <w:rPr>
                 <w:rStyle w:val="Hipervnculo"/>
@@ -2943,7 +2943,7 @@
                 <w:noProof/>
                 <w:webHidden/>
               </w:rPr>
-              <w:instrText xml:space="preserve"> PAGEREF _Toc243184712 \h </w:instrText>
+              <w:instrText xml:space="preserve"> PAGEREF _Toc243205930 \h </w:instrText>
             </w:r>
             <w:r>
               <w:rPr>
@@ -2990,7 +2990,7 @@
               <w14:ligatures w14:val="standardContextual"/>
             </w:rPr>
           </w:pPr>
-          <w:hyperlink w:anchor="_Toc243184713" w:history="1">
+          <w:hyperlink w:anchor="_Toc243205931" w:history="1">
             <w:r>
               <w:rPr>
                 <w:rStyle w:val="Hipervnculo"/>
@@ -3017,7 +3017,7 @@
                 <w:noProof/>
                 <w:webHidden/>
               </w:rPr>
-              <w:instrText xml:space="preserve"> PAGEREF _Toc243184713 \h </w:instrText>
+              <w:instrText xml:space="preserve"> PAGEREF _Toc243205931 \h </w:instrText>
             </w:r>
             <w:r>
               <w:rPr>
@@ -3064,7 +3064,7 @@
               <w14:ligatures w14:val="standardContextual"/>
             </w:rPr>
           </w:pPr>
-          <w:hyperlink w:anchor="_Toc243184714" w:history="1">
+          <w:hyperlink w:anchor="_Toc243205932" w:history="1">
             <w:r>
               <w:rPr>
                 <w:rStyle w:val="Hipervnculo"/>
@@ -3091,7 +3091,7 @@
                 <w:noProof/>
                 <w:webHidden/>
               </w:rPr>
-              <w:instrText xml:space="preserve"> PAGEREF _Toc243184714 \h </w:instrText>
+              <w:instrText xml:space="preserve"> PAGEREF _Toc243205932 \h </w:instrText>
             </w:r>
             <w:r>
               <w:rPr>
@@ -3138,7 +3138,7 @@
               <w14:ligatures w14:val="standardContextual"/>
             </w:rPr>
           </w:pPr>
-          <w:hyperlink w:anchor="_Toc243184715" w:history="1">
+          <w:hyperlink w:anchor="_Toc243205933" w:history="1">
             <w:r>
               <w:rPr>
                 <w:rStyle w:val="Hipervnculo"/>
@@ -3165,7 +3165,7 @@
                 <w:noProof/>
                 <w:webHidden/>
               </w:rPr>
-              <w:instrText xml:space="preserve"> PAGEREF _Toc243184715 \h </w:instrText>
+              <w:instrText xml:space="preserve"> PAGEREF _Toc243205933 \h </w:instrText>
             </w:r>
             <w:r>
               <w:rPr>
@@ -3212,7 +3212,7 @@
               <w14:ligatures w14:val="standardContextual"/>
             </w:rPr>
           </w:pPr>
-          <w:hyperlink w:anchor="_Toc243184716" w:history="1">
+          <w:hyperlink w:anchor="_Toc243205934" w:history="1">
             <w:r>
               <w:rPr>
                 <w:rStyle w:val="Hipervnculo"/>
@@ -3239,7 +3239,7 @@
                 <w:noProof/>
                 <w:webHidden/>
               </w:rPr>
-              <w:instrText xml:space="preserve"> PAGEREF _Toc243184716 \h </w:instrText>
+              <w:instrText xml:space="preserve"> PAGEREF _Toc243205934 \h </w:instrText>
             </w:r>
             <w:r>
               <w:rPr>
@@ -3286,7 +3286,7 @@
               <w14:ligatures w14:val="standardContextual"/>
             </w:rPr>
           </w:pPr>
-          <w:hyperlink w:anchor="_Toc243184717" w:history="1">
+          <w:hyperlink w:anchor="_Toc243205935" w:history="1">
             <w:r>
               <w:rPr>
                 <w:rStyle w:val="Hipervnculo"/>
@@ -3313,7 +3313,7 @@
                 <w:noProof/>
                 <w:webHidden/>
               </w:rPr>
-              <w:instrText xml:space="preserve"> PAGEREF _Toc243184717 \h </w:instrText>
+              <w:instrText xml:space="preserve"> PAGEREF _Toc243205935 \h </w:instrText>
             </w:r>
             <w:r>
               <w:rPr>
@@ -3360,7 +3360,7 @@
               <w14:ligatures w14:val="standardContextual"/>
             </w:rPr>
           </w:pPr>
-          <w:hyperlink w:anchor="_Toc243184718" w:history="1">
+          <w:hyperlink w:anchor="_Toc243205936" w:history="1">
             <w:r>
               <w:rPr>
                 <w:rStyle w:val="Hipervnculo"/>
@@ -3387,7 +3387,7 @@
                 <w:noProof/>
                 <w:webHidden/>
               </w:rPr>
-              <w:instrText xml:space="preserve"> PAGEREF _Toc243184718 \h </w:instrText>
+              <w:instrText xml:space="preserve"> PAGEREF _Toc243205936 \h </w:instrText>
             </w:r>
             <w:r>
               <w:rPr>
@@ -3434,7 +3434,7 @@
               <w14:ligatures w14:val="standardContextual"/>
             </w:rPr>
           </w:pPr>
-          <w:hyperlink w:anchor="_Toc243184719" w:history="1">
+          <w:hyperlink w:anchor="_Toc243205937" w:history="1">
             <w:r>
               <w:rPr>
                 <w:rStyle w:val="Hipervnculo"/>
@@ -3461,7 +3461,7 @@
                 <w:noProof/>
                 <w:webHidden/>
               </w:rPr>
-              <w:instrText xml:space="preserve"> PAGEREF _Toc243184719 \h </w:instrText>
+              <w:instrText xml:space="preserve"> PAGEREF _Toc243205937 \h </w:instrText>
             </w:r>
             <w:r>
               <w:rPr>
@@ -3508,7 +3508,7 @@
               <w14:ligatures w14:val="standardContextual"/>
             </w:rPr>
           </w:pPr>
-          <w:hyperlink w:anchor="_Toc243184720" w:history="1">
+          <w:hyperlink w:anchor="_Toc243205938" w:history="1">
             <w:r>
               <w:rPr>
                 <w:rStyle w:val="Hipervnculo"/>
@@ -3535,7 +3535,7 @@
                 <w:noProof/>
                 <w:webHidden/>
               </w:rPr>
-              <w:instrText xml:space="preserve"> PAGEREF _Toc243184720 \h </w:instrText>
+              <w:instrText xml:space="preserve"> PAGEREF _Toc243205938 \h </w:instrText>
             </w:r>
             <w:r>
               <w:rPr>
@@ -3582,7 +3582,7 @@
               <w14:ligatures w14:val="standardContextual"/>
             </w:rPr>
           </w:pPr>
-          <w:hyperlink w:anchor="_Toc243184721" w:history="1">
+          <w:hyperlink w:anchor="_Toc243205939" w:history="1">
             <w:r>
               <w:rPr>
                 <w:rStyle w:val="Hipervnculo"/>
@@ -3609,7 +3609,7 @@
                 <w:noProof/>
                 <w:webHidden/>
               </w:rPr>
-              <w:instrText xml:space="preserve"> PAGEREF _Toc243184721 \h </w:instrText>
+              <w:instrText xml:space="preserve"> PAGEREF _Toc243205939 \h </w:instrText>
             </w:r>
             <w:r>
               <w:rPr>
@@ -3656,7 +3656,7 @@
               <w14:ligatures w14:val="standardContextual"/>
             </w:rPr>
           </w:pPr>
-          <w:hyperlink w:anchor="_Toc243184722" w:history="1">
+          <w:hyperlink w:anchor="_Toc243205940" w:history="1">
             <w:r>
               <w:rPr>
                 <w:rStyle w:val="Hipervnculo"/>
@@ -3683,7 +3683,7 @@
                 <w:noProof/>
                 <w:webHidden/>
               </w:rPr>
-              <w:instrText xml:space="preserve"> PAGEREF _Toc243184722 \h </w:instrText>
+              <w:instrText xml:space="preserve"> PAGEREF _Toc243205940 \h </w:instrText>
             </w:r>
             <w:r>
               <w:rPr>
@@ -3730,7 +3730,7 @@
               <w14:ligatures w14:val="standardContextual"/>
             </w:rPr>
           </w:pPr>
-          <w:hyperlink w:anchor="_Toc243184723" w:history="1">
+          <w:hyperlink w:anchor="_Toc243205941" w:history="1">
             <w:r>
               <w:rPr>
                 <w:rStyle w:val="Hipervnculo"/>
@@ -3757,7 +3757,7 @@
                 <w:noProof/>
                 <w:webHidden/>
               </w:rPr>
-              <w:instrText xml:space="preserve"> PAGEREF _Toc243184723 \h </w:instrText>
+              <w:instrText xml:space="preserve"> PAGEREF _Toc243205941 \h </w:instrText>
             </w:r>
             <w:r>
               <w:rPr>
@@ -3804,7 +3804,7 @@
               <w14:ligatures w14:val="standardContextual"/>
             </w:rPr>
           </w:pPr>
-          <w:hyperlink w:anchor="_Toc243184724" w:history="1">
+          <w:hyperlink w:anchor="_Toc243205942" w:history="1">
             <w:r>
               <w:rPr>
                 <w:rStyle w:val="Hipervnculo"/>
@@ -3831,7 +3831,7 @@
                 <w:noProof/>
                 <w:webHidden/>
               </w:rPr>
-              <w:instrText xml:space="preserve"> PAGEREF _Toc243184724 \h </w:instrText>
+              <w:instrText xml:space="preserve"> PAGEREF _Toc243205942 \h </w:instrText>
             </w:r>
             <w:r>
               <w:rPr>
@@ -3878,7 +3878,7 @@
               <w14:ligatures w14:val="standardContextual"/>
             </w:rPr>
           </w:pPr>
-          <w:hyperlink w:anchor="_Toc243184725" w:history="1">
+          <w:hyperlink w:anchor="_Toc243205943" w:history="1">
             <w:r>
               <w:rPr>
                 <w:rStyle w:val="Hipervnculo"/>
@@ -3905,7 +3905,7 @@
                 <w:noProof/>
                 <w:webHidden/>
               </w:rPr>
-              <w:instrText xml:space="preserve"> PAGEREF _Toc243184725 \h </w:instrText>
+              <w:instrText xml:space="preserve"> PAGEREF _Toc243205943 \h </w:instrText>
             </w:r>
             <w:r>
               <w:rPr>
@@ -3952,7 +3952,7 @@
               <w14:ligatures w14:val="standardContextual"/>
             </w:rPr>
           </w:pPr>
-          <w:hyperlink w:anchor="_Toc243184726" w:history="1">
+          <w:hyperlink w:anchor="_Toc243205944" w:history="1">
             <w:r>
               <w:rPr>
                 <w:rStyle w:val="Hipervnculo"/>
@@ -3979,7 +3979,7 @@
                 <w:noProof/>
                 <w:webHidden/>
               </w:rPr>
-              <w:instrText xml:space="preserve"> PAGEREF _Toc243184726 \h </w:instrText>
+              <w:instrText xml:space="preserve"> PAGEREF _Toc243205944 \h </w:instrText>
             </w:r>
             <w:r>
               <w:rPr>
@@ -4026,7 +4026,7 @@
               <w14:ligatures w14:val="standardContextual"/>
             </w:rPr>
           </w:pPr>
-          <w:hyperlink w:anchor="_Toc243184727" w:history="1">
+          <w:hyperlink w:anchor="_Toc243205945" w:history="1">
             <w:r>
               <w:rPr>
                 <w:rStyle w:val="Hipervnculo"/>
@@ -4053,7 +4053,7 @@
                 <w:noProof/>
                 <w:webHidden/>
               </w:rPr>
-              <w:instrText xml:space="preserve"> PAGEREF _Toc243184727 \h </w:instrText>
+              <w:instrText xml:space="preserve"> PAGEREF _Toc243205945 \h </w:instrText>
             </w:r>
             <w:r>
               <w:rPr>
@@ -4100,7 +4100,7 @@
               <w14:ligatures w14:val="standardContextual"/>
             </w:rPr>
           </w:pPr>
-          <w:hyperlink w:anchor="_Toc243184728" w:history="1">
+          <w:hyperlink w:anchor="_Toc243205946" w:history="1">
             <w:r>
               <w:rPr>
                 <w:rStyle w:val="Hipervnculo"/>
@@ -4127,7 +4127,7 @@
                 <w:noProof/>
                 <w:webHidden/>
               </w:rPr>
-              <w:instrText xml:space="preserve"> PAGEREF _Toc243184728 \h </w:instrText>
+              <w:instrText xml:space="preserve"> PAGEREF _Toc243205946 \h </w:instrText>
             </w:r>
             <w:r>
               <w:rPr>
@@ -4174,7 +4174,7 @@
               <w14:ligatures w14:val="standardContextual"/>
             </w:rPr>
           </w:pPr>
-          <w:hyperlink w:anchor="_Toc243184729" w:history="1">
+          <w:hyperlink w:anchor="_Toc243205947" w:history="1">
             <w:r>
               <w:rPr>
                 <w:rStyle w:val="Hipervnculo"/>
@@ -4201,7 +4201,7 @@
                 <w:noProof/>
                 <w:webHidden/>
               </w:rPr>
-              <w:instrText xml:space="preserve"> PAGEREF _Toc243184729 \h </w:instrText>
+              <w:instrText xml:space="preserve"> PAGEREF _Toc243205947 \h </w:instrText>
             </w:r>
             <w:r>
               <w:rPr>
@@ -4248,7 +4248,7 @@
               <w14:ligatures w14:val="standardContextual"/>
             </w:rPr>
           </w:pPr>
-          <w:hyperlink w:anchor="_Toc243184730" w:history="1">
+          <w:hyperlink w:anchor="_Toc243205948" w:history="1">
             <w:r>
               <w:rPr>
                 <w:rStyle w:val="Hipervnculo"/>
@@ -4275,7 +4275,7 @@
                 <w:noProof/>
                 <w:webHidden/>
               </w:rPr>
-              <w:instrText xml:space="preserve"> PAGEREF _Toc243184730 \h </w:instrText>
+              <w:instrText xml:space="preserve"> PAGEREF _Toc243205948 \h </w:instrText>
             </w:r>
             <w:r>
               <w:rPr>
@@ -4322,7 +4322,7 @@
               <w14:ligatures w14:val="standardContextual"/>
             </w:rPr>
           </w:pPr>
-          <w:hyperlink w:anchor="_Toc243184731" w:history="1">
+          <w:hyperlink w:anchor="_Toc243205949" w:history="1">
             <w:r>
               <w:rPr>
                 <w:rStyle w:val="Hipervnculo"/>
@@ -4349,7 +4349,7 @@
                 <w:noProof/>
                 <w:webHidden/>
               </w:rPr>
-              <w:instrText xml:space="preserve"> PAGEREF _Toc243184731 \h </w:instrText>
+              <w:instrText xml:space="preserve"> PAGEREF _Toc243205949 \h </w:instrText>
             </w:r>
             <w:r>
               <w:rPr>
@@ -4396,7 +4396,7 @@
               <w14:ligatures w14:val="standardContextual"/>
             </w:rPr>
           </w:pPr>
-          <w:hyperlink w:anchor="_Toc243184732" w:history="1">
+          <w:hyperlink w:anchor="_Toc243205950" w:history="1">
             <w:r>
               <w:rPr>
                 <w:rStyle w:val="Hipervnculo"/>
@@ -4423,7 +4423,7 @@
                 <w:noProof/>
                 <w:webHidden/>
               </w:rPr>
-              <w:instrText xml:space="preserve"> PAGEREF _Toc243184732 \h </w:instrText>
+              <w:instrText xml:space="preserve"> PAGEREF _Toc243205950 \h </w:instrText>
             </w:r>
             <w:r>
               <w:rPr>
@@ -4470,7 +4470,7 @@
               <w14:ligatures w14:val="standardContextual"/>
             </w:rPr>
           </w:pPr>
-          <w:hyperlink w:anchor="_Toc243184733" w:history="1">
+          <w:hyperlink w:anchor="_Toc243205951" w:history="1">
             <w:r>
               <w:rPr>
                 <w:rStyle w:val="Hipervnculo"/>
@@ -4497,7 +4497,7 @@
                 <w:noProof/>
                 <w:webHidden/>
               </w:rPr>
-              <w:instrText xml:space="preserve"> PAGEREF _Toc243184733 \h </w:instrText>
+              <w:instrText xml:space="preserve"> PAGEREF _Toc243205951 \h </w:instrText>
             </w:r>
             <w:r>
               <w:rPr>
@@ -4544,7 +4544,7 @@
               <w14:ligatures w14:val="standardContextual"/>
             </w:rPr>
           </w:pPr>
-          <w:hyperlink w:anchor="_Toc243184734" w:history="1">
+          <w:hyperlink w:anchor="_Toc243205952" w:history="1">
             <w:r>
               <w:rPr>
                 <w:rStyle w:val="Hipervnculo"/>
@@ -4571,7 +4571,7 @@
                 <w:noProof/>
                 <w:webHidden/>
               </w:rPr>
-              <w:instrText xml:space="preserve"> PAGEREF _Toc243184734 \h </w:instrText>
+              <w:instrText xml:space="preserve"> PAGEREF _Toc243205952 \h </w:instrText>
             </w:r>
             <w:r>
               <w:rPr>
@@ -4618,7 +4618,7 @@
               <w14:ligatures w14:val="standardContextual"/>
             </w:rPr>
           </w:pPr>
-          <w:hyperlink w:anchor="_Toc243184735" w:history="1">
+          <w:hyperlink w:anchor="_Toc243205953" w:history="1">
             <w:r>
               <w:rPr>
                 <w:rStyle w:val="Hipervnculo"/>
@@ -4645,7 +4645,7 @@
                 <w:noProof/>
                 <w:webHidden/>
               </w:rPr>
-              <w:instrText xml:space="preserve"> PAGEREF _Toc243184735 \h </w:instrText>
+              <w:instrText xml:space="preserve"> PAGEREF _Toc243205953 \h </w:instrText>
             </w:r>
             <w:r>
               <w:rPr>
@@ -4693,7 +4693,7 @@
         <w:pStyle w:val="Ttulo1"/>
       </w:pPr>
       <w:bookmarkStart w:id="0" w:name="sobre-este-documento"/>
-      <w:bookmarkStart w:id="1" w:name="_Toc243184674"/>
+      <w:bookmarkStart w:id="1" w:name="_Toc243205892"/>
       <w:r>
         <w:t>Sobre este documento</w:t>
       </w:r>
@@ -4888,7 +4888,7 @@
           <w:rPr>
             <w:rStyle w:val="Hipervnculo"/>
           </w:rPr>
-          <w:t>README</w:t>
+          <w:t>índice de la documentación</w:t>
         </w:r>
       </w:hyperlink>
       <w:r>
@@ -4944,7 +4944,7 @@
         <w:pStyle w:val="Ttulo1"/>
       </w:pPr>
       <w:bookmarkStart w:id="2" w:name="introducción-y-alcance"/>
-      <w:bookmarkStart w:id="3" w:name="_Toc243184675"/>
+      <w:bookmarkStart w:id="3" w:name="_Toc243205893"/>
       <w:bookmarkEnd w:id="0"/>
       <w:r>
         <w:t>1. Introducción y alcance</w:t>
@@ -4956,7 +4956,7 @@
         <w:pStyle w:val="Ttulo2"/>
       </w:pPr>
       <w:bookmarkStart w:id="4" w:name="pregunta-central"/>
-      <w:bookmarkStart w:id="5" w:name="_Toc243184676"/>
+      <w:bookmarkStart w:id="5" w:name="_Toc243205894"/>
       <w:r>
         <w:t>1.1. Pregunta central</w:t>
       </w:r>
@@ -5066,7 +5066,7 @@
         <w:pStyle w:val="Ttulo2"/>
       </w:pPr>
       <w:bookmarkStart w:id="6" w:name="metas-del-sistema"/>
-      <w:bookmarkStart w:id="7" w:name="_Toc243184677"/>
+      <w:bookmarkStart w:id="7" w:name="_Toc243205895"/>
       <w:bookmarkEnd w:id="4"/>
       <w:r>
         <w:t>1.2. Metas del sistema</w:t>
@@ -5173,7 +5173,7 @@
         <w:pStyle w:val="Ttulo2"/>
       </w:pPr>
       <w:bookmarkStart w:id="8" w:name="alcance"/>
-      <w:bookmarkStart w:id="9" w:name="_Toc243184678"/>
+      <w:bookmarkStart w:id="9" w:name="_Toc243205896"/>
       <w:bookmarkEnd w:id="6"/>
       <w:r>
         <w:t>1.3. Alcance</w:t>
@@ -5242,7 +5242,7 @@
         <w:pStyle w:val="Ttulo2"/>
       </w:pPr>
       <w:bookmarkStart w:id="10" w:name="matriz-de-cumplimiento-del-enunciado"/>
-      <w:bookmarkStart w:id="11" w:name="_Toc243184679"/>
+      <w:bookmarkStart w:id="11" w:name="_Toc243205897"/>
       <w:bookmarkEnd w:id="8"/>
       <w:r>
         <w:t>1.4. Matriz de cumplimiento del enunciado</w:t>
@@ -6306,7 +6306,7 @@
         <w:pStyle w:val="Ttulo1"/>
       </w:pPr>
       <w:bookmarkStart w:id="12" w:name="visión-general-y-arquitectura"/>
-      <w:bookmarkStart w:id="13" w:name="_Toc243184680"/>
+      <w:bookmarkStart w:id="13" w:name="_Toc243205898"/>
       <w:bookmarkEnd w:id="2"/>
       <w:bookmarkEnd w:id="10"/>
       <w:r>
@@ -6319,7 +6319,7 @@
         <w:pStyle w:val="Ttulo2"/>
       </w:pPr>
       <w:bookmarkStart w:id="14" w:name="capas"/>
-      <w:bookmarkStart w:id="15" w:name="_Toc243184681"/>
+      <w:bookmarkStart w:id="15" w:name="_Toc243205899"/>
       <w:r>
         <w:t>2.1. Capas</w:t>
       </w:r>
@@ -6989,7 +6989,7 @@
         <w:pStyle w:val="Ttulo2"/>
       </w:pPr>
       <w:bookmarkStart w:id="16" w:name="flujo-de-datos"/>
-      <w:bookmarkStart w:id="17" w:name="_Toc243184682"/>
+      <w:bookmarkStart w:id="17" w:name="_Toc243205900"/>
       <w:bookmarkEnd w:id="14"/>
       <w:r>
         <w:t>2.2. Flujo de datos</w:t>
@@ -7147,7 +7147,7 @@
         <w:pStyle w:val="Ttulo2"/>
       </w:pPr>
       <w:bookmarkStart w:id="18" w:name="recorrido-del-usuario"/>
-      <w:bookmarkStart w:id="19" w:name="_Toc243184683"/>
+      <w:bookmarkStart w:id="19" w:name="_Toc243205901"/>
       <w:bookmarkEnd w:id="16"/>
       <w:r>
         <w:t>2.3. Recorrido del usuario</w:t>
@@ -7342,7 +7342,7 @@
         <w:pStyle w:val="Ttulo2"/>
       </w:pPr>
       <w:bookmarkStart w:id="20" w:name="stack-técnico"/>
-      <w:bookmarkStart w:id="21" w:name="_Toc243184684"/>
+      <w:bookmarkStart w:id="21" w:name="_Toc243205902"/>
       <w:bookmarkEnd w:id="18"/>
       <w:r>
         <w:t>2.4. Stack técnico</w:t>
@@ -7498,7 +7498,7 @@
         <w:pStyle w:val="Ttulo1"/>
       </w:pPr>
       <w:bookmarkStart w:id="22" w:name="modelado-del-problema"/>
-      <w:bookmarkStart w:id="23" w:name="_Toc243184685"/>
+      <w:bookmarkStart w:id="23" w:name="_Toc243205903"/>
       <w:bookmarkEnd w:id="12"/>
       <w:bookmarkEnd w:id="20"/>
       <w:r>
@@ -7519,7 +7519,7 @@
         <w:pStyle w:val="Ttulo2"/>
       </w:pPr>
       <w:bookmarkStart w:id="24" w:name="navegación"/>
-      <w:bookmarkStart w:id="25" w:name="_Toc243184686"/>
+      <w:bookmarkStart w:id="25" w:name="_Toc243205904"/>
       <w:r>
         <w:t>3.1. Navegación</w:t>
       </w:r>
@@ -7738,7 +7738,7 @@
         <w:pStyle w:val="Ttulo2"/>
       </w:pPr>
       <w:bookmarkStart w:id="26" w:name="partida-adversarial"/>
-      <w:bookmarkStart w:id="27" w:name="_Toc243184687"/>
+      <w:bookmarkStart w:id="27" w:name="_Toc243205905"/>
       <w:bookmarkEnd w:id="24"/>
       <w:r>
         <w:t>3.2. Partida adversarial</w:t>
@@ -7919,7 +7919,7 @@
         <w:pStyle w:val="Ttulo1"/>
       </w:pPr>
       <w:bookmarkStart w:id="28" w:name="representación-de-estados"/>
-      <w:bookmarkStart w:id="29" w:name="_Toc243184688"/>
+      <w:bookmarkStart w:id="29" w:name="_Toc243205906"/>
       <w:bookmarkEnd w:id="22"/>
       <w:bookmarkEnd w:id="26"/>
       <w:r>
@@ -7932,7 +7932,7 @@
         <w:pStyle w:val="Ttulo2"/>
       </w:pPr>
       <w:bookmarkStart w:id="30" w:name="lo-estático-y-lo-dinámico"/>
-      <w:bookmarkStart w:id="31" w:name="_Toc243184689"/>
+      <w:bookmarkStart w:id="31" w:name="_Toc243205907"/>
       <w:r>
         <w:t>4.1. Lo estático y lo dinámico</w:t>
       </w:r>
@@ -8247,7 +8247,7 @@
         <w:pStyle w:val="Ttulo2"/>
       </w:pPr>
       <w:bookmarkStart w:id="32" w:name="por-qué-la-representación-es-suficiente"/>
-      <w:bookmarkStart w:id="33" w:name="_Toc243184690"/>
+      <w:bookmarkStart w:id="33" w:name="_Toc243205908"/>
       <w:bookmarkEnd w:id="30"/>
       <w:r>
         <w:t>4.2. Por qué la representación es suficiente</w:t>
@@ -8388,7 +8388,7 @@
         <w:pStyle w:val="Ttulo2"/>
       </w:pPr>
       <w:bookmarkStart w:id="34" w:name="estado-compuesto-caso-mínimo-6"/>
-      <w:bookmarkStart w:id="35" w:name="_Toc243184691"/>
+      <w:bookmarkStart w:id="35" w:name="_Toc243205909"/>
       <w:bookmarkEnd w:id="32"/>
       <w:r>
         <w:t>4.3. Estado compuesto (caso mínimo 6)</w:t>
@@ -8523,7 +8523,7 @@
         <w:pStyle w:val="Ttulo1"/>
       </w:pPr>
       <w:bookmarkStart w:id="36" w:name="reglas-del-juego"/>
-      <w:bookmarkStart w:id="37" w:name="_Toc243184692"/>
+      <w:bookmarkStart w:id="37" w:name="_Toc243205910"/>
       <w:bookmarkEnd w:id="28"/>
       <w:bookmarkEnd w:id="34"/>
       <w:r>
@@ -8536,7 +8536,7 @@
         <w:pStyle w:val="Ttulo2"/>
       </w:pPr>
       <w:bookmarkStart w:id="38" w:name="mecánicas"/>
-      <w:bookmarkStart w:id="39" w:name="_Toc243184693"/>
+      <w:bookmarkStart w:id="39" w:name="_Toc243205911"/>
       <w:r>
         <w:t>5.1. Mecánicas</w:t>
       </w:r>
@@ -8736,7 +8736,7 @@
         <w:pStyle w:val="Ttulo2"/>
       </w:pPr>
       <w:bookmarkStart w:id="40" w:name="reglas-deterministas-de-borde"/>
-      <w:bookmarkStart w:id="41" w:name="_Toc243184694"/>
+      <w:bookmarkStart w:id="41" w:name="_Toc243205912"/>
       <w:bookmarkEnd w:id="38"/>
       <w:r>
         <w:t>5.2. Reglas deterministas de borde</w:t>
@@ -8932,7 +8932,7 @@
         <w:pStyle w:val="Ttulo2"/>
       </w:pPr>
       <w:bookmarkStart w:id="42" w:name="tácticas"/>
-      <w:bookmarkStart w:id="43" w:name="_Toc243184695"/>
+      <w:bookmarkStart w:id="43" w:name="_Toc243205913"/>
       <w:bookmarkEnd w:id="40"/>
       <w:r>
         <w:t>5.3. Tácticas</w:t>
@@ -9060,7 +9060,7 @@
         <w:pStyle w:val="Ttulo1"/>
       </w:pPr>
       <w:bookmarkStart w:id="44" w:name="costos"/>
-      <w:bookmarkStart w:id="45" w:name="_Toc243184696"/>
+      <w:bookmarkStart w:id="45" w:name="_Toc243205914"/>
       <w:bookmarkEnd w:id="36"/>
       <w:bookmarkEnd w:id="42"/>
       <w:r>
@@ -9223,7 +9223,7 @@
         <w:pStyle w:val="Ttulo1"/>
       </w:pPr>
       <w:bookmarkStart w:id="46" w:name="algoritmos-de-búsqueda"/>
-      <w:bookmarkStart w:id="47" w:name="_Toc243184697"/>
+      <w:bookmarkStart w:id="47" w:name="_Toc243205915"/>
       <w:bookmarkEnd w:id="44"/>
       <w:r>
         <w:t>7. Algoritmos de búsqueda</w:t>
@@ -10064,7 +10064,7 @@
         <w:pStyle w:val="Ttulo1"/>
       </w:pPr>
       <w:bookmarkStart w:id="48" w:name="heurísticas"/>
-      <w:bookmarkStart w:id="49" w:name="_Toc243184698"/>
+      <w:bookmarkStart w:id="49" w:name="_Toc243205916"/>
       <w:bookmarkEnd w:id="46"/>
       <w:r>
         <w:t>8. Heurísticas</w:t>
@@ -10076,7 +10076,7 @@
         <w:pStyle w:val="Ttulo2"/>
       </w:pPr>
       <w:bookmarkStart w:id="50" w:name="manhattan-escalada-e6.1"/>
-      <w:bookmarkStart w:id="51" w:name="_Toc243184699"/>
+      <w:bookmarkStart w:id="51" w:name="_Toc243205917"/>
       <w:r>
         <w:t>8.1. Manhattan escalada (E6.1)</w:t>
       </w:r>
@@ -10098,7 +10098,7 @@
         <w:pStyle w:val="Ttulo2"/>
       </w:pPr>
       <w:bookmarkStart w:id="52" w:name="distancia-con-obstáculos-hto-e6.2-propia"/>
-      <w:bookmarkStart w:id="53" w:name="_Toc243184700"/>
+      <w:bookmarkStart w:id="53" w:name="_Toc243205918"/>
       <w:bookmarkEnd w:id="50"/>
       <w:r>
         <w:t>8.2. Distancia con obstáculos, HTO (E6.2, propia)</w:t>
@@ -10163,7 +10163,7 @@
         <w:pStyle w:val="Ttulo2"/>
       </w:pPr>
       <w:bookmarkStart w:id="54" w:name="las-cinco-preguntas-del-enunciado"/>
-      <w:bookmarkStart w:id="55" w:name="_Toc243184701"/>
+      <w:bookmarkStart w:id="55" w:name="_Toc243205919"/>
       <w:bookmarkEnd w:id="52"/>
       <w:r>
         <w:t>8.3. Las cinco preguntas del enunciado</w:t>
@@ -10670,7 +10670,7 @@
         <w:pStyle w:val="Ttulo1"/>
       </w:pPr>
       <w:bookmarkStart w:id="56" w:name="Xc460eedbd2461790e1bf2cbac354ded6450a312"/>
-      <w:bookmarkStart w:id="57" w:name="_Toc243184702"/>
+      <w:bookmarkStart w:id="57" w:name="_Toc243205920"/>
       <w:bookmarkEnd w:id="48"/>
       <w:bookmarkEnd w:id="54"/>
       <w:r>
@@ -10683,7 +10683,7 @@
         <w:pStyle w:val="Ttulo2"/>
       </w:pPr>
       <w:bookmarkStart w:id="58" w:name="max-min-y-suma-cero"/>
-      <w:bookmarkStart w:id="59" w:name="_Toc243184703"/>
+      <w:bookmarkStart w:id="59" w:name="_Toc243205921"/>
       <w:r>
         <w:t>9.1. MAX, MIN y suma cero</w:t>
       </w:r>
@@ -10733,7 +10733,7 @@
         <w:pStyle w:val="Ttulo2"/>
       </w:pPr>
       <w:bookmarkStart w:id="60" w:name="criterios-y-pesos"/>
-      <w:bookmarkStart w:id="61" w:name="_Toc243184704"/>
+      <w:bookmarkStart w:id="61" w:name="_Toc243205922"/>
       <w:bookmarkEnd w:id="58"/>
       <w:r>
         <w:t>9.2. Criterios y pesos</w:t>
@@ -11455,7 +11455,7 @@
         <w:pStyle w:val="Ttulo2"/>
       </w:pPr>
       <w:bookmarkStart w:id="62" w:name="minimax-con-profundidad-limitada"/>
-      <w:bookmarkStart w:id="63" w:name="_Toc243184705"/>
+      <w:bookmarkStart w:id="63" w:name="_Toc243205923"/>
       <w:bookmarkEnd w:id="60"/>
       <w:r>
         <w:t>9.3. Minimax con profundidad limitada</w:t>
@@ -11518,7 +11518,7 @@
         <w:pStyle w:val="Ttulo2"/>
       </w:pPr>
       <w:bookmarkStart w:id="64" w:name="poda-alfa-beta"/>
-      <w:bookmarkStart w:id="65" w:name="_Toc243184706"/>
+      <w:bookmarkStart w:id="65" w:name="_Toc243205924"/>
       <w:bookmarkEnd w:id="62"/>
       <w:r>
         <w:t>9.4. Poda alfa-beta</w:t>
@@ -11564,7 +11564,7 @@
         <w:pStyle w:val="Ttulo2"/>
       </w:pPr>
       <w:bookmarkStart w:id="66" w:name="orden-de-las-acciones"/>
-      <w:bookmarkStart w:id="67" w:name="_Toc243184707"/>
+      <w:bookmarkStart w:id="67" w:name="_Toc243205925"/>
       <w:bookmarkEnd w:id="64"/>
       <w:r>
         <w:t>9.5. Orden de las acciones</w:t>
@@ -11708,7 +11708,7 @@
         <w:pStyle w:val="Ttulo1"/>
       </w:pPr>
       <w:bookmarkStart w:id="68" w:name="escenarios-validación-y-verificación"/>
-      <w:bookmarkStart w:id="69" w:name="_Toc243184708"/>
+      <w:bookmarkStart w:id="69" w:name="_Toc243205926"/>
       <w:bookmarkEnd w:id="56"/>
       <w:bookmarkEnd w:id="66"/>
       <w:r>
@@ -11721,7 +11721,7 @@
         <w:pStyle w:val="Ttulo2"/>
       </w:pPr>
       <w:bookmarkStart w:id="70" w:name="formato-json-común"/>
-      <w:bookmarkStart w:id="71" w:name="_Toc243184709"/>
+      <w:bookmarkStart w:id="71" w:name="_Toc243205927"/>
       <w:r>
         <w:t>10.1. Formato JSON común</w:t>
       </w:r>
@@ -12073,7 +12073,7 @@
         <w:pStyle w:val="Ttulo2"/>
       </w:pPr>
       <w:bookmarkStart w:id="72" w:name="validación-atómica"/>
-      <w:bookmarkStart w:id="73" w:name="_Toc243184710"/>
+      <w:bookmarkStart w:id="73" w:name="_Toc243205928"/>
       <w:bookmarkEnd w:id="70"/>
       <w:r>
         <w:t>10.2. Validación atómica</w:t>
@@ -12243,7 +12243,7 @@
         <w:pStyle w:val="Ttulo2"/>
       </w:pPr>
       <w:bookmarkStart w:id="74" w:name="modos-de-prueba"/>
-      <w:bookmarkStart w:id="75" w:name="_Toc243184711"/>
+      <w:bookmarkStart w:id="75" w:name="_Toc243205929"/>
       <w:bookmarkEnd w:id="72"/>
       <w:r>
         <w:t>10.3. Modos de prueba</w:t>
@@ -12558,7 +12558,7 @@
         <w:pStyle w:val="Ttulo2"/>
       </w:pPr>
       <w:bookmarkStart w:id="76" w:name="verificador-de-soluciones"/>
-      <w:bookmarkStart w:id="77" w:name="_Toc243184712"/>
+      <w:bookmarkStart w:id="77" w:name="_Toc243205930"/>
       <w:bookmarkEnd w:id="74"/>
       <w:r>
         <w:t>10.4. Verificador de soluciones</w:t>
@@ -12738,7 +12738,7 @@
         <w:pStyle w:val="Ttulo1"/>
       </w:pPr>
       <w:bookmarkStart w:id="78" w:name="metodología-experimental"/>
-      <w:bookmarkStart w:id="79" w:name="_Toc243184713"/>
+      <w:bookmarkStart w:id="79" w:name="_Toc243205931"/>
       <w:bookmarkEnd w:id="68"/>
       <w:bookmarkEnd w:id="76"/>
       <w:r>
@@ -12968,7 +12968,7 @@
         <w:pStyle w:val="Ttulo1"/>
       </w:pPr>
       <w:bookmarkStart w:id="80" w:name="resultados"/>
-      <w:bookmarkStart w:id="81" w:name="_Toc243184714"/>
+      <w:bookmarkStart w:id="81" w:name="_Toc243205932"/>
       <w:bookmarkEnd w:id="78"/>
       <w:r>
         <w:t>12. Resultados</w:t>
@@ -12980,7 +12980,7 @@
         <w:pStyle w:val="Ttulo2"/>
       </w:pPr>
       <w:bookmarkStart w:id="82" w:name="casos-mínimos"/>
-      <w:bookmarkStart w:id="83" w:name="_Toc243184715"/>
+      <w:bookmarkStart w:id="83" w:name="_Toc243205933"/>
       <w:r>
         <w:t>12.1. Casos mínimos</w:t>
       </w:r>
@@ -13193,7 +13193,7 @@
                 <w:rPr>
                   <w:rStyle w:val="Hipervnculo"/>
                 </w:rPr>
-                <w:t>README</w:t>
+                <w:t>Casos 1, 2 y 5</w:t>
               </w:r>
             </w:hyperlink>
           </w:p>
@@ -13280,7 +13280,7 @@
                 <w:rPr>
                   <w:rStyle w:val="Hipervnculo"/>
                 </w:rPr>
-                <w:t>README</w:t>
+                <w:t>Casos 1, 2 y 5</w:t>
               </w:r>
             </w:hyperlink>
           </w:p>
@@ -14008,7 +14008,7 @@
         <w:pStyle w:val="Ttulo2"/>
       </w:pPr>
       <w:bookmarkStart w:id="84" w:name="búsquedas-por-escenario"/>
-      <w:bookmarkStart w:id="85" w:name="_Toc243184716"/>
+      <w:bookmarkStart w:id="85" w:name="_Toc243205934"/>
       <w:bookmarkEnd w:id="82"/>
       <w:r>
         <w:t>12.2. Búsquedas por escenario</w:t>
@@ -14768,7 +14768,7 @@
         <w:pStyle w:val="Ttulo2"/>
       </w:pPr>
       <w:bookmarkStart w:id="86" w:name="beam-search-efecto-de-k"/>
-      <w:bookmarkStart w:id="87" w:name="_Toc243184717"/>
+      <w:bookmarkStart w:id="87" w:name="_Toc243205935"/>
       <w:bookmarkEnd w:id="84"/>
       <w:r>
         <w:t>12.3. Beam Search: efecto de k</w:t>
@@ -15519,18 +15519,18 @@
         <w:pStyle w:val="FirstParagraph"/>
       </w:pPr>
       <w:r>
-        <w:t xml:space="preserve">El análisis nivel por nivel está en el </w:t>
+        <w:t xml:space="preserve">El análisis nivel por nivel está en el caso 5 de </w:t>
       </w:r>
       <w:hyperlink r:id="rId19">
         <w:r>
           <w:rPr>
             <w:rStyle w:val="Hipervnculo"/>
           </w:rPr>
-          <w:t>README</w:t>
+          <w:t>casos mínimos 1, 2 y 5</w:t>
         </w:r>
       </w:hyperlink>
       <w:r>
-        <w:t>, en la sección E7.2.</w:t>
+        <w:t>.</w:t>
       </w:r>
     </w:p>
     <w:p>
@@ -15538,7 +15538,7 @@
         <w:pStyle w:val="Ttulo2"/>
       </w:pPr>
       <w:bookmarkStart w:id="88" w:name="minimax-y-alfa-beta"/>
-      <w:bookmarkStart w:id="89" w:name="_Toc243184718"/>
+      <w:bookmarkStart w:id="89" w:name="_Toc243205936"/>
       <w:bookmarkEnd w:id="86"/>
       <w:r>
         <w:t>12.4. Minimax y alfa-beta</w:t>
@@ -16637,7 +16637,7 @@
         <w:pStyle w:val="Ttulo2"/>
       </w:pPr>
       <w:bookmarkStart w:id="90" w:name="partidas-completas"/>
-      <w:bookmarkStart w:id="91" w:name="_Toc243184719"/>
+      <w:bookmarkStart w:id="91" w:name="_Toc243205937"/>
       <w:bookmarkEnd w:id="88"/>
       <w:r>
         <w:t>12.5. Partidas completas</w:t>
@@ -16774,7 +16774,7 @@
         <w:pStyle w:val="Ttulo2"/>
       </w:pPr>
       <w:bookmarkStart w:id="92" w:name="X4839b1143085a05863a2c719a5bbcbfc4cc6515"/>
-      <w:bookmarkStart w:id="93" w:name="_Toc243184720"/>
+      <w:bookmarkStart w:id="93" w:name="_Toc243205938"/>
       <w:bookmarkEnd w:id="90"/>
       <w:r>
         <w:t>12.6. Prueba de adaptación: pantano de costo 7 a 15</w:t>
@@ -17252,7 +17252,7 @@
         <w:pStyle w:val="Ttulo1"/>
       </w:pPr>
       <w:bookmarkStart w:id="94" w:name="análisis-de-complejidad"/>
-      <w:bookmarkStart w:id="95" w:name="_Toc243184721"/>
+      <w:bookmarkStart w:id="95" w:name="_Toc243205939"/>
       <w:bookmarkEnd w:id="80"/>
       <w:bookmarkEnd w:id="92"/>
       <w:r>
@@ -18454,7 +18454,7 @@
         <w:pStyle w:val="Ttulo1"/>
       </w:pPr>
       <w:bookmarkStart w:id="96" w:name="pruebas-y-control-de-calidad"/>
-      <w:bookmarkStart w:id="97" w:name="_Toc243184722"/>
+      <w:bookmarkStart w:id="97" w:name="_Toc243205940"/>
       <w:bookmarkEnd w:id="94"/>
       <w:r>
         <w:t>14. Pruebas y control de calidad</w:t>
@@ -18466,7 +18466,7 @@
         <w:pStyle w:val="Ttulo2"/>
       </w:pPr>
       <w:bookmarkStart w:id="98" w:name="pruebas-automatizadas"/>
-      <w:bookmarkStart w:id="99" w:name="_Toc243184723"/>
+      <w:bookmarkStart w:id="99" w:name="_Toc243205941"/>
       <w:r>
         <w:t>14.1. Pruebas automatizadas</w:t>
       </w:r>
@@ -18483,7 +18483,7 @@
         <w:t>python -m pytest</w:t>
       </w:r>
       <w:r>
-        <w:t xml:space="preserve"> ejecuta 909 pruebas. Son independientes de Pygame, salvo las de la interfaz, que usan el controlador de video </w:t>
+        <w:t xml:space="preserve"> ejecuta 910 pruebas. Son independientes de Pygame, salvo las de la interfaz, que usan el controlador de video </w:t>
       </w:r>
       <w:r>
         <w:rPr>
@@ -18634,7 +18634,7 @@
               <w:rPr>
                 <w:sz w:val="17"/>
               </w:rPr>
-              <w:t>453</w:t>
+              <w:t>454</w:t>
             </w:r>
           </w:p>
         </w:tc>
@@ -19078,7 +19078,7 @@
         <w:pStyle w:val="Ttulo2"/>
       </w:pPr>
       <w:bookmarkStart w:id="100" w:name="verificación-en-tiempo-de-ejecución"/>
-      <w:bookmarkStart w:id="101" w:name="_Toc243184724"/>
+      <w:bookmarkStart w:id="101" w:name="_Toc243205942"/>
       <w:bookmarkEnd w:id="98"/>
       <w:r>
         <w:t>14.2. Verificación en tiempo de ejecución</w:t>
@@ -19104,7 +19104,7 @@
         <w:pStyle w:val="Ttulo2"/>
       </w:pPr>
       <w:bookmarkStart w:id="102" w:name="documentación-de-métodos"/>
-      <w:bookmarkStart w:id="103" w:name="_Toc243184725"/>
+      <w:bookmarkStart w:id="103" w:name="_Toc243205943"/>
       <w:bookmarkEnd w:id="100"/>
       <w:r>
         <w:t>14.3. Documentación de métodos</w:t>
@@ -19162,7 +19162,7 @@
         <w:pStyle w:val="Ttulo1"/>
       </w:pPr>
       <w:bookmarkStart w:id="104" w:name="limitaciones"/>
-      <w:bookmarkStart w:id="105" w:name="_Toc243184726"/>
+      <w:bookmarkStart w:id="105" w:name="_Toc243205944"/>
       <w:bookmarkEnd w:id="96"/>
       <w:bookmarkEnd w:id="102"/>
       <w:r>
@@ -20001,7 +20001,7 @@
         <w:pStyle w:val="Ttulo1"/>
       </w:pPr>
       <w:bookmarkStart w:id="106" w:name="reproducibilidad"/>
-      <w:bookmarkStart w:id="107" w:name="_Toc243184727"/>
+      <w:bookmarkStart w:id="107" w:name="_Toc243205945"/>
       <w:bookmarkEnd w:id="104"/>
       <w:r>
         <w:t>16. Reproducibilidad</w:t>
@@ -20262,7 +20262,7 @@
         <w:pStyle w:val="Ttulo1"/>
       </w:pPr>
       <w:bookmarkStart w:id="108" w:name="reporte-del-uso-de-ia"/>
-      <w:bookmarkStart w:id="109" w:name="_Toc243184728"/>
+      <w:bookmarkStart w:id="109" w:name="_Toc243205946"/>
       <w:bookmarkEnd w:id="106"/>
       <w:r>
         <w:t>17. Reporte del uso de IA</w:t>
@@ -20274,7 +20274,7 @@
         <w:pStyle w:val="Ttulo2"/>
       </w:pPr>
       <w:bookmarkStart w:id="110" w:name="declaración"/>
-      <w:bookmarkStart w:id="111" w:name="_Toc243184729"/>
+      <w:bookmarkStart w:id="111" w:name="_Toc243205947"/>
       <w:r>
         <w:t>17.1. Declaración</w:t>
       </w:r>
@@ -20366,7 +20366,7 @@
         <w:pStyle w:val="Ttulo2"/>
       </w:pPr>
       <w:bookmarkStart w:id="112" w:name="tipo-de-intervención"/>
-      <w:bookmarkStart w:id="113" w:name="_Toc243184730"/>
+      <w:bookmarkStart w:id="113" w:name="_Toc243205948"/>
       <w:bookmarkEnd w:id="110"/>
       <w:r>
         <w:t>17.2. Tipo de intervención</w:t>
@@ -20473,7 +20473,7 @@
         <w:pStyle w:val="Ttulo2"/>
       </w:pPr>
       <w:bookmarkStart w:id="114" w:name="cómo-se-validó-el-aporte"/>
-      <w:bookmarkStart w:id="115" w:name="_Toc243184731"/>
+      <w:bookmarkStart w:id="115" w:name="_Toc243205949"/>
       <w:bookmarkEnd w:id="112"/>
       <w:r>
         <w:t>17.3. Cómo se validó el aporte</w:t>
@@ -20524,7 +20524,7 @@
         <w:t>Pruebas automatizadas.</w:t>
       </w:r>
       <w:r>
-        <w:t xml:space="preserve"> Ningún aporte se aceptó sin pruebas. En esta versión pasan 909.</w:t>
+        <w:t xml:space="preserve"> Ningún aporte se aceptó sin pruebas. En esta versión pasan 910.</w:t>
       </w:r>
     </w:p>
     <w:p>
@@ -20589,7 +20589,7 @@
         <w:pStyle w:val="Ttulo2"/>
       </w:pPr>
       <w:bookmarkStart w:id="116" w:name="responsabilidad"/>
-      <w:bookmarkStart w:id="117" w:name="_Toc243184732"/>
+      <w:bookmarkStart w:id="117" w:name="_Toc243205950"/>
       <w:bookmarkEnd w:id="114"/>
       <w:r>
         <w:t>17.4. Responsabilidad</w:t>
@@ -20617,7 +20617,7 @@
         <w:pStyle w:val="Ttulo2"/>
       </w:pPr>
       <w:bookmarkStart w:id="118" w:name="uso-de-ia-en-este-documento"/>
-      <w:bookmarkStart w:id="119" w:name="_Toc243184733"/>
+      <w:bookmarkStart w:id="119" w:name="_Toc243205951"/>
       <w:bookmarkEnd w:id="116"/>
       <w:r>
         <w:t>17.5. Uso de IA en este documento</w:t>
@@ -20706,7 +20706,7 @@
         <w:pStyle w:val="Ttulo1"/>
       </w:pPr>
       <w:bookmarkStart w:id="120" w:name="anexo-a.-glosario"/>
-      <w:bookmarkStart w:id="121" w:name="_Toc243184734"/>
+      <w:bookmarkStart w:id="121" w:name="_Toc243205952"/>
       <w:bookmarkEnd w:id="108"/>
       <w:bookmarkEnd w:id="118"/>
       <w:r>
@@ -20861,7 +20861,7 @@
         <w:pStyle w:val="Ttulo1"/>
       </w:pPr>
       <w:bookmarkStart w:id="122" w:name="anexo-b.-escenarios-del-repositorio"/>
-      <w:bookmarkStart w:id="123" w:name="_Toc243184735"/>
+      <w:bookmarkStart w:id="123" w:name="_Toc243205953"/>
       <w:bookmarkEnd w:id="120"/>
       <w:r>
         <w:t>Anexo B. Escenarios del repositorio</w:t>

</xml_diff>

<commit_message>
fix: completa tres unidades por bando en arquitectura_basica y repara los enlaces de la documentacion
La prueba de tres unidades por bando cubre ahora todos los escenarios propios, como exige el enunciado; arquitectura_basica.json agrega A2, A3, B2 y B3 y su descripcion. Los enlaces de la seccion Documentacion del README pasan a ser relativos a la raiz, AGENTS.md y el documento tecnico apuntan a esa seccion, y el documento tecnico reporta las 914 pruebas.
</commit_message>
<xml_diff>
--- a/docs/entregables/documento-tecnico.docx
+++ b/docs/entregables/documento-tecnico.docx
@@ -104,7 +104,7 @@
           <w:r>
             <w:fldChar w:fldCharType="separate"/>
           </w:r>
-          <w:hyperlink w:anchor="_Toc243205892" w:history="1">
+          <w:hyperlink w:anchor="_Toc243396744" w:history="1">
             <w:r>
               <w:rPr>
                 <w:rStyle w:val="Hipervnculo"/>
@@ -131,7 +131,7 @@
                 <w:noProof/>
                 <w:webHidden/>
               </w:rPr>
-              <w:instrText xml:space="preserve"> PAGEREF _Toc243205892 \h </w:instrText>
+              <w:instrText xml:space="preserve"> PAGEREF _Toc243396744 \h </w:instrText>
             </w:r>
             <w:r>
               <w:rPr>
@@ -178,7 +178,7 @@
               <w14:ligatures w14:val="standardContextual"/>
             </w:rPr>
           </w:pPr>
-          <w:hyperlink w:anchor="_Toc243205893" w:history="1">
+          <w:hyperlink w:anchor="_Toc243396745" w:history="1">
             <w:r>
               <w:rPr>
                 <w:rStyle w:val="Hipervnculo"/>
@@ -205,7 +205,7 @@
                 <w:noProof/>
                 <w:webHidden/>
               </w:rPr>
-              <w:instrText xml:space="preserve"> PAGEREF _Toc243205893 \h </w:instrText>
+              <w:instrText xml:space="preserve"> PAGEREF _Toc243396745 \h </w:instrText>
             </w:r>
             <w:r>
               <w:rPr>
@@ -252,7 +252,7 @@
               <w14:ligatures w14:val="standardContextual"/>
             </w:rPr>
           </w:pPr>
-          <w:hyperlink w:anchor="_Toc243205894" w:history="1">
+          <w:hyperlink w:anchor="_Toc243396746" w:history="1">
             <w:r>
               <w:rPr>
                 <w:rStyle w:val="Hipervnculo"/>
@@ -279,7 +279,7 @@
                 <w:noProof/>
                 <w:webHidden/>
               </w:rPr>
-              <w:instrText xml:space="preserve"> PAGEREF _Toc243205894 \h </w:instrText>
+              <w:instrText xml:space="preserve"> PAGEREF _Toc243396746 \h </w:instrText>
             </w:r>
             <w:r>
               <w:rPr>
@@ -326,7 +326,7 @@
               <w14:ligatures w14:val="standardContextual"/>
             </w:rPr>
           </w:pPr>
-          <w:hyperlink w:anchor="_Toc243205895" w:history="1">
+          <w:hyperlink w:anchor="_Toc243396747" w:history="1">
             <w:r>
               <w:rPr>
                 <w:rStyle w:val="Hipervnculo"/>
@@ -353,7 +353,7 @@
                 <w:noProof/>
                 <w:webHidden/>
               </w:rPr>
-              <w:instrText xml:space="preserve"> PAGEREF _Toc243205895 \h </w:instrText>
+              <w:instrText xml:space="preserve"> PAGEREF _Toc243396747 \h </w:instrText>
             </w:r>
             <w:r>
               <w:rPr>
@@ -400,7 +400,7 @@
               <w14:ligatures w14:val="standardContextual"/>
             </w:rPr>
           </w:pPr>
-          <w:hyperlink w:anchor="_Toc243205896" w:history="1">
+          <w:hyperlink w:anchor="_Toc243396748" w:history="1">
             <w:r>
               <w:rPr>
                 <w:rStyle w:val="Hipervnculo"/>
@@ -427,7 +427,7 @@
                 <w:noProof/>
                 <w:webHidden/>
               </w:rPr>
-              <w:instrText xml:space="preserve"> PAGEREF _Toc243205896 \h </w:instrText>
+              <w:instrText xml:space="preserve"> PAGEREF _Toc243396748 \h </w:instrText>
             </w:r>
             <w:r>
               <w:rPr>
@@ -474,7 +474,7 @@
               <w14:ligatures w14:val="standardContextual"/>
             </w:rPr>
           </w:pPr>
-          <w:hyperlink w:anchor="_Toc243205897" w:history="1">
+          <w:hyperlink w:anchor="_Toc243396749" w:history="1">
             <w:r>
               <w:rPr>
                 <w:rStyle w:val="Hipervnculo"/>
@@ -501,7 +501,7 @@
                 <w:noProof/>
                 <w:webHidden/>
               </w:rPr>
-              <w:instrText xml:space="preserve"> PAGEREF _Toc243205897 \h </w:instrText>
+              <w:instrText xml:space="preserve"> PAGEREF _Toc243396749 \h </w:instrText>
             </w:r>
             <w:r>
               <w:rPr>
@@ -548,7 +548,7 @@
               <w14:ligatures w14:val="standardContextual"/>
             </w:rPr>
           </w:pPr>
-          <w:hyperlink w:anchor="_Toc243205898" w:history="1">
+          <w:hyperlink w:anchor="_Toc243396750" w:history="1">
             <w:r>
               <w:rPr>
                 <w:rStyle w:val="Hipervnculo"/>
@@ -575,7 +575,7 @@
                 <w:noProof/>
                 <w:webHidden/>
               </w:rPr>
-              <w:instrText xml:space="preserve"> PAGEREF _Toc243205898 \h </w:instrText>
+              <w:instrText xml:space="preserve"> PAGEREF _Toc243396750 \h </w:instrText>
             </w:r>
             <w:r>
               <w:rPr>
@@ -622,7 +622,7 @@
               <w14:ligatures w14:val="standardContextual"/>
             </w:rPr>
           </w:pPr>
-          <w:hyperlink w:anchor="_Toc243205899" w:history="1">
+          <w:hyperlink w:anchor="_Toc243396751" w:history="1">
             <w:r>
               <w:rPr>
                 <w:rStyle w:val="Hipervnculo"/>
@@ -649,7 +649,7 @@
                 <w:noProof/>
                 <w:webHidden/>
               </w:rPr>
-              <w:instrText xml:space="preserve"> PAGEREF _Toc243205899 \h </w:instrText>
+              <w:instrText xml:space="preserve"> PAGEREF _Toc243396751 \h </w:instrText>
             </w:r>
             <w:r>
               <w:rPr>
@@ -696,7 +696,7 @@
               <w14:ligatures w14:val="standardContextual"/>
             </w:rPr>
           </w:pPr>
-          <w:hyperlink w:anchor="_Toc243205900" w:history="1">
+          <w:hyperlink w:anchor="_Toc243396752" w:history="1">
             <w:r>
               <w:rPr>
                 <w:rStyle w:val="Hipervnculo"/>
@@ -723,7 +723,7 @@
                 <w:noProof/>
                 <w:webHidden/>
               </w:rPr>
-              <w:instrText xml:space="preserve"> PAGEREF _Toc243205900 \h </w:instrText>
+              <w:instrText xml:space="preserve"> PAGEREF _Toc243396752 \h </w:instrText>
             </w:r>
             <w:r>
               <w:rPr>
@@ -770,7 +770,7 @@
               <w14:ligatures w14:val="standardContextual"/>
             </w:rPr>
           </w:pPr>
-          <w:hyperlink w:anchor="_Toc243205901" w:history="1">
+          <w:hyperlink w:anchor="_Toc243396753" w:history="1">
             <w:r>
               <w:rPr>
                 <w:rStyle w:val="Hipervnculo"/>
@@ -797,7 +797,7 @@
                 <w:noProof/>
                 <w:webHidden/>
               </w:rPr>
-              <w:instrText xml:space="preserve"> PAGEREF _Toc243205901 \h </w:instrText>
+              <w:instrText xml:space="preserve"> PAGEREF _Toc243396753 \h </w:instrText>
             </w:r>
             <w:r>
               <w:rPr>
@@ -844,7 +844,7 @@
               <w14:ligatures w14:val="standardContextual"/>
             </w:rPr>
           </w:pPr>
-          <w:hyperlink w:anchor="_Toc243205902" w:history="1">
+          <w:hyperlink w:anchor="_Toc243396754" w:history="1">
             <w:r>
               <w:rPr>
                 <w:rStyle w:val="Hipervnculo"/>
@@ -871,7 +871,7 @@
                 <w:noProof/>
                 <w:webHidden/>
               </w:rPr>
-              <w:instrText xml:space="preserve"> PAGEREF _Toc243205902 \h </w:instrText>
+              <w:instrText xml:space="preserve"> PAGEREF _Toc243396754 \h </w:instrText>
             </w:r>
             <w:r>
               <w:rPr>
@@ -918,7 +918,7 @@
               <w14:ligatures w14:val="standardContextual"/>
             </w:rPr>
           </w:pPr>
-          <w:hyperlink w:anchor="_Toc243205903" w:history="1">
+          <w:hyperlink w:anchor="_Toc243396755" w:history="1">
             <w:r>
               <w:rPr>
                 <w:rStyle w:val="Hipervnculo"/>
@@ -945,7 +945,7 @@
                 <w:noProof/>
                 <w:webHidden/>
               </w:rPr>
-              <w:instrText xml:space="preserve"> PAGEREF _Toc243205903 \h </w:instrText>
+              <w:instrText xml:space="preserve"> PAGEREF _Toc243396755 \h </w:instrText>
             </w:r>
             <w:r>
               <w:rPr>
@@ -992,7 +992,7 @@
               <w14:ligatures w14:val="standardContextual"/>
             </w:rPr>
           </w:pPr>
-          <w:hyperlink w:anchor="_Toc243205904" w:history="1">
+          <w:hyperlink w:anchor="_Toc243396756" w:history="1">
             <w:r>
               <w:rPr>
                 <w:rStyle w:val="Hipervnculo"/>
@@ -1019,7 +1019,7 @@
                 <w:noProof/>
                 <w:webHidden/>
               </w:rPr>
-              <w:instrText xml:space="preserve"> PAGEREF _Toc243205904 \h </w:instrText>
+              <w:instrText xml:space="preserve"> PAGEREF _Toc243396756 \h </w:instrText>
             </w:r>
             <w:r>
               <w:rPr>
@@ -1066,7 +1066,7 @@
               <w14:ligatures w14:val="standardContextual"/>
             </w:rPr>
           </w:pPr>
-          <w:hyperlink w:anchor="_Toc243205905" w:history="1">
+          <w:hyperlink w:anchor="_Toc243396757" w:history="1">
             <w:r>
               <w:rPr>
                 <w:rStyle w:val="Hipervnculo"/>
@@ -1093,7 +1093,7 @@
                 <w:noProof/>
                 <w:webHidden/>
               </w:rPr>
-              <w:instrText xml:space="preserve"> PAGEREF _Toc243205905 \h </w:instrText>
+              <w:instrText xml:space="preserve"> PAGEREF _Toc243396757 \h </w:instrText>
             </w:r>
             <w:r>
               <w:rPr>
@@ -1140,7 +1140,7 @@
               <w14:ligatures w14:val="standardContextual"/>
             </w:rPr>
           </w:pPr>
-          <w:hyperlink w:anchor="_Toc243205906" w:history="1">
+          <w:hyperlink w:anchor="_Toc243396758" w:history="1">
             <w:r>
               <w:rPr>
                 <w:rStyle w:val="Hipervnculo"/>
@@ -1167,7 +1167,7 @@
                 <w:noProof/>
                 <w:webHidden/>
               </w:rPr>
-              <w:instrText xml:space="preserve"> PAGEREF _Toc243205906 \h </w:instrText>
+              <w:instrText xml:space="preserve"> PAGEREF _Toc243396758 \h </w:instrText>
             </w:r>
             <w:r>
               <w:rPr>
@@ -1214,7 +1214,7 @@
               <w14:ligatures w14:val="standardContextual"/>
             </w:rPr>
           </w:pPr>
-          <w:hyperlink w:anchor="_Toc243205907" w:history="1">
+          <w:hyperlink w:anchor="_Toc243396759" w:history="1">
             <w:r>
               <w:rPr>
                 <w:rStyle w:val="Hipervnculo"/>
@@ -1241,7 +1241,7 @@
                 <w:noProof/>
                 <w:webHidden/>
               </w:rPr>
-              <w:instrText xml:space="preserve"> PAGEREF _Toc243205907 \h </w:instrText>
+              <w:instrText xml:space="preserve"> PAGEREF _Toc243396759 \h </w:instrText>
             </w:r>
             <w:r>
               <w:rPr>
@@ -1288,7 +1288,7 @@
               <w14:ligatures w14:val="standardContextual"/>
             </w:rPr>
           </w:pPr>
-          <w:hyperlink w:anchor="_Toc243205908" w:history="1">
+          <w:hyperlink w:anchor="_Toc243396760" w:history="1">
             <w:r>
               <w:rPr>
                 <w:rStyle w:val="Hipervnculo"/>
@@ -1315,7 +1315,7 @@
                 <w:noProof/>
                 <w:webHidden/>
               </w:rPr>
-              <w:instrText xml:space="preserve"> PAGEREF _Toc243205908 \h </w:instrText>
+              <w:instrText xml:space="preserve"> PAGEREF _Toc243396760 \h </w:instrText>
             </w:r>
             <w:r>
               <w:rPr>
@@ -1362,7 +1362,7 @@
               <w14:ligatures w14:val="standardContextual"/>
             </w:rPr>
           </w:pPr>
-          <w:hyperlink w:anchor="_Toc243205909" w:history="1">
+          <w:hyperlink w:anchor="_Toc243396761" w:history="1">
             <w:r>
               <w:rPr>
                 <w:rStyle w:val="Hipervnculo"/>
@@ -1389,7 +1389,7 @@
                 <w:noProof/>
                 <w:webHidden/>
               </w:rPr>
-              <w:instrText xml:space="preserve"> PAGEREF _Toc243205909 \h </w:instrText>
+              <w:instrText xml:space="preserve"> PAGEREF _Toc243396761 \h </w:instrText>
             </w:r>
             <w:r>
               <w:rPr>
@@ -1436,7 +1436,7 @@
               <w14:ligatures w14:val="standardContextual"/>
             </w:rPr>
           </w:pPr>
-          <w:hyperlink w:anchor="_Toc243205910" w:history="1">
+          <w:hyperlink w:anchor="_Toc243396762" w:history="1">
             <w:r>
               <w:rPr>
                 <w:rStyle w:val="Hipervnculo"/>
@@ -1463,7 +1463,7 @@
                 <w:noProof/>
                 <w:webHidden/>
               </w:rPr>
-              <w:instrText xml:space="preserve"> PAGEREF _Toc243205910 \h </w:instrText>
+              <w:instrText xml:space="preserve"> PAGEREF _Toc243396762 \h </w:instrText>
             </w:r>
             <w:r>
               <w:rPr>
@@ -1510,7 +1510,7 @@
               <w14:ligatures w14:val="standardContextual"/>
             </w:rPr>
           </w:pPr>
-          <w:hyperlink w:anchor="_Toc243205911" w:history="1">
+          <w:hyperlink w:anchor="_Toc243396763" w:history="1">
             <w:r>
               <w:rPr>
                 <w:rStyle w:val="Hipervnculo"/>
@@ -1537,7 +1537,7 @@
                 <w:noProof/>
                 <w:webHidden/>
               </w:rPr>
-              <w:instrText xml:space="preserve"> PAGEREF _Toc243205911 \h </w:instrText>
+              <w:instrText xml:space="preserve"> PAGEREF _Toc243396763 \h </w:instrText>
             </w:r>
             <w:r>
               <w:rPr>
@@ -1584,7 +1584,7 @@
               <w14:ligatures w14:val="standardContextual"/>
             </w:rPr>
           </w:pPr>
-          <w:hyperlink w:anchor="_Toc243205912" w:history="1">
+          <w:hyperlink w:anchor="_Toc243396764" w:history="1">
             <w:r>
               <w:rPr>
                 <w:rStyle w:val="Hipervnculo"/>
@@ -1611,7 +1611,7 @@
                 <w:noProof/>
                 <w:webHidden/>
               </w:rPr>
-              <w:instrText xml:space="preserve"> PAGEREF _Toc243205912 \h </w:instrText>
+              <w:instrText xml:space="preserve"> PAGEREF _Toc243396764 \h </w:instrText>
             </w:r>
             <w:r>
               <w:rPr>
@@ -1658,7 +1658,7 @@
               <w14:ligatures w14:val="standardContextual"/>
             </w:rPr>
           </w:pPr>
-          <w:hyperlink w:anchor="_Toc243205913" w:history="1">
+          <w:hyperlink w:anchor="_Toc243396765" w:history="1">
             <w:r>
               <w:rPr>
                 <w:rStyle w:val="Hipervnculo"/>
@@ -1685,7 +1685,7 @@
                 <w:noProof/>
                 <w:webHidden/>
               </w:rPr>
-              <w:instrText xml:space="preserve"> PAGEREF _Toc243205913 \h </w:instrText>
+              <w:instrText xml:space="preserve"> PAGEREF _Toc243396765 \h </w:instrText>
             </w:r>
             <w:r>
               <w:rPr>
@@ -1732,7 +1732,7 @@
               <w14:ligatures w14:val="standardContextual"/>
             </w:rPr>
           </w:pPr>
-          <w:hyperlink w:anchor="_Toc243205914" w:history="1">
+          <w:hyperlink w:anchor="_Toc243396766" w:history="1">
             <w:r>
               <w:rPr>
                 <w:rStyle w:val="Hipervnculo"/>
@@ -1759,7 +1759,7 @@
                 <w:noProof/>
                 <w:webHidden/>
               </w:rPr>
-              <w:instrText xml:space="preserve"> PAGEREF _Toc243205914 \h </w:instrText>
+              <w:instrText xml:space="preserve"> PAGEREF _Toc243396766 \h </w:instrText>
             </w:r>
             <w:r>
               <w:rPr>
@@ -1806,7 +1806,7 @@
               <w14:ligatures w14:val="standardContextual"/>
             </w:rPr>
           </w:pPr>
-          <w:hyperlink w:anchor="_Toc243205915" w:history="1">
+          <w:hyperlink w:anchor="_Toc243396767" w:history="1">
             <w:r>
               <w:rPr>
                 <w:rStyle w:val="Hipervnculo"/>
@@ -1833,7 +1833,7 @@
                 <w:noProof/>
                 <w:webHidden/>
               </w:rPr>
-              <w:instrText xml:space="preserve"> PAGEREF _Toc243205915 \h </w:instrText>
+              <w:instrText xml:space="preserve"> PAGEREF _Toc243396767 \h </w:instrText>
             </w:r>
             <w:r>
               <w:rPr>
@@ -1880,7 +1880,7 @@
               <w14:ligatures w14:val="standardContextual"/>
             </w:rPr>
           </w:pPr>
-          <w:hyperlink w:anchor="_Toc243205916" w:history="1">
+          <w:hyperlink w:anchor="_Toc243396768" w:history="1">
             <w:r>
               <w:rPr>
                 <w:rStyle w:val="Hipervnculo"/>
@@ -1907,7 +1907,7 @@
                 <w:noProof/>
                 <w:webHidden/>
               </w:rPr>
-              <w:instrText xml:space="preserve"> PAGEREF _Toc243205916 \h </w:instrText>
+              <w:instrText xml:space="preserve"> PAGEREF _Toc243396768 \h </w:instrText>
             </w:r>
             <w:r>
               <w:rPr>
@@ -1954,7 +1954,7 @@
               <w14:ligatures w14:val="standardContextual"/>
             </w:rPr>
           </w:pPr>
-          <w:hyperlink w:anchor="_Toc243205917" w:history="1">
+          <w:hyperlink w:anchor="_Toc243396769" w:history="1">
             <w:r>
               <w:rPr>
                 <w:rStyle w:val="Hipervnculo"/>
@@ -1981,7 +1981,7 @@
                 <w:noProof/>
                 <w:webHidden/>
               </w:rPr>
-              <w:instrText xml:space="preserve"> PAGEREF _Toc243205917 \h </w:instrText>
+              <w:instrText xml:space="preserve"> PAGEREF _Toc243396769 \h </w:instrText>
             </w:r>
             <w:r>
               <w:rPr>
@@ -2028,7 +2028,7 @@
               <w14:ligatures w14:val="standardContextual"/>
             </w:rPr>
           </w:pPr>
-          <w:hyperlink w:anchor="_Toc243205918" w:history="1">
+          <w:hyperlink w:anchor="_Toc243396770" w:history="1">
             <w:r>
               <w:rPr>
                 <w:rStyle w:val="Hipervnculo"/>
@@ -2055,7 +2055,7 @@
                 <w:noProof/>
                 <w:webHidden/>
               </w:rPr>
-              <w:instrText xml:space="preserve"> PAGEREF _Toc243205918 \h </w:instrText>
+              <w:instrText xml:space="preserve"> PAGEREF _Toc243396770 \h </w:instrText>
             </w:r>
             <w:r>
               <w:rPr>
@@ -2102,7 +2102,7 @@
               <w14:ligatures w14:val="standardContextual"/>
             </w:rPr>
           </w:pPr>
-          <w:hyperlink w:anchor="_Toc243205919" w:history="1">
+          <w:hyperlink w:anchor="_Toc243396771" w:history="1">
             <w:r>
               <w:rPr>
                 <w:rStyle w:val="Hipervnculo"/>
@@ -2129,7 +2129,7 @@
                 <w:noProof/>
                 <w:webHidden/>
               </w:rPr>
-              <w:instrText xml:space="preserve"> PAGEREF _Toc243205919 \h </w:instrText>
+              <w:instrText xml:space="preserve"> PAGEREF _Toc243396771 \h </w:instrText>
             </w:r>
             <w:r>
               <w:rPr>
@@ -2176,7 +2176,7 @@
               <w14:ligatures w14:val="standardContextual"/>
             </w:rPr>
           </w:pPr>
-          <w:hyperlink w:anchor="_Toc243205920" w:history="1">
+          <w:hyperlink w:anchor="_Toc243396772" w:history="1">
             <w:r>
               <w:rPr>
                 <w:rStyle w:val="Hipervnculo"/>
@@ -2203,7 +2203,7 @@
                 <w:noProof/>
                 <w:webHidden/>
               </w:rPr>
-              <w:instrText xml:space="preserve"> PAGEREF _Toc243205920 \h </w:instrText>
+              <w:instrText xml:space="preserve"> PAGEREF _Toc243396772 \h </w:instrText>
             </w:r>
             <w:r>
               <w:rPr>
@@ -2250,7 +2250,7 @@
               <w14:ligatures w14:val="standardContextual"/>
             </w:rPr>
           </w:pPr>
-          <w:hyperlink w:anchor="_Toc243205921" w:history="1">
+          <w:hyperlink w:anchor="_Toc243396773" w:history="1">
             <w:r>
               <w:rPr>
                 <w:rStyle w:val="Hipervnculo"/>
@@ -2277,7 +2277,7 @@
                 <w:noProof/>
                 <w:webHidden/>
               </w:rPr>
-              <w:instrText xml:space="preserve"> PAGEREF _Toc243205921 \h </w:instrText>
+              <w:instrText xml:space="preserve"> PAGEREF _Toc243396773 \h </w:instrText>
             </w:r>
             <w:r>
               <w:rPr>
@@ -2324,7 +2324,7 @@
               <w14:ligatures w14:val="standardContextual"/>
             </w:rPr>
           </w:pPr>
-          <w:hyperlink w:anchor="_Toc243205922" w:history="1">
+          <w:hyperlink w:anchor="_Toc243396774" w:history="1">
             <w:r>
               <w:rPr>
                 <w:rStyle w:val="Hipervnculo"/>
@@ -2351,7 +2351,7 @@
                 <w:noProof/>
                 <w:webHidden/>
               </w:rPr>
-              <w:instrText xml:space="preserve"> PAGEREF _Toc243205922 \h </w:instrText>
+              <w:instrText xml:space="preserve"> PAGEREF _Toc243396774 \h </w:instrText>
             </w:r>
             <w:r>
               <w:rPr>
@@ -2398,7 +2398,7 @@
               <w14:ligatures w14:val="standardContextual"/>
             </w:rPr>
           </w:pPr>
-          <w:hyperlink w:anchor="_Toc243205923" w:history="1">
+          <w:hyperlink w:anchor="_Toc243396775" w:history="1">
             <w:r>
               <w:rPr>
                 <w:rStyle w:val="Hipervnculo"/>
@@ -2425,7 +2425,7 @@
                 <w:noProof/>
                 <w:webHidden/>
               </w:rPr>
-              <w:instrText xml:space="preserve"> PAGEREF _Toc243205923 \h </w:instrText>
+              <w:instrText xml:space="preserve"> PAGEREF _Toc243396775 \h </w:instrText>
             </w:r>
             <w:r>
               <w:rPr>
@@ -2472,7 +2472,7 @@
               <w14:ligatures w14:val="standardContextual"/>
             </w:rPr>
           </w:pPr>
-          <w:hyperlink w:anchor="_Toc243205924" w:history="1">
+          <w:hyperlink w:anchor="_Toc243396776" w:history="1">
             <w:r>
               <w:rPr>
                 <w:rStyle w:val="Hipervnculo"/>
@@ -2499,7 +2499,7 @@
                 <w:noProof/>
                 <w:webHidden/>
               </w:rPr>
-              <w:instrText xml:space="preserve"> PAGEREF _Toc243205924 \h </w:instrText>
+              <w:instrText xml:space="preserve"> PAGEREF _Toc243396776 \h </w:instrText>
             </w:r>
             <w:r>
               <w:rPr>
@@ -2546,7 +2546,7 @@
               <w14:ligatures w14:val="standardContextual"/>
             </w:rPr>
           </w:pPr>
-          <w:hyperlink w:anchor="_Toc243205925" w:history="1">
+          <w:hyperlink w:anchor="_Toc243396777" w:history="1">
             <w:r>
               <w:rPr>
                 <w:rStyle w:val="Hipervnculo"/>
@@ -2573,7 +2573,7 @@
                 <w:noProof/>
                 <w:webHidden/>
               </w:rPr>
-              <w:instrText xml:space="preserve"> PAGEREF _Toc243205925 \h </w:instrText>
+              <w:instrText xml:space="preserve"> PAGEREF _Toc243396777 \h </w:instrText>
             </w:r>
             <w:r>
               <w:rPr>
@@ -2620,7 +2620,7 @@
               <w14:ligatures w14:val="standardContextual"/>
             </w:rPr>
           </w:pPr>
-          <w:hyperlink w:anchor="_Toc243205926" w:history="1">
+          <w:hyperlink w:anchor="_Toc243396778" w:history="1">
             <w:r>
               <w:rPr>
                 <w:rStyle w:val="Hipervnculo"/>
@@ -2647,7 +2647,7 @@
                 <w:noProof/>
                 <w:webHidden/>
               </w:rPr>
-              <w:instrText xml:space="preserve"> PAGEREF _Toc243205926 \h </w:instrText>
+              <w:instrText xml:space="preserve"> PAGEREF _Toc243396778 \h </w:instrText>
             </w:r>
             <w:r>
               <w:rPr>
@@ -2694,7 +2694,7 @@
               <w14:ligatures w14:val="standardContextual"/>
             </w:rPr>
           </w:pPr>
-          <w:hyperlink w:anchor="_Toc243205927" w:history="1">
+          <w:hyperlink w:anchor="_Toc243396779" w:history="1">
             <w:r>
               <w:rPr>
                 <w:rStyle w:val="Hipervnculo"/>
@@ -2721,7 +2721,7 @@
                 <w:noProof/>
                 <w:webHidden/>
               </w:rPr>
-              <w:instrText xml:space="preserve"> PAGEREF _Toc243205927 \h </w:instrText>
+              <w:instrText xml:space="preserve"> PAGEREF _Toc243396779 \h </w:instrText>
             </w:r>
             <w:r>
               <w:rPr>
@@ -2768,7 +2768,7 @@
               <w14:ligatures w14:val="standardContextual"/>
             </w:rPr>
           </w:pPr>
-          <w:hyperlink w:anchor="_Toc243205928" w:history="1">
+          <w:hyperlink w:anchor="_Toc243396780" w:history="1">
             <w:r>
               <w:rPr>
                 <w:rStyle w:val="Hipervnculo"/>
@@ -2795,7 +2795,7 @@
                 <w:noProof/>
                 <w:webHidden/>
               </w:rPr>
-              <w:instrText xml:space="preserve"> PAGEREF _Toc243205928 \h </w:instrText>
+              <w:instrText xml:space="preserve"> PAGEREF _Toc243396780 \h </w:instrText>
             </w:r>
             <w:r>
               <w:rPr>
@@ -2842,7 +2842,7 @@
               <w14:ligatures w14:val="standardContextual"/>
             </w:rPr>
           </w:pPr>
-          <w:hyperlink w:anchor="_Toc243205929" w:history="1">
+          <w:hyperlink w:anchor="_Toc243396781" w:history="1">
             <w:r>
               <w:rPr>
                 <w:rStyle w:val="Hipervnculo"/>
@@ -2869,7 +2869,7 @@
                 <w:noProof/>
                 <w:webHidden/>
               </w:rPr>
-              <w:instrText xml:space="preserve"> PAGEREF _Toc243205929 \h </w:instrText>
+              <w:instrText xml:space="preserve"> PAGEREF _Toc243396781 \h </w:instrText>
             </w:r>
             <w:r>
               <w:rPr>
@@ -2916,7 +2916,7 @@
               <w14:ligatures w14:val="standardContextual"/>
             </w:rPr>
           </w:pPr>
-          <w:hyperlink w:anchor="_Toc243205930" w:history="1">
+          <w:hyperlink w:anchor="_Toc243396782" w:history="1">
             <w:r>
               <w:rPr>
                 <w:rStyle w:val="Hipervnculo"/>
@@ -2943,7 +2943,7 @@
                 <w:noProof/>
                 <w:webHidden/>
               </w:rPr>
-              <w:instrText xml:space="preserve"> PAGEREF _Toc243205930 \h </w:instrText>
+              <w:instrText xml:space="preserve"> PAGEREF _Toc243396782 \h </w:instrText>
             </w:r>
             <w:r>
               <w:rPr>
@@ -2990,7 +2990,7 @@
               <w14:ligatures w14:val="standardContextual"/>
             </w:rPr>
           </w:pPr>
-          <w:hyperlink w:anchor="_Toc243205931" w:history="1">
+          <w:hyperlink w:anchor="_Toc243396783" w:history="1">
             <w:r>
               <w:rPr>
                 <w:rStyle w:val="Hipervnculo"/>
@@ -3017,7 +3017,7 @@
                 <w:noProof/>
                 <w:webHidden/>
               </w:rPr>
-              <w:instrText xml:space="preserve"> PAGEREF _Toc243205931 \h </w:instrText>
+              <w:instrText xml:space="preserve"> PAGEREF _Toc243396783 \h </w:instrText>
             </w:r>
             <w:r>
               <w:rPr>
@@ -3064,7 +3064,7 @@
               <w14:ligatures w14:val="standardContextual"/>
             </w:rPr>
           </w:pPr>
-          <w:hyperlink w:anchor="_Toc243205932" w:history="1">
+          <w:hyperlink w:anchor="_Toc243396784" w:history="1">
             <w:r>
               <w:rPr>
                 <w:rStyle w:val="Hipervnculo"/>
@@ -3091,7 +3091,7 @@
                 <w:noProof/>
                 <w:webHidden/>
               </w:rPr>
-              <w:instrText xml:space="preserve"> PAGEREF _Toc243205932 \h </w:instrText>
+              <w:instrText xml:space="preserve"> PAGEREF _Toc243396784 \h </w:instrText>
             </w:r>
             <w:r>
               <w:rPr>
@@ -3138,7 +3138,7 @@
               <w14:ligatures w14:val="standardContextual"/>
             </w:rPr>
           </w:pPr>
-          <w:hyperlink w:anchor="_Toc243205933" w:history="1">
+          <w:hyperlink w:anchor="_Toc243396785" w:history="1">
             <w:r>
               <w:rPr>
                 <w:rStyle w:val="Hipervnculo"/>
@@ -3165,7 +3165,7 @@
                 <w:noProof/>
                 <w:webHidden/>
               </w:rPr>
-              <w:instrText xml:space="preserve"> PAGEREF _Toc243205933 \h </w:instrText>
+              <w:instrText xml:space="preserve"> PAGEREF _Toc243396785 \h </w:instrText>
             </w:r>
             <w:r>
               <w:rPr>
@@ -3212,7 +3212,7 @@
               <w14:ligatures w14:val="standardContextual"/>
             </w:rPr>
           </w:pPr>
-          <w:hyperlink w:anchor="_Toc243205934" w:history="1">
+          <w:hyperlink w:anchor="_Toc243396786" w:history="1">
             <w:r>
               <w:rPr>
                 <w:rStyle w:val="Hipervnculo"/>
@@ -3239,7 +3239,7 @@
                 <w:noProof/>
                 <w:webHidden/>
               </w:rPr>
-              <w:instrText xml:space="preserve"> PAGEREF _Toc243205934 \h </w:instrText>
+              <w:instrText xml:space="preserve"> PAGEREF _Toc243396786 \h </w:instrText>
             </w:r>
             <w:r>
               <w:rPr>
@@ -3286,7 +3286,7 @@
               <w14:ligatures w14:val="standardContextual"/>
             </w:rPr>
           </w:pPr>
-          <w:hyperlink w:anchor="_Toc243205935" w:history="1">
+          <w:hyperlink w:anchor="_Toc243396787" w:history="1">
             <w:r>
               <w:rPr>
                 <w:rStyle w:val="Hipervnculo"/>
@@ -3313,7 +3313,7 @@
                 <w:noProof/>
                 <w:webHidden/>
               </w:rPr>
-              <w:instrText xml:space="preserve"> PAGEREF _Toc243205935 \h </w:instrText>
+              <w:instrText xml:space="preserve"> PAGEREF _Toc243396787 \h </w:instrText>
             </w:r>
             <w:r>
               <w:rPr>
@@ -3360,7 +3360,7 @@
               <w14:ligatures w14:val="standardContextual"/>
             </w:rPr>
           </w:pPr>
-          <w:hyperlink w:anchor="_Toc243205936" w:history="1">
+          <w:hyperlink w:anchor="_Toc243396788" w:history="1">
             <w:r>
               <w:rPr>
                 <w:rStyle w:val="Hipervnculo"/>
@@ -3387,7 +3387,7 @@
                 <w:noProof/>
                 <w:webHidden/>
               </w:rPr>
-              <w:instrText xml:space="preserve"> PAGEREF _Toc243205936 \h </w:instrText>
+              <w:instrText xml:space="preserve"> PAGEREF _Toc243396788 \h </w:instrText>
             </w:r>
             <w:r>
               <w:rPr>
@@ -3434,7 +3434,7 @@
               <w14:ligatures w14:val="standardContextual"/>
             </w:rPr>
           </w:pPr>
-          <w:hyperlink w:anchor="_Toc243205937" w:history="1">
+          <w:hyperlink w:anchor="_Toc243396789" w:history="1">
             <w:r>
               <w:rPr>
                 <w:rStyle w:val="Hipervnculo"/>
@@ -3461,7 +3461,7 @@
                 <w:noProof/>
                 <w:webHidden/>
               </w:rPr>
-              <w:instrText xml:space="preserve"> PAGEREF _Toc243205937 \h </w:instrText>
+              <w:instrText xml:space="preserve"> PAGEREF _Toc243396789 \h </w:instrText>
             </w:r>
             <w:r>
               <w:rPr>
@@ -3508,7 +3508,7 @@
               <w14:ligatures w14:val="standardContextual"/>
             </w:rPr>
           </w:pPr>
-          <w:hyperlink w:anchor="_Toc243205938" w:history="1">
+          <w:hyperlink w:anchor="_Toc243396790" w:history="1">
             <w:r>
               <w:rPr>
                 <w:rStyle w:val="Hipervnculo"/>
@@ -3535,7 +3535,7 @@
                 <w:noProof/>
                 <w:webHidden/>
               </w:rPr>
-              <w:instrText xml:space="preserve"> PAGEREF _Toc243205938 \h </w:instrText>
+              <w:instrText xml:space="preserve"> PAGEREF _Toc243396790 \h </w:instrText>
             </w:r>
             <w:r>
               <w:rPr>
@@ -3582,7 +3582,7 @@
               <w14:ligatures w14:val="standardContextual"/>
             </w:rPr>
           </w:pPr>
-          <w:hyperlink w:anchor="_Toc243205939" w:history="1">
+          <w:hyperlink w:anchor="_Toc243396791" w:history="1">
             <w:r>
               <w:rPr>
                 <w:rStyle w:val="Hipervnculo"/>
@@ -3609,7 +3609,7 @@
                 <w:noProof/>
                 <w:webHidden/>
               </w:rPr>
-              <w:instrText xml:space="preserve"> PAGEREF _Toc243205939 \h </w:instrText>
+              <w:instrText xml:space="preserve"> PAGEREF _Toc243396791 \h </w:instrText>
             </w:r>
             <w:r>
               <w:rPr>
@@ -3656,7 +3656,7 @@
               <w14:ligatures w14:val="standardContextual"/>
             </w:rPr>
           </w:pPr>
-          <w:hyperlink w:anchor="_Toc243205940" w:history="1">
+          <w:hyperlink w:anchor="_Toc243396792" w:history="1">
             <w:r>
               <w:rPr>
                 <w:rStyle w:val="Hipervnculo"/>
@@ -3683,7 +3683,7 @@
                 <w:noProof/>
                 <w:webHidden/>
               </w:rPr>
-              <w:instrText xml:space="preserve"> PAGEREF _Toc243205940 \h </w:instrText>
+              <w:instrText xml:space="preserve"> PAGEREF _Toc243396792 \h </w:instrText>
             </w:r>
             <w:r>
               <w:rPr>
@@ -3730,7 +3730,7 @@
               <w14:ligatures w14:val="standardContextual"/>
             </w:rPr>
           </w:pPr>
-          <w:hyperlink w:anchor="_Toc243205941" w:history="1">
+          <w:hyperlink w:anchor="_Toc243396793" w:history="1">
             <w:r>
               <w:rPr>
                 <w:rStyle w:val="Hipervnculo"/>
@@ -3757,7 +3757,7 @@
                 <w:noProof/>
                 <w:webHidden/>
               </w:rPr>
-              <w:instrText xml:space="preserve"> PAGEREF _Toc243205941 \h </w:instrText>
+              <w:instrText xml:space="preserve"> PAGEREF _Toc243396793 \h </w:instrText>
             </w:r>
             <w:r>
               <w:rPr>
@@ -3804,7 +3804,7 @@
               <w14:ligatures w14:val="standardContextual"/>
             </w:rPr>
           </w:pPr>
-          <w:hyperlink w:anchor="_Toc243205942" w:history="1">
+          <w:hyperlink w:anchor="_Toc243396794" w:history="1">
             <w:r>
               <w:rPr>
                 <w:rStyle w:val="Hipervnculo"/>
@@ -3831,7 +3831,7 @@
                 <w:noProof/>
                 <w:webHidden/>
               </w:rPr>
-              <w:instrText xml:space="preserve"> PAGEREF _Toc243205942 \h </w:instrText>
+              <w:instrText xml:space="preserve"> PAGEREF _Toc243396794 \h </w:instrText>
             </w:r>
             <w:r>
               <w:rPr>
@@ -3878,7 +3878,7 @@
               <w14:ligatures w14:val="standardContextual"/>
             </w:rPr>
           </w:pPr>
-          <w:hyperlink w:anchor="_Toc243205943" w:history="1">
+          <w:hyperlink w:anchor="_Toc243396795" w:history="1">
             <w:r>
               <w:rPr>
                 <w:rStyle w:val="Hipervnculo"/>
@@ -3905,7 +3905,7 @@
                 <w:noProof/>
                 <w:webHidden/>
               </w:rPr>
-              <w:instrText xml:space="preserve"> PAGEREF _Toc243205943 \h </w:instrText>
+              <w:instrText xml:space="preserve"> PAGEREF _Toc243396795 \h </w:instrText>
             </w:r>
             <w:r>
               <w:rPr>
@@ -3952,7 +3952,7 @@
               <w14:ligatures w14:val="standardContextual"/>
             </w:rPr>
           </w:pPr>
-          <w:hyperlink w:anchor="_Toc243205944" w:history="1">
+          <w:hyperlink w:anchor="_Toc243396796" w:history="1">
             <w:r>
               <w:rPr>
                 <w:rStyle w:val="Hipervnculo"/>
@@ -3979,7 +3979,7 @@
                 <w:noProof/>
                 <w:webHidden/>
               </w:rPr>
-              <w:instrText xml:space="preserve"> PAGEREF _Toc243205944 \h </w:instrText>
+              <w:instrText xml:space="preserve"> PAGEREF _Toc243396796 \h </w:instrText>
             </w:r>
             <w:r>
               <w:rPr>
@@ -4026,7 +4026,7 @@
               <w14:ligatures w14:val="standardContextual"/>
             </w:rPr>
           </w:pPr>
-          <w:hyperlink w:anchor="_Toc243205945" w:history="1">
+          <w:hyperlink w:anchor="_Toc243396797" w:history="1">
             <w:r>
               <w:rPr>
                 <w:rStyle w:val="Hipervnculo"/>
@@ -4053,7 +4053,7 @@
                 <w:noProof/>
                 <w:webHidden/>
               </w:rPr>
-              <w:instrText xml:space="preserve"> PAGEREF _Toc243205945 \h </w:instrText>
+              <w:instrText xml:space="preserve"> PAGEREF _Toc243396797 \h </w:instrText>
             </w:r>
             <w:r>
               <w:rPr>
@@ -4100,7 +4100,7 @@
               <w14:ligatures w14:val="standardContextual"/>
             </w:rPr>
           </w:pPr>
-          <w:hyperlink w:anchor="_Toc243205946" w:history="1">
+          <w:hyperlink w:anchor="_Toc243396798" w:history="1">
             <w:r>
               <w:rPr>
                 <w:rStyle w:val="Hipervnculo"/>
@@ -4127,7 +4127,7 @@
                 <w:noProof/>
                 <w:webHidden/>
               </w:rPr>
-              <w:instrText xml:space="preserve"> PAGEREF _Toc243205946 \h </w:instrText>
+              <w:instrText xml:space="preserve"> PAGEREF _Toc243396798 \h </w:instrText>
             </w:r>
             <w:r>
               <w:rPr>
@@ -4174,7 +4174,7 @@
               <w14:ligatures w14:val="standardContextual"/>
             </w:rPr>
           </w:pPr>
-          <w:hyperlink w:anchor="_Toc243205947" w:history="1">
+          <w:hyperlink w:anchor="_Toc243396799" w:history="1">
             <w:r>
               <w:rPr>
                 <w:rStyle w:val="Hipervnculo"/>
@@ -4201,7 +4201,7 @@
                 <w:noProof/>
                 <w:webHidden/>
               </w:rPr>
-              <w:instrText xml:space="preserve"> PAGEREF _Toc243205947 \h </w:instrText>
+              <w:instrText xml:space="preserve"> PAGEREF _Toc243396799 \h </w:instrText>
             </w:r>
             <w:r>
               <w:rPr>
@@ -4248,7 +4248,7 @@
               <w14:ligatures w14:val="standardContextual"/>
             </w:rPr>
           </w:pPr>
-          <w:hyperlink w:anchor="_Toc243205948" w:history="1">
+          <w:hyperlink w:anchor="_Toc243396800" w:history="1">
             <w:r>
               <w:rPr>
                 <w:rStyle w:val="Hipervnculo"/>
@@ -4275,7 +4275,7 @@
                 <w:noProof/>
                 <w:webHidden/>
               </w:rPr>
-              <w:instrText xml:space="preserve"> PAGEREF _Toc243205948 \h </w:instrText>
+              <w:instrText xml:space="preserve"> PAGEREF _Toc243396800 \h </w:instrText>
             </w:r>
             <w:r>
               <w:rPr>
@@ -4322,7 +4322,7 @@
               <w14:ligatures w14:val="standardContextual"/>
             </w:rPr>
           </w:pPr>
-          <w:hyperlink w:anchor="_Toc243205949" w:history="1">
+          <w:hyperlink w:anchor="_Toc243396801" w:history="1">
             <w:r>
               <w:rPr>
                 <w:rStyle w:val="Hipervnculo"/>
@@ -4349,7 +4349,7 @@
                 <w:noProof/>
                 <w:webHidden/>
               </w:rPr>
-              <w:instrText xml:space="preserve"> PAGEREF _Toc243205949 \h </w:instrText>
+              <w:instrText xml:space="preserve"> PAGEREF _Toc243396801 \h </w:instrText>
             </w:r>
             <w:r>
               <w:rPr>
@@ -4396,7 +4396,7 @@
               <w14:ligatures w14:val="standardContextual"/>
             </w:rPr>
           </w:pPr>
-          <w:hyperlink w:anchor="_Toc243205950" w:history="1">
+          <w:hyperlink w:anchor="_Toc243396802" w:history="1">
             <w:r>
               <w:rPr>
                 <w:rStyle w:val="Hipervnculo"/>
@@ -4423,7 +4423,7 @@
                 <w:noProof/>
                 <w:webHidden/>
               </w:rPr>
-              <w:instrText xml:space="preserve"> PAGEREF _Toc243205950 \h </w:instrText>
+              <w:instrText xml:space="preserve"> PAGEREF _Toc243396802 \h </w:instrText>
             </w:r>
             <w:r>
               <w:rPr>
@@ -4470,7 +4470,7 @@
               <w14:ligatures w14:val="standardContextual"/>
             </w:rPr>
           </w:pPr>
-          <w:hyperlink w:anchor="_Toc243205951" w:history="1">
+          <w:hyperlink w:anchor="_Toc243396803" w:history="1">
             <w:r>
               <w:rPr>
                 <w:rStyle w:val="Hipervnculo"/>
@@ -4497,7 +4497,7 @@
                 <w:noProof/>
                 <w:webHidden/>
               </w:rPr>
-              <w:instrText xml:space="preserve"> PAGEREF _Toc243205951 \h </w:instrText>
+              <w:instrText xml:space="preserve"> PAGEREF _Toc243396803 \h </w:instrText>
             </w:r>
             <w:r>
               <w:rPr>
@@ -4544,7 +4544,7 @@
               <w14:ligatures w14:val="standardContextual"/>
             </w:rPr>
           </w:pPr>
-          <w:hyperlink w:anchor="_Toc243205952" w:history="1">
+          <w:hyperlink w:anchor="_Toc243396804" w:history="1">
             <w:r>
               <w:rPr>
                 <w:rStyle w:val="Hipervnculo"/>
@@ -4571,7 +4571,7 @@
                 <w:noProof/>
                 <w:webHidden/>
               </w:rPr>
-              <w:instrText xml:space="preserve"> PAGEREF _Toc243205952 \h </w:instrText>
+              <w:instrText xml:space="preserve"> PAGEREF _Toc243396804 \h </w:instrText>
             </w:r>
             <w:r>
               <w:rPr>
@@ -4618,7 +4618,7 @@
               <w14:ligatures w14:val="standardContextual"/>
             </w:rPr>
           </w:pPr>
-          <w:hyperlink w:anchor="_Toc243205953" w:history="1">
+          <w:hyperlink w:anchor="_Toc243396805" w:history="1">
             <w:r>
               <w:rPr>
                 <w:rStyle w:val="Hipervnculo"/>
@@ -4645,7 +4645,7 @@
                 <w:noProof/>
                 <w:webHidden/>
               </w:rPr>
-              <w:instrText xml:space="preserve"> PAGEREF _Toc243205953 \h </w:instrText>
+              <w:instrText xml:space="preserve"> PAGEREF _Toc243396805 \h </w:instrText>
             </w:r>
             <w:r>
               <w:rPr>
@@ -4693,7 +4693,7 @@
         <w:pStyle w:val="Ttulo1"/>
       </w:pPr>
       <w:bookmarkStart w:id="0" w:name="sobre-este-documento"/>
-      <w:bookmarkStart w:id="1" w:name="_Toc243205892"/>
+      <w:bookmarkStart w:id="1" w:name="_Toc243396744"/>
       <w:r>
         <w:t>Sobre este documento</w:t>
       </w:r>
@@ -4883,7 +4883,7 @@
       <w:r>
         <w:t xml:space="preserve"> Este documento consolida y resume. El detalle de cada historia está en el </w:t>
       </w:r>
-      <w:hyperlink r:id="rId8">
+      <w:hyperlink r:id="rId8" w:anchor="documentación">
         <w:r>
           <w:rPr>
             <w:rStyle w:val="Hipervnculo"/>
@@ -4944,7 +4944,7 @@
         <w:pStyle w:val="Ttulo1"/>
       </w:pPr>
       <w:bookmarkStart w:id="2" w:name="introducción-y-alcance"/>
-      <w:bookmarkStart w:id="3" w:name="_Toc243205893"/>
+      <w:bookmarkStart w:id="3" w:name="_Toc243396745"/>
       <w:bookmarkEnd w:id="0"/>
       <w:r>
         <w:t>1. Introducción y alcance</w:t>
@@ -4956,7 +4956,7 @@
         <w:pStyle w:val="Ttulo2"/>
       </w:pPr>
       <w:bookmarkStart w:id="4" w:name="pregunta-central"/>
-      <w:bookmarkStart w:id="5" w:name="_Toc243205894"/>
+      <w:bookmarkStart w:id="5" w:name="_Toc243396746"/>
       <w:r>
         <w:t>1.1. Pregunta central</w:t>
       </w:r>
@@ -5066,7 +5066,7 @@
         <w:pStyle w:val="Ttulo2"/>
       </w:pPr>
       <w:bookmarkStart w:id="6" w:name="metas-del-sistema"/>
-      <w:bookmarkStart w:id="7" w:name="_Toc243205895"/>
+      <w:bookmarkStart w:id="7" w:name="_Toc243396747"/>
       <w:bookmarkEnd w:id="4"/>
       <w:r>
         <w:t>1.2. Metas del sistema</w:t>
@@ -5173,7 +5173,7 @@
         <w:pStyle w:val="Ttulo2"/>
       </w:pPr>
       <w:bookmarkStart w:id="8" w:name="alcance"/>
-      <w:bookmarkStart w:id="9" w:name="_Toc243205896"/>
+      <w:bookmarkStart w:id="9" w:name="_Toc243396748"/>
       <w:bookmarkEnd w:id="6"/>
       <w:r>
         <w:t>1.3. Alcance</w:t>
@@ -5242,7 +5242,7 @@
         <w:pStyle w:val="Ttulo2"/>
       </w:pPr>
       <w:bookmarkStart w:id="10" w:name="matriz-de-cumplimiento-del-enunciado"/>
-      <w:bookmarkStart w:id="11" w:name="_Toc243205897"/>
+      <w:bookmarkStart w:id="11" w:name="_Toc243396749"/>
       <w:bookmarkEnd w:id="8"/>
       <w:r>
         <w:t>1.4. Matriz de cumplimiento del enunciado</w:t>
@@ -6306,7 +6306,7 @@
         <w:pStyle w:val="Ttulo1"/>
       </w:pPr>
       <w:bookmarkStart w:id="12" w:name="visión-general-y-arquitectura"/>
-      <w:bookmarkStart w:id="13" w:name="_Toc243205898"/>
+      <w:bookmarkStart w:id="13" w:name="_Toc243396750"/>
       <w:bookmarkEnd w:id="2"/>
       <w:bookmarkEnd w:id="10"/>
       <w:r>
@@ -6319,7 +6319,7 @@
         <w:pStyle w:val="Ttulo2"/>
       </w:pPr>
       <w:bookmarkStart w:id="14" w:name="capas"/>
-      <w:bookmarkStart w:id="15" w:name="_Toc243205899"/>
+      <w:bookmarkStart w:id="15" w:name="_Toc243396751"/>
       <w:r>
         <w:t>2.1. Capas</w:t>
       </w:r>
@@ -6989,7 +6989,7 @@
         <w:pStyle w:val="Ttulo2"/>
       </w:pPr>
       <w:bookmarkStart w:id="16" w:name="flujo-de-datos"/>
-      <w:bookmarkStart w:id="17" w:name="_Toc243205900"/>
+      <w:bookmarkStart w:id="17" w:name="_Toc243396752"/>
       <w:bookmarkEnd w:id="14"/>
       <w:r>
         <w:t>2.2. Flujo de datos</w:t>
@@ -7147,7 +7147,7 @@
         <w:pStyle w:val="Ttulo2"/>
       </w:pPr>
       <w:bookmarkStart w:id="18" w:name="recorrido-del-usuario"/>
-      <w:bookmarkStart w:id="19" w:name="_Toc243205901"/>
+      <w:bookmarkStart w:id="19" w:name="_Toc243396753"/>
       <w:bookmarkEnd w:id="16"/>
       <w:r>
         <w:t>2.3. Recorrido del usuario</w:t>
@@ -7342,7 +7342,7 @@
         <w:pStyle w:val="Ttulo2"/>
       </w:pPr>
       <w:bookmarkStart w:id="20" w:name="stack-técnico"/>
-      <w:bookmarkStart w:id="21" w:name="_Toc243205902"/>
+      <w:bookmarkStart w:id="21" w:name="_Toc243396754"/>
       <w:bookmarkEnd w:id="18"/>
       <w:r>
         <w:t>2.4. Stack técnico</w:t>
@@ -7498,7 +7498,7 @@
         <w:pStyle w:val="Ttulo1"/>
       </w:pPr>
       <w:bookmarkStart w:id="22" w:name="modelado-del-problema"/>
-      <w:bookmarkStart w:id="23" w:name="_Toc243205903"/>
+      <w:bookmarkStart w:id="23" w:name="_Toc243396755"/>
       <w:bookmarkEnd w:id="12"/>
       <w:bookmarkEnd w:id="20"/>
       <w:r>
@@ -7519,7 +7519,7 @@
         <w:pStyle w:val="Ttulo2"/>
       </w:pPr>
       <w:bookmarkStart w:id="24" w:name="navegación"/>
-      <w:bookmarkStart w:id="25" w:name="_Toc243205904"/>
+      <w:bookmarkStart w:id="25" w:name="_Toc243396756"/>
       <w:r>
         <w:t>3.1. Navegación</w:t>
       </w:r>
@@ -7738,7 +7738,7 @@
         <w:pStyle w:val="Ttulo2"/>
       </w:pPr>
       <w:bookmarkStart w:id="26" w:name="partida-adversarial"/>
-      <w:bookmarkStart w:id="27" w:name="_Toc243205905"/>
+      <w:bookmarkStart w:id="27" w:name="_Toc243396757"/>
       <w:bookmarkEnd w:id="24"/>
       <w:r>
         <w:t>3.2. Partida adversarial</w:t>
@@ -7919,7 +7919,7 @@
         <w:pStyle w:val="Ttulo1"/>
       </w:pPr>
       <w:bookmarkStart w:id="28" w:name="representación-de-estados"/>
-      <w:bookmarkStart w:id="29" w:name="_Toc243205906"/>
+      <w:bookmarkStart w:id="29" w:name="_Toc243396758"/>
       <w:bookmarkEnd w:id="22"/>
       <w:bookmarkEnd w:id="26"/>
       <w:r>
@@ -7932,7 +7932,7 @@
         <w:pStyle w:val="Ttulo2"/>
       </w:pPr>
       <w:bookmarkStart w:id="30" w:name="lo-estático-y-lo-dinámico"/>
-      <w:bookmarkStart w:id="31" w:name="_Toc243205907"/>
+      <w:bookmarkStart w:id="31" w:name="_Toc243396759"/>
       <w:r>
         <w:t>4.1. Lo estático y lo dinámico</w:t>
       </w:r>
@@ -8247,7 +8247,7 @@
         <w:pStyle w:val="Ttulo2"/>
       </w:pPr>
       <w:bookmarkStart w:id="32" w:name="por-qué-la-representación-es-suficiente"/>
-      <w:bookmarkStart w:id="33" w:name="_Toc243205908"/>
+      <w:bookmarkStart w:id="33" w:name="_Toc243396760"/>
       <w:bookmarkEnd w:id="30"/>
       <w:r>
         <w:t>4.2. Por qué la representación es suficiente</w:t>
@@ -8388,7 +8388,7 @@
         <w:pStyle w:val="Ttulo2"/>
       </w:pPr>
       <w:bookmarkStart w:id="34" w:name="estado-compuesto-caso-mínimo-6"/>
-      <w:bookmarkStart w:id="35" w:name="_Toc243205909"/>
+      <w:bookmarkStart w:id="35" w:name="_Toc243396761"/>
       <w:bookmarkEnd w:id="32"/>
       <w:r>
         <w:t>4.3. Estado compuesto (caso mínimo 6)</w:t>
@@ -8523,7 +8523,7 @@
         <w:pStyle w:val="Ttulo1"/>
       </w:pPr>
       <w:bookmarkStart w:id="36" w:name="reglas-del-juego"/>
-      <w:bookmarkStart w:id="37" w:name="_Toc243205910"/>
+      <w:bookmarkStart w:id="37" w:name="_Toc243396762"/>
       <w:bookmarkEnd w:id="28"/>
       <w:bookmarkEnd w:id="34"/>
       <w:r>
@@ -8536,7 +8536,7 @@
         <w:pStyle w:val="Ttulo2"/>
       </w:pPr>
       <w:bookmarkStart w:id="38" w:name="mecánicas"/>
-      <w:bookmarkStart w:id="39" w:name="_Toc243205911"/>
+      <w:bookmarkStart w:id="39" w:name="_Toc243396763"/>
       <w:r>
         <w:t>5.1. Mecánicas</w:t>
       </w:r>
@@ -8736,7 +8736,7 @@
         <w:pStyle w:val="Ttulo2"/>
       </w:pPr>
       <w:bookmarkStart w:id="40" w:name="reglas-deterministas-de-borde"/>
-      <w:bookmarkStart w:id="41" w:name="_Toc243205912"/>
+      <w:bookmarkStart w:id="41" w:name="_Toc243396764"/>
       <w:bookmarkEnd w:id="38"/>
       <w:r>
         <w:t>5.2. Reglas deterministas de borde</w:t>
@@ -8932,7 +8932,7 @@
         <w:pStyle w:val="Ttulo2"/>
       </w:pPr>
       <w:bookmarkStart w:id="42" w:name="tácticas"/>
-      <w:bookmarkStart w:id="43" w:name="_Toc243205913"/>
+      <w:bookmarkStart w:id="43" w:name="_Toc243396765"/>
       <w:bookmarkEnd w:id="40"/>
       <w:r>
         <w:t>5.3. Tácticas</w:t>
@@ -9060,7 +9060,7 @@
         <w:pStyle w:val="Ttulo1"/>
       </w:pPr>
       <w:bookmarkStart w:id="44" w:name="costos"/>
-      <w:bookmarkStart w:id="45" w:name="_Toc243205914"/>
+      <w:bookmarkStart w:id="45" w:name="_Toc243396766"/>
       <w:bookmarkEnd w:id="36"/>
       <w:bookmarkEnd w:id="42"/>
       <w:r>
@@ -9223,7 +9223,7 @@
         <w:pStyle w:val="Ttulo1"/>
       </w:pPr>
       <w:bookmarkStart w:id="46" w:name="algoritmos-de-búsqueda"/>
-      <w:bookmarkStart w:id="47" w:name="_Toc243205915"/>
+      <w:bookmarkStart w:id="47" w:name="_Toc243396767"/>
       <w:bookmarkEnd w:id="44"/>
       <w:r>
         <w:t>7. Algoritmos de búsqueda</w:t>
@@ -10064,7 +10064,7 @@
         <w:pStyle w:val="Ttulo1"/>
       </w:pPr>
       <w:bookmarkStart w:id="48" w:name="heurísticas"/>
-      <w:bookmarkStart w:id="49" w:name="_Toc243205916"/>
+      <w:bookmarkStart w:id="49" w:name="_Toc243396768"/>
       <w:bookmarkEnd w:id="46"/>
       <w:r>
         <w:t>8. Heurísticas</w:t>
@@ -10076,7 +10076,7 @@
         <w:pStyle w:val="Ttulo2"/>
       </w:pPr>
       <w:bookmarkStart w:id="50" w:name="manhattan-escalada-e6.1"/>
-      <w:bookmarkStart w:id="51" w:name="_Toc243205917"/>
+      <w:bookmarkStart w:id="51" w:name="_Toc243396769"/>
       <w:r>
         <w:t>8.1. Manhattan escalada (E6.1)</w:t>
       </w:r>
@@ -10098,7 +10098,7 @@
         <w:pStyle w:val="Ttulo2"/>
       </w:pPr>
       <w:bookmarkStart w:id="52" w:name="distancia-con-obstáculos-hto-e6.2-propia"/>
-      <w:bookmarkStart w:id="53" w:name="_Toc243205918"/>
+      <w:bookmarkStart w:id="53" w:name="_Toc243396770"/>
       <w:bookmarkEnd w:id="50"/>
       <w:r>
         <w:t>8.2. Distancia con obstáculos, HTO (E6.2, propia)</w:t>
@@ -10163,7 +10163,7 @@
         <w:pStyle w:val="Ttulo2"/>
       </w:pPr>
       <w:bookmarkStart w:id="54" w:name="las-cinco-preguntas-del-enunciado"/>
-      <w:bookmarkStart w:id="55" w:name="_Toc243205919"/>
+      <w:bookmarkStart w:id="55" w:name="_Toc243396771"/>
       <w:bookmarkEnd w:id="52"/>
       <w:r>
         <w:t>8.3. Las cinco preguntas del enunciado</w:t>
@@ -10670,7 +10670,7 @@
         <w:pStyle w:val="Ttulo1"/>
       </w:pPr>
       <w:bookmarkStart w:id="56" w:name="Xc460eedbd2461790e1bf2cbac354ded6450a312"/>
-      <w:bookmarkStart w:id="57" w:name="_Toc243205920"/>
+      <w:bookmarkStart w:id="57" w:name="_Toc243396772"/>
       <w:bookmarkEnd w:id="48"/>
       <w:bookmarkEnd w:id="54"/>
       <w:r>
@@ -10683,7 +10683,7 @@
         <w:pStyle w:val="Ttulo2"/>
       </w:pPr>
       <w:bookmarkStart w:id="58" w:name="max-min-y-suma-cero"/>
-      <w:bookmarkStart w:id="59" w:name="_Toc243205921"/>
+      <w:bookmarkStart w:id="59" w:name="_Toc243396773"/>
       <w:r>
         <w:t>9.1. MAX, MIN y suma cero</w:t>
       </w:r>
@@ -10733,7 +10733,7 @@
         <w:pStyle w:val="Ttulo2"/>
       </w:pPr>
       <w:bookmarkStart w:id="60" w:name="criterios-y-pesos"/>
-      <w:bookmarkStart w:id="61" w:name="_Toc243205922"/>
+      <w:bookmarkStart w:id="61" w:name="_Toc243396774"/>
       <w:bookmarkEnd w:id="58"/>
       <w:r>
         <w:t>9.2. Criterios y pesos</w:t>
@@ -11455,7 +11455,7 @@
         <w:pStyle w:val="Ttulo2"/>
       </w:pPr>
       <w:bookmarkStart w:id="62" w:name="minimax-con-profundidad-limitada"/>
-      <w:bookmarkStart w:id="63" w:name="_Toc243205923"/>
+      <w:bookmarkStart w:id="63" w:name="_Toc243396775"/>
       <w:bookmarkEnd w:id="60"/>
       <w:r>
         <w:t>9.3. Minimax con profundidad limitada</w:t>
@@ -11518,7 +11518,7 @@
         <w:pStyle w:val="Ttulo2"/>
       </w:pPr>
       <w:bookmarkStart w:id="64" w:name="poda-alfa-beta"/>
-      <w:bookmarkStart w:id="65" w:name="_Toc243205924"/>
+      <w:bookmarkStart w:id="65" w:name="_Toc243396776"/>
       <w:bookmarkEnd w:id="62"/>
       <w:r>
         <w:t>9.4. Poda alfa-beta</w:t>
@@ -11564,7 +11564,7 @@
         <w:pStyle w:val="Ttulo2"/>
       </w:pPr>
       <w:bookmarkStart w:id="66" w:name="orden-de-las-acciones"/>
-      <w:bookmarkStart w:id="67" w:name="_Toc243205925"/>
+      <w:bookmarkStart w:id="67" w:name="_Toc243396777"/>
       <w:bookmarkEnd w:id="64"/>
       <w:r>
         <w:t>9.5. Orden de las acciones</w:t>
@@ -11708,7 +11708,7 @@
         <w:pStyle w:val="Ttulo1"/>
       </w:pPr>
       <w:bookmarkStart w:id="68" w:name="escenarios-validación-y-verificación"/>
-      <w:bookmarkStart w:id="69" w:name="_Toc243205926"/>
+      <w:bookmarkStart w:id="69" w:name="_Toc243396778"/>
       <w:bookmarkEnd w:id="56"/>
       <w:bookmarkEnd w:id="66"/>
       <w:r>
@@ -11721,7 +11721,7 @@
         <w:pStyle w:val="Ttulo2"/>
       </w:pPr>
       <w:bookmarkStart w:id="70" w:name="formato-json-común"/>
-      <w:bookmarkStart w:id="71" w:name="_Toc243205927"/>
+      <w:bookmarkStart w:id="71" w:name="_Toc243396779"/>
       <w:r>
         <w:t>10.1. Formato JSON común</w:t>
       </w:r>
@@ -12073,7 +12073,7 @@
         <w:pStyle w:val="Ttulo2"/>
       </w:pPr>
       <w:bookmarkStart w:id="72" w:name="validación-atómica"/>
-      <w:bookmarkStart w:id="73" w:name="_Toc243205928"/>
+      <w:bookmarkStart w:id="73" w:name="_Toc243396780"/>
       <w:bookmarkEnd w:id="70"/>
       <w:r>
         <w:t>10.2. Validación atómica</w:t>
@@ -12243,7 +12243,7 @@
         <w:pStyle w:val="Ttulo2"/>
       </w:pPr>
       <w:bookmarkStart w:id="74" w:name="modos-de-prueba"/>
-      <w:bookmarkStart w:id="75" w:name="_Toc243205929"/>
+      <w:bookmarkStart w:id="75" w:name="_Toc243396781"/>
       <w:bookmarkEnd w:id="72"/>
       <w:r>
         <w:t>10.3. Modos de prueba</w:t>
@@ -12558,7 +12558,7 @@
         <w:pStyle w:val="Ttulo2"/>
       </w:pPr>
       <w:bookmarkStart w:id="76" w:name="verificador-de-soluciones"/>
-      <w:bookmarkStart w:id="77" w:name="_Toc243205930"/>
+      <w:bookmarkStart w:id="77" w:name="_Toc243396782"/>
       <w:bookmarkEnd w:id="74"/>
       <w:r>
         <w:t>10.4. Verificador de soluciones</w:t>
@@ -12738,7 +12738,7 @@
         <w:pStyle w:val="Ttulo1"/>
       </w:pPr>
       <w:bookmarkStart w:id="78" w:name="metodología-experimental"/>
-      <w:bookmarkStart w:id="79" w:name="_Toc243205931"/>
+      <w:bookmarkStart w:id="79" w:name="_Toc243396783"/>
       <w:bookmarkEnd w:id="68"/>
       <w:bookmarkEnd w:id="76"/>
       <w:r>
@@ -12968,7 +12968,7 @@
         <w:pStyle w:val="Ttulo1"/>
       </w:pPr>
       <w:bookmarkStart w:id="80" w:name="resultados"/>
-      <w:bookmarkStart w:id="81" w:name="_Toc243205932"/>
+      <w:bookmarkStart w:id="81" w:name="_Toc243396784"/>
       <w:bookmarkEnd w:id="78"/>
       <w:r>
         <w:t>12. Resultados</w:t>
@@ -12980,7 +12980,7 @@
         <w:pStyle w:val="Ttulo2"/>
       </w:pPr>
       <w:bookmarkStart w:id="82" w:name="casos-mínimos"/>
-      <w:bookmarkStart w:id="83" w:name="_Toc243205933"/>
+      <w:bookmarkStart w:id="83" w:name="_Toc243396785"/>
       <w:r>
         <w:t>12.1. Casos mínimos</w:t>
       </w:r>
@@ -14008,7 +14008,7 @@
         <w:pStyle w:val="Ttulo2"/>
       </w:pPr>
       <w:bookmarkStart w:id="84" w:name="búsquedas-por-escenario"/>
-      <w:bookmarkStart w:id="85" w:name="_Toc243205934"/>
+      <w:bookmarkStart w:id="85" w:name="_Toc243396786"/>
       <w:bookmarkEnd w:id="82"/>
       <w:r>
         <w:t>12.2. Búsquedas por escenario</w:t>
@@ -14768,7 +14768,7 @@
         <w:pStyle w:val="Ttulo2"/>
       </w:pPr>
       <w:bookmarkStart w:id="86" w:name="beam-search-efecto-de-k"/>
-      <w:bookmarkStart w:id="87" w:name="_Toc243205935"/>
+      <w:bookmarkStart w:id="87" w:name="_Toc243396787"/>
       <w:bookmarkEnd w:id="84"/>
       <w:r>
         <w:t>12.3. Beam Search: efecto de k</w:t>
@@ -15538,7 +15538,7 @@
         <w:pStyle w:val="Ttulo2"/>
       </w:pPr>
       <w:bookmarkStart w:id="88" w:name="minimax-y-alfa-beta"/>
-      <w:bookmarkStart w:id="89" w:name="_Toc243205936"/>
+      <w:bookmarkStart w:id="89" w:name="_Toc243396788"/>
       <w:bookmarkEnd w:id="86"/>
       <w:r>
         <w:t>12.4. Minimax y alfa-beta</w:t>
@@ -16637,7 +16637,7 @@
         <w:pStyle w:val="Ttulo2"/>
       </w:pPr>
       <w:bookmarkStart w:id="90" w:name="partidas-completas"/>
-      <w:bookmarkStart w:id="91" w:name="_Toc243205937"/>
+      <w:bookmarkStart w:id="91" w:name="_Toc243396789"/>
       <w:bookmarkEnd w:id="88"/>
       <w:r>
         <w:t>12.5. Partidas completas</w:t>
@@ -16774,7 +16774,7 @@
         <w:pStyle w:val="Ttulo2"/>
       </w:pPr>
       <w:bookmarkStart w:id="92" w:name="X4839b1143085a05863a2c719a5bbcbfc4cc6515"/>
-      <w:bookmarkStart w:id="93" w:name="_Toc243205938"/>
+      <w:bookmarkStart w:id="93" w:name="_Toc243396790"/>
       <w:bookmarkEnd w:id="90"/>
       <w:r>
         <w:t>12.6. Prueba de adaptación: pantano de costo 7 a 15</w:t>
@@ -17252,7 +17252,7 @@
         <w:pStyle w:val="Ttulo1"/>
       </w:pPr>
       <w:bookmarkStart w:id="94" w:name="análisis-de-complejidad"/>
-      <w:bookmarkStart w:id="95" w:name="_Toc243205939"/>
+      <w:bookmarkStart w:id="95" w:name="_Toc243396791"/>
       <w:bookmarkEnd w:id="80"/>
       <w:bookmarkEnd w:id="92"/>
       <w:r>
@@ -18454,7 +18454,7 @@
         <w:pStyle w:val="Ttulo1"/>
       </w:pPr>
       <w:bookmarkStart w:id="96" w:name="pruebas-y-control-de-calidad"/>
-      <w:bookmarkStart w:id="97" w:name="_Toc243205940"/>
+      <w:bookmarkStart w:id="97" w:name="_Toc243396792"/>
       <w:bookmarkEnd w:id="94"/>
       <w:r>
         <w:t>14. Pruebas y control de calidad</w:t>
@@ -18466,7 +18466,7 @@
         <w:pStyle w:val="Ttulo2"/>
       </w:pPr>
       <w:bookmarkStart w:id="98" w:name="pruebas-automatizadas"/>
-      <w:bookmarkStart w:id="99" w:name="_Toc243205941"/>
+      <w:bookmarkStart w:id="99" w:name="_Toc243396793"/>
       <w:r>
         <w:t>14.1. Pruebas automatizadas</w:t>
       </w:r>
@@ -18483,7 +18483,7 @@
         <w:t>python -m pytest</w:t>
       </w:r>
       <w:r>
-        <w:t xml:space="preserve"> ejecuta 910 pruebas. Son independientes de Pygame, salvo las de la interfaz, que usan el controlador de video </w:t>
+        <w:t xml:space="preserve"> ejecuta 914 pruebas. Son independientes de Pygame, salvo las de la interfaz, que usan el controlador de video </w:t>
       </w:r>
       <w:r>
         <w:rPr>
@@ -18691,7 +18691,7 @@
               <w:rPr>
                 <w:sz w:val="17"/>
               </w:rPr>
-              <w:t>174</w:t>
+              <w:t>178</w:t>
             </w:r>
           </w:p>
         </w:tc>
@@ -19078,7 +19078,7 @@
         <w:pStyle w:val="Ttulo2"/>
       </w:pPr>
       <w:bookmarkStart w:id="100" w:name="verificación-en-tiempo-de-ejecución"/>
-      <w:bookmarkStart w:id="101" w:name="_Toc243205942"/>
+      <w:bookmarkStart w:id="101" w:name="_Toc243396794"/>
       <w:bookmarkEnd w:id="98"/>
       <w:r>
         <w:t>14.2. Verificación en tiempo de ejecución</w:t>
@@ -19104,7 +19104,7 @@
         <w:pStyle w:val="Ttulo2"/>
       </w:pPr>
       <w:bookmarkStart w:id="102" w:name="documentación-de-métodos"/>
-      <w:bookmarkStart w:id="103" w:name="_Toc243205943"/>
+      <w:bookmarkStart w:id="103" w:name="_Toc243396795"/>
       <w:bookmarkEnd w:id="100"/>
       <w:r>
         <w:t>14.3. Documentación de métodos</w:t>
@@ -19162,7 +19162,7 @@
         <w:pStyle w:val="Ttulo1"/>
       </w:pPr>
       <w:bookmarkStart w:id="104" w:name="limitaciones"/>
-      <w:bookmarkStart w:id="105" w:name="_Toc243205944"/>
+      <w:bookmarkStart w:id="105" w:name="_Toc243396796"/>
       <w:bookmarkEnd w:id="96"/>
       <w:bookmarkEnd w:id="102"/>
       <w:r>
@@ -20001,7 +20001,7 @@
         <w:pStyle w:val="Ttulo1"/>
       </w:pPr>
       <w:bookmarkStart w:id="106" w:name="reproducibilidad"/>
-      <w:bookmarkStart w:id="107" w:name="_Toc243205945"/>
+      <w:bookmarkStart w:id="107" w:name="_Toc243396797"/>
       <w:bookmarkEnd w:id="104"/>
       <w:r>
         <w:t>16. Reproducibilidad</w:t>
@@ -20262,7 +20262,7 @@
         <w:pStyle w:val="Ttulo1"/>
       </w:pPr>
       <w:bookmarkStart w:id="108" w:name="reporte-del-uso-de-ia"/>
-      <w:bookmarkStart w:id="109" w:name="_Toc243205946"/>
+      <w:bookmarkStart w:id="109" w:name="_Toc243396798"/>
       <w:bookmarkEnd w:id="106"/>
       <w:r>
         <w:t>17. Reporte del uso de IA</w:t>
@@ -20274,7 +20274,7 @@
         <w:pStyle w:val="Ttulo2"/>
       </w:pPr>
       <w:bookmarkStart w:id="110" w:name="declaración"/>
-      <w:bookmarkStart w:id="111" w:name="_Toc243205947"/>
+      <w:bookmarkStart w:id="111" w:name="_Toc243396799"/>
       <w:r>
         <w:t>17.1. Declaración</w:t>
       </w:r>
@@ -20366,7 +20366,7 @@
         <w:pStyle w:val="Ttulo2"/>
       </w:pPr>
       <w:bookmarkStart w:id="112" w:name="tipo-de-intervención"/>
-      <w:bookmarkStart w:id="113" w:name="_Toc243205948"/>
+      <w:bookmarkStart w:id="113" w:name="_Toc243396800"/>
       <w:bookmarkEnd w:id="110"/>
       <w:r>
         <w:t>17.2. Tipo de intervención</w:t>
@@ -20473,7 +20473,7 @@
         <w:pStyle w:val="Ttulo2"/>
       </w:pPr>
       <w:bookmarkStart w:id="114" w:name="cómo-se-validó-el-aporte"/>
-      <w:bookmarkStart w:id="115" w:name="_Toc243205949"/>
+      <w:bookmarkStart w:id="115" w:name="_Toc243396801"/>
       <w:bookmarkEnd w:id="112"/>
       <w:r>
         <w:t>17.3. Cómo se validó el aporte</w:t>
@@ -20524,7 +20524,7 @@
         <w:t>Pruebas automatizadas.</w:t>
       </w:r>
       <w:r>
-        <w:t xml:space="preserve"> Ningún aporte se aceptó sin pruebas. En esta versión pasan 910.</w:t>
+        <w:t xml:space="preserve"> Ningún aporte se aceptó sin pruebas. En esta versión pasan 914.</w:t>
       </w:r>
     </w:p>
     <w:p>
@@ -20589,7 +20589,7 @@
         <w:pStyle w:val="Ttulo2"/>
       </w:pPr>
       <w:bookmarkStart w:id="116" w:name="responsabilidad"/>
-      <w:bookmarkStart w:id="117" w:name="_Toc243205950"/>
+      <w:bookmarkStart w:id="117" w:name="_Toc243396802"/>
       <w:bookmarkEnd w:id="114"/>
       <w:r>
         <w:t>17.4. Responsabilidad</w:t>
@@ -20617,7 +20617,7 @@
         <w:pStyle w:val="Ttulo2"/>
       </w:pPr>
       <w:bookmarkStart w:id="118" w:name="uso-de-ia-en-este-documento"/>
-      <w:bookmarkStart w:id="119" w:name="_Toc243205951"/>
+      <w:bookmarkStart w:id="119" w:name="_Toc243396803"/>
       <w:bookmarkEnd w:id="116"/>
       <w:r>
         <w:t>17.5. Uso de IA en este documento</w:t>
@@ -20706,7 +20706,7 @@
         <w:pStyle w:val="Ttulo1"/>
       </w:pPr>
       <w:bookmarkStart w:id="120" w:name="anexo-a.-glosario"/>
-      <w:bookmarkStart w:id="121" w:name="_Toc243205952"/>
+      <w:bookmarkStart w:id="121" w:name="_Toc243396804"/>
       <w:bookmarkEnd w:id="108"/>
       <w:bookmarkEnd w:id="118"/>
       <w:r>
@@ -20861,7 +20861,7 @@
         <w:pStyle w:val="Ttulo1"/>
       </w:pPr>
       <w:bookmarkStart w:id="122" w:name="anexo-b.-escenarios-del-repositorio"/>
-      <w:bookmarkStart w:id="123" w:name="_Toc243205953"/>
+      <w:bookmarkStart w:id="123" w:name="_Toc243396805"/>
       <w:bookmarkEnd w:id="120"/>
       <w:r>
         <w:t>Anexo B. Escenarios del repositorio</w:t>

</xml_diff>

<commit_message>
docs: documenta la apertura de escenarios JSON desde la interfaz
El manual agrega la seccion 3.10 con capturas reales del selector y del escenario cargado, y actualiza las capturas de la interfaz; el documento tecnico, el README y el detalle de la interfaz describen la funcion y reportan 930 pruebas.
</commit_message>
<xml_diff>
--- a/docs/entregables/documento-tecnico.docx
+++ b/docs/entregables/documento-tecnico.docx
@@ -104,7 +104,7 @@
           <w:r>
             <w:fldChar w:fldCharType="separate"/>
           </w:r>
-          <w:hyperlink w:anchor="_Toc243396744" w:history="1">
+          <w:hyperlink w:anchor="_Toc243402611" w:history="1">
             <w:r>
               <w:rPr>
                 <w:rStyle w:val="Hipervnculo"/>
@@ -131,7 +131,7 @@
                 <w:noProof/>
                 <w:webHidden/>
               </w:rPr>
-              <w:instrText xml:space="preserve"> PAGEREF _Toc243396744 \h </w:instrText>
+              <w:instrText xml:space="preserve"> PAGEREF _Toc243402611 \h </w:instrText>
             </w:r>
             <w:r>
               <w:rPr>
@@ -178,7 +178,7 @@
               <w14:ligatures w14:val="standardContextual"/>
             </w:rPr>
           </w:pPr>
-          <w:hyperlink w:anchor="_Toc243396745" w:history="1">
+          <w:hyperlink w:anchor="_Toc243402612" w:history="1">
             <w:r>
               <w:rPr>
                 <w:rStyle w:val="Hipervnculo"/>
@@ -205,7 +205,7 @@
                 <w:noProof/>
                 <w:webHidden/>
               </w:rPr>
-              <w:instrText xml:space="preserve"> PAGEREF _Toc243396745 \h </w:instrText>
+              <w:instrText xml:space="preserve"> PAGEREF _Toc243402612 \h </w:instrText>
             </w:r>
             <w:r>
               <w:rPr>
@@ -252,7 +252,7 @@
               <w14:ligatures w14:val="standardContextual"/>
             </w:rPr>
           </w:pPr>
-          <w:hyperlink w:anchor="_Toc243396746" w:history="1">
+          <w:hyperlink w:anchor="_Toc243402613" w:history="1">
             <w:r>
               <w:rPr>
                 <w:rStyle w:val="Hipervnculo"/>
@@ -279,7 +279,7 @@
                 <w:noProof/>
                 <w:webHidden/>
               </w:rPr>
-              <w:instrText xml:space="preserve"> PAGEREF _Toc243396746 \h </w:instrText>
+              <w:instrText xml:space="preserve"> PAGEREF _Toc243402613 \h </w:instrText>
             </w:r>
             <w:r>
               <w:rPr>
@@ -326,7 +326,7 @@
               <w14:ligatures w14:val="standardContextual"/>
             </w:rPr>
           </w:pPr>
-          <w:hyperlink w:anchor="_Toc243396747" w:history="1">
+          <w:hyperlink w:anchor="_Toc243402614" w:history="1">
             <w:r>
               <w:rPr>
                 <w:rStyle w:val="Hipervnculo"/>
@@ -353,7 +353,7 @@
                 <w:noProof/>
                 <w:webHidden/>
               </w:rPr>
-              <w:instrText xml:space="preserve"> PAGEREF _Toc243396747 \h </w:instrText>
+              <w:instrText xml:space="preserve"> PAGEREF _Toc243402614 \h </w:instrText>
             </w:r>
             <w:r>
               <w:rPr>
@@ -400,7 +400,7 @@
               <w14:ligatures w14:val="standardContextual"/>
             </w:rPr>
           </w:pPr>
-          <w:hyperlink w:anchor="_Toc243396748" w:history="1">
+          <w:hyperlink w:anchor="_Toc243402615" w:history="1">
             <w:r>
               <w:rPr>
                 <w:rStyle w:val="Hipervnculo"/>
@@ -427,7 +427,7 @@
                 <w:noProof/>
                 <w:webHidden/>
               </w:rPr>
-              <w:instrText xml:space="preserve"> PAGEREF _Toc243396748 \h </w:instrText>
+              <w:instrText xml:space="preserve"> PAGEREF _Toc243402615 \h </w:instrText>
             </w:r>
             <w:r>
               <w:rPr>
@@ -474,7 +474,7 @@
               <w14:ligatures w14:val="standardContextual"/>
             </w:rPr>
           </w:pPr>
-          <w:hyperlink w:anchor="_Toc243396749" w:history="1">
+          <w:hyperlink w:anchor="_Toc243402616" w:history="1">
             <w:r>
               <w:rPr>
                 <w:rStyle w:val="Hipervnculo"/>
@@ -501,7 +501,7 @@
                 <w:noProof/>
                 <w:webHidden/>
               </w:rPr>
-              <w:instrText xml:space="preserve"> PAGEREF _Toc243396749 \h </w:instrText>
+              <w:instrText xml:space="preserve"> PAGEREF _Toc243402616 \h </w:instrText>
             </w:r>
             <w:r>
               <w:rPr>
@@ -548,7 +548,7 @@
               <w14:ligatures w14:val="standardContextual"/>
             </w:rPr>
           </w:pPr>
-          <w:hyperlink w:anchor="_Toc243396750" w:history="1">
+          <w:hyperlink w:anchor="_Toc243402617" w:history="1">
             <w:r>
               <w:rPr>
                 <w:rStyle w:val="Hipervnculo"/>
@@ -575,7 +575,7 @@
                 <w:noProof/>
                 <w:webHidden/>
               </w:rPr>
-              <w:instrText xml:space="preserve"> PAGEREF _Toc243396750 \h </w:instrText>
+              <w:instrText xml:space="preserve"> PAGEREF _Toc243402617 \h </w:instrText>
             </w:r>
             <w:r>
               <w:rPr>
@@ -622,7 +622,7 @@
               <w14:ligatures w14:val="standardContextual"/>
             </w:rPr>
           </w:pPr>
-          <w:hyperlink w:anchor="_Toc243396751" w:history="1">
+          <w:hyperlink w:anchor="_Toc243402618" w:history="1">
             <w:r>
               <w:rPr>
                 <w:rStyle w:val="Hipervnculo"/>
@@ -649,7 +649,7 @@
                 <w:noProof/>
                 <w:webHidden/>
               </w:rPr>
-              <w:instrText xml:space="preserve"> PAGEREF _Toc243396751 \h </w:instrText>
+              <w:instrText xml:space="preserve"> PAGEREF _Toc243402618 \h </w:instrText>
             </w:r>
             <w:r>
               <w:rPr>
@@ -696,7 +696,7 @@
               <w14:ligatures w14:val="standardContextual"/>
             </w:rPr>
           </w:pPr>
-          <w:hyperlink w:anchor="_Toc243396752" w:history="1">
+          <w:hyperlink w:anchor="_Toc243402619" w:history="1">
             <w:r>
               <w:rPr>
                 <w:rStyle w:val="Hipervnculo"/>
@@ -723,7 +723,7 @@
                 <w:noProof/>
                 <w:webHidden/>
               </w:rPr>
-              <w:instrText xml:space="preserve"> PAGEREF _Toc243396752 \h </w:instrText>
+              <w:instrText xml:space="preserve"> PAGEREF _Toc243402619 \h </w:instrText>
             </w:r>
             <w:r>
               <w:rPr>
@@ -770,7 +770,7 @@
               <w14:ligatures w14:val="standardContextual"/>
             </w:rPr>
           </w:pPr>
-          <w:hyperlink w:anchor="_Toc243396753" w:history="1">
+          <w:hyperlink w:anchor="_Toc243402620" w:history="1">
             <w:r>
               <w:rPr>
                 <w:rStyle w:val="Hipervnculo"/>
@@ -797,7 +797,7 @@
                 <w:noProof/>
                 <w:webHidden/>
               </w:rPr>
-              <w:instrText xml:space="preserve"> PAGEREF _Toc243396753 \h </w:instrText>
+              <w:instrText xml:space="preserve"> PAGEREF _Toc243402620 \h </w:instrText>
             </w:r>
             <w:r>
               <w:rPr>
@@ -844,7 +844,7 @@
               <w14:ligatures w14:val="standardContextual"/>
             </w:rPr>
           </w:pPr>
-          <w:hyperlink w:anchor="_Toc243396754" w:history="1">
+          <w:hyperlink w:anchor="_Toc243402621" w:history="1">
             <w:r>
               <w:rPr>
                 <w:rStyle w:val="Hipervnculo"/>
@@ -871,7 +871,7 @@
                 <w:noProof/>
                 <w:webHidden/>
               </w:rPr>
-              <w:instrText xml:space="preserve"> PAGEREF _Toc243396754 \h </w:instrText>
+              <w:instrText xml:space="preserve"> PAGEREF _Toc243402621 \h </w:instrText>
             </w:r>
             <w:r>
               <w:rPr>
@@ -918,7 +918,7 @@
               <w14:ligatures w14:val="standardContextual"/>
             </w:rPr>
           </w:pPr>
-          <w:hyperlink w:anchor="_Toc243396755" w:history="1">
+          <w:hyperlink w:anchor="_Toc243402622" w:history="1">
             <w:r>
               <w:rPr>
                 <w:rStyle w:val="Hipervnculo"/>
@@ -945,7 +945,7 @@
                 <w:noProof/>
                 <w:webHidden/>
               </w:rPr>
-              <w:instrText xml:space="preserve"> PAGEREF _Toc243396755 \h </w:instrText>
+              <w:instrText xml:space="preserve"> PAGEREF _Toc243402622 \h </w:instrText>
             </w:r>
             <w:r>
               <w:rPr>
@@ -992,7 +992,7 @@
               <w14:ligatures w14:val="standardContextual"/>
             </w:rPr>
           </w:pPr>
-          <w:hyperlink w:anchor="_Toc243396756" w:history="1">
+          <w:hyperlink w:anchor="_Toc243402623" w:history="1">
             <w:r>
               <w:rPr>
                 <w:rStyle w:val="Hipervnculo"/>
@@ -1019,7 +1019,7 @@
                 <w:noProof/>
                 <w:webHidden/>
               </w:rPr>
-              <w:instrText xml:space="preserve"> PAGEREF _Toc243396756 \h </w:instrText>
+              <w:instrText xml:space="preserve"> PAGEREF _Toc243402623 \h </w:instrText>
             </w:r>
             <w:r>
               <w:rPr>
@@ -1066,7 +1066,7 @@
               <w14:ligatures w14:val="standardContextual"/>
             </w:rPr>
           </w:pPr>
-          <w:hyperlink w:anchor="_Toc243396757" w:history="1">
+          <w:hyperlink w:anchor="_Toc243402624" w:history="1">
             <w:r>
               <w:rPr>
                 <w:rStyle w:val="Hipervnculo"/>
@@ -1093,7 +1093,7 @@
                 <w:noProof/>
                 <w:webHidden/>
               </w:rPr>
-              <w:instrText xml:space="preserve"> PAGEREF _Toc243396757 \h </w:instrText>
+              <w:instrText xml:space="preserve"> PAGEREF _Toc243402624 \h </w:instrText>
             </w:r>
             <w:r>
               <w:rPr>
@@ -1140,7 +1140,7 @@
               <w14:ligatures w14:val="standardContextual"/>
             </w:rPr>
           </w:pPr>
-          <w:hyperlink w:anchor="_Toc243396758" w:history="1">
+          <w:hyperlink w:anchor="_Toc243402625" w:history="1">
             <w:r>
               <w:rPr>
                 <w:rStyle w:val="Hipervnculo"/>
@@ -1167,7 +1167,7 @@
                 <w:noProof/>
                 <w:webHidden/>
               </w:rPr>
-              <w:instrText xml:space="preserve"> PAGEREF _Toc243396758 \h </w:instrText>
+              <w:instrText xml:space="preserve"> PAGEREF _Toc243402625 \h </w:instrText>
             </w:r>
             <w:r>
               <w:rPr>
@@ -1214,7 +1214,7 @@
               <w14:ligatures w14:val="standardContextual"/>
             </w:rPr>
           </w:pPr>
-          <w:hyperlink w:anchor="_Toc243396759" w:history="1">
+          <w:hyperlink w:anchor="_Toc243402626" w:history="1">
             <w:r>
               <w:rPr>
                 <w:rStyle w:val="Hipervnculo"/>
@@ -1241,7 +1241,7 @@
                 <w:noProof/>
                 <w:webHidden/>
               </w:rPr>
-              <w:instrText xml:space="preserve"> PAGEREF _Toc243396759 \h </w:instrText>
+              <w:instrText xml:space="preserve"> PAGEREF _Toc243402626 \h </w:instrText>
             </w:r>
             <w:r>
               <w:rPr>
@@ -1288,7 +1288,7 @@
               <w14:ligatures w14:val="standardContextual"/>
             </w:rPr>
           </w:pPr>
-          <w:hyperlink w:anchor="_Toc243396760" w:history="1">
+          <w:hyperlink w:anchor="_Toc243402627" w:history="1">
             <w:r>
               <w:rPr>
                 <w:rStyle w:val="Hipervnculo"/>
@@ -1315,7 +1315,7 @@
                 <w:noProof/>
                 <w:webHidden/>
               </w:rPr>
-              <w:instrText xml:space="preserve"> PAGEREF _Toc243396760 \h </w:instrText>
+              <w:instrText xml:space="preserve"> PAGEREF _Toc243402627 \h </w:instrText>
             </w:r>
             <w:r>
               <w:rPr>
@@ -1335,7 +1335,7 @@
                 <w:noProof/>
                 <w:webHidden/>
               </w:rPr>
-              <w:t>9</w:t>
+              <w:t>10</w:t>
             </w:r>
             <w:r>
               <w:rPr>
@@ -1362,7 +1362,7 @@
               <w14:ligatures w14:val="standardContextual"/>
             </w:rPr>
           </w:pPr>
-          <w:hyperlink w:anchor="_Toc243396761" w:history="1">
+          <w:hyperlink w:anchor="_Toc243402628" w:history="1">
             <w:r>
               <w:rPr>
                 <w:rStyle w:val="Hipervnculo"/>
@@ -1389,7 +1389,7 @@
                 <w:noProof/>
                 <w:webHidden/>
               </w:rPr>
-              <w:instrText xml:space="preserve"> PAGEREF _Toc243396761 \h </w:instrText>
+              <w:instrText xml:space="preserve"> PAGEREF _Toc243402628 \h </w:instrText>
             </w:r>
             <w:r>
               <w:rPr>
@@ -1436,7 +1436,7 @@
               <w14:ligatures w14:val="standardContextual"/>
             </w:rPr>
           </w:pPr>
-          <w:hyperlink w:anchor="_Toc243396762" w:history="1">
+          <w:hyperlink w:anchor="_Toc243402629" w:history="1">
             <w:r>
               <w:rPr>
                 <w:rStyle w:val="Hipervnculo"/>
@@ -1463,7 +1463,7 @@
                 <w:noProof/>
                 <w:webHidden/>
               </w:rPr>
-              <w:instrText xml:space="preserve"> PAGEREF _Toc243396762 \h </w:instrText>
+              <w:instrText xml:space="preserve"> PAGEREF _Toc243402629 \h </w:instrText>
             </w:r>
             <w:r>
               <w:rPr>
@@ -1510,7 +1510,7 @@
               <w14:ligatures w14:val="standardContextual"/>
             </w:rPr>
           </w:pPr>
-          <w:hyperlink w:anchor="_Toc243396763" w:history="1">
+          <w:hyperlink w:anchor="_Toc243402630" w:history="1">
             <w:r>
               <w:rPr>
                 <w:rStyle w:val="Hipervnculo"/>
@@ -1537,7 +1537,7 @@
                 <w:noProof/>
                 <w:webHidden/>
               </w:rPr>
-              <w:instrText xml:space="preserve"> PAGEREF _Toc243396763 \h </w:instrText>
+              <w:instrText xml:space="preserve"> PAGEREF _Toc243402630 \h </w:instrText>
             </w:r>
             <w:r>
               <w:rPr>
@@ -1584,7 +1584,7 @@
               <w14:ligatures w14:val="standardContextual"/>
             </w:rPr>
           </w:pPr>
-          <w:hyperlink w:anchor="_Toc243396764" w:history="1">
+          <w:hyperlink w:anchor="_Toc243402631" w:history="1">
             <w:r>
               <w:rPr>
                 <w:rStyle w:val="Hipervnculo"/>
@@ -1611,7 +1611,7 @@
                 <w:noProof/>
                 <w:webHidden/>
               </w:rPr>
-              <w:instrText xml:space="preserve"> PAGEREF _Toc243396764 \h </w:instrText>
+              <w:instrText xml:space="preserve"> PAGEREF _Toc243402631 \h </w:instrText>
             </w:r>
             <w:r>
               <w:rPr>
@@ -1658,7 +1658,7 @@
               <w14:ligatures w14:val="standardContextual"/>
             </w:rPr>
           </w:pPr>
-          <w:hyperlink w:anchor="_Toc243396765" w:history="1">
+          <w:hyperlink w:anchor="_Toc243402632" w:history="1">
             <w:r>
               <w:rPr>
                 <w:rStyle w:val="Hipervnculo"/>
@@ -1685,7 +1685,7 @@
                 <w:noProof/>
                 <w:webHidden/>
               </w:rPr>
-              <w:instrText xml:space="preserve"> PAGEREF _Toc243396765 \h </w:instrText>
+              <w:instrText xml:space="preserve"> PAGEREF _Toc243402632 \h </w:instrText>
             </w:r>
             <w:r>
               <w:rPr>
@@ -1732,7 +1732,7 @@
               <w14:ligatures w14:val="standardContextual"/>
             </w:rPr>
           </w:pPr>
-          <w:hyperlink w:anchor="_Toc243396766" w:history="1">
+          <w:hyperlink w:anchor="_Toc243402633" w:history="1">
             <w:r>
               <w:rPr>
                 <w:rStyle w:val="Hipervnculo"/>
@@ -1759,7 +1759,7 @@
                 <w:noProof/>
                 <w:webHidden/>
               </w:rPr>
-              <w:instrText xml:space="preserve"> PAGEREF _Toc243396766 \h </w:instrText>
+              <w:instrText xml:space="preserve"> PAGEREF _Toc243402633 \h </w:instrText>
             </w:r>
             <w:r>
               <w:rPr>
@@ -1806,7 +1806,7 @@
               <w14:ligatures w14:val="standardContextual"/>
             </w:rPr>
           </w:pPr>
-          <w:hyperlink w:anchor="_Toc243396767" w:history="1">
+          <w:hyperlink w:anchor="_Toc243402634" w:history="1">
             <w:r>
               <w:rPr>
                 <w:rStyle w:val="Hipervnculo"/>
@@ -1833,7 +1833,7 @@
                 <w:noProof/>
                 <w:webHidden/>
               </w:rPr>
-              <w:instrText xml:space="preserve"> PAGEREF _Toc243396767 \h </w:instrText>
+              <w:instrText xml:space="preserve"> PAGEREF _Toc243402634 \h </w:instrText>
             </w:r>
             <w:r>
               <w:rPr>
@@ -1880,7 +1880,7 @@
               <w14:ligatures w14:val="standardContextual"/>
             </w:rPr>
           </w:pPr>
-          <w:hyperlink w:anchor="_Toc243396768" w:history="1">
+          <w:hyperlink w:anchor="_Toc243402635" w:history="1">
             <w:r>
               <w:rPr>
                 <w:rStyle w:val="Hipervnculo"/>
@@ -1907,7 +1907,7 @@
                 <w:noProof/>
                 <w:webHidden/>
               </w:rPr>
-              <w:instrText xml:space="preserve"> PAGEREF _Toc243396768 \h </w:instrText>
+              <w:instrText xml:space="preserve"> PAGEREF _Toc243402635 \h </w:instrText>
             </w:r>
             <w:r>
               <w:rPr>
@@ -1954,7 +1954,7 @@
               <w14:ligatures w14:val="standardContextual"/>
             </w:rPr>
           </w:pPr>
-          <w:hyperlink w:anchor="_Toc243396769" w:history="1">
+          <w:hyperlink w:anchor="_Toc243402636" w:history="1">
             <w:r>
               <w:rPr>
                 <w:rStyle w:val="Hipervnculo"/>
@@ -1981,7 +1981,7 @@
                 <w:noProof/>
                 <w:webHidden/>
               </w:rPr>
-              <w:instrText xml:space="preserve"> PAGEREF _Toc243396769 \h </w:instrText>
+              <w:instrText xml:space="preserve"> PAGEREF _Toc243402636 \h </w:instrText>
             </w:r>
             <w:r>
               <w:rPr>
@@ -2028,7 +2028,7 @@
               <w14:ligatures w14:val="standardContextual"/>
             </w:rPr>
           </w:pPr>
-          <w:hyperlink w:anchor="_Toc243396770" w:history="1">
+          <w:hyperlink w:anchor="_Toc243402637" w:history="1">
             <w:r>
               <w:rPr>
                 <w:rStyle w:val="Hipervnculo"/>
@@ -2055,7 +2055,7 @@
                 <w:noProof/>
                 <w:webHidden/>
               </w:rPr>
-              <w:instrText xml:space="preserve"> PAGEREF _Toc243396770 \h </w:instrText>
+              <w:instrText xml:space="preserve"> PAGEREF _Toc243402637 \h </w:instrText>
             </w:r>
             <w:r>
               <w:rPr>
@@ -2102,7 +2102,7 @@
               <w14:ligatures w14:val="standardContextual"/>
             </w:rPr>
           </w:pPr>
-          <w:hyperlink w:anchor="_Toc243396771" w:history="1">
+          <w:hyperlink w:anchor="_Toc243402638" w:history="1">
             <w:r>
               <w:rPr>
                 <w:rStyle w:val="Hipervnculo"/>
@@ -2129,7 +2129,7 @@
                 <w:noProof/>
                 <w:webHidden/>
               </w:rPr>
-              <w:instrText xml:space="preserve"> PAGEREF _Toc243396771 \h </w:instrText>
+              <w:instrText xml:space="preserve"> PAGEREF _Toc243402638 \h </w:instrText>
             </w:r>
             <w:r>
               <w:rPr>
@@ -2176,7 +2176,7 @@
               <w14:ligatures w14:val="standardContextual"/>
             </w:rPr>
           </w:pPr>
-          <w:hyperlink w:anchor="_Toc243396772" w:history="1">
+          <w:hyperlink w:anchor="_Toc243402639" w:history="1">
             <w:r>
               <w:rPr>
                 <w:rStyle w:val="Hipervnculo"/>
@@ -2203,7 +2203,7 @@
                 <w:noProof/>
                 <w:webHidden/>
               </w:rPr>
-              <w:instrText xml:space="preserve"> PAGEREF _Toc243396772 \h </w:instrText>
+              <w:instrText xml:space="preserve"> PAGEREF _Toc243402639 \h </w:instrText>
             </w:r>
             <w:r>
               <w:rPr>
@@ -2250,7 +2250,7 @@
               <w14:ligatures w14:val="standardContextual"/>
             </w:rPr>
           </w:pPr>
-          <w:hyperlink w:anchor="_Toc243396773" w:history="1">
+          <w:hyperlink w:anchor="_Toc243402640" w:history="1">
             <w:r>
               <w:rPr>
                 <w:rStyle w:val="Hipervnculo"/>
@@ -2277,7 +2277,7 @@
                 <w:noProof/>
                 <w:webHidden/>
               </w:rPr>
-              <w:instrText xml:space="preserve"> PAGEREF _Toc243396773 \h </w:instrText>
+              <w:instrText xml:space="preserve"> PAGEREF _Toc243402640 \h </w:instrText>
             </w:r>
             <w:r>
               <w:rPr>
@@ -2324,7 +2324,7 @@
               <w14:ligatures w14:val="standardContextual"/>
             </w:rPr>
           </w:pPr>
-          <w:hyperlink w:anchor="_Toc243396774" w:history="1">
+          <w:hyperlink w:anchor="_Toc243402641" w:history="1">
             <w:r>
               <w:rPr>
                 <w:rStyle w:val="Hipervnculo"/>
@@ -2351,7 +2351,7 @@
                 <w:noProof/>
                 <w:webHidden/>
               </w:rPr>
-              <w:instrText xml:space="preserve"> PAGEREF _Toc243396774 \h </w:instrText>
+              <w:instrText xml:space="preserve"> PAGEREF _Toc243402641 \h </w:instrText>
             </w:r>
             <w:r>
               <w:rPr>
@@ -2398,7 +2398,7 @@
               <w14:ligatures w14:val="standardContextual"/>
             </w:rPr>
           </w:pPr>
-          <w:hyperlink w:anchor="_Toc243396775" w:history="1">
+          <w:hyperlink w:anchor="_Toc243402642" w:history="1">
             <w:r>
               <w:rPr>
                 <w:rStyle w:val="Hipervnculo"/>
@@ -2425,7 +2425,7 @@
                 <w:noProof/>
                 <w:webHidden/>
               </w:rPr>
-              <w:instrText xml:space="preserve"> PAGEREF _Toc243396775 \h </w:instrText>
+              <w:instrText xml:space="preserve"> PAGEREF _Toc243402642 \h </w:instrText>
             </w:r>
             <w:r>
               <w:rPr>
@@ -2472,7 +2472,7 @@
               <w14:ligatures w14:val="standardContextual"/>
             </w:rPr>
           </w:pPr>
-          <w:hyperlink w:anchor="_Toc243396776" w:history="1">
+          <w:hyperlink w:anchor="_Toc243402643" w:history="1">
             <w:r>
               <w:rPr>
                 <w:rStyle w:val="Hipervnculo"/>
@@ -2499,7 +2499,7 @@
                 <w:noProof/>
                 <w:webHidden/>
               </w:rPr>
-              <w:instrText xml:space="preserve"> PAGEREF _Toc243396776 \h </w:instrText>
+              <w:instrText xml:space="preserve"> PAGEREF _Toc243402643 \h </w:instrText>
             </w:r>
             <w:r>
               <w:rPr>
@@ -2519,7 +2519,7 @@
                 <w:noProof/>
                 <w:webHidden/>
               </w:rPr>
-              <w:t>15</w:t>
+              <w:t>16</w:t>
             </w:r>
             <w:r>
               <w:rPr>
@@ -2546,7 +2546,7 @@
               <w14:ligatures w14:val="standardContextual"/>
             </w:rPr>
           </w:pPr>
-          <w:hyperlink w:anchor="_Toc243396777" w:history="1">
+          <w:hyperlink w:anchor="_Toc243402644" w:history="1">
             <w:r>
               <w:rPr>
                 <w:rStyle w:val="Hipervnculo"/>
@@ -2573,7 +2573,7 @@
                 <w:noProof/>
                 <w:webHidden/>
               </w:rPr>
-              <w:instrText xml:space="preserve"> PAGEREF _Toc243396777 \h </w:instrText>
+              <w:instrText xml:space="preserve"> PAGEREF _Toc243402644 \h </w:instrText>
             </w:r>
             <w:r>
               <w:rPr>
@@ -2620,7 +2620,7 @@
               <w14:ligatures w14:val="standardContextual"/>
             </w:rPr>
           </w:pPr>
-          <w:hyperlink w:anchor="_Toc243396778" w:history="1">
+          <w:hyperlink w:anchor="_Toc243402645" w:history="1">
             <w:r>
               <w:rPr>
                 <w:rStyle w:val="Hipervnculo"/>
@@ -2647,7 +2647,7 @@
                 <w:noProof/>
                 <w:webHidden/>
               </w:rPr>
-              <w:instrText xml:space="preserve"> PAGEREF _Toc243396778 \h </w:instrText>
+              <w:instrText xml:space="preserve"> PAGEREF _Toc243402645 \h </w:instrText>
             </w:r>
             <w:r>
               <w:rPr>
@@ -2694,7 +2694,7 @@
               <w14:ligatures w14:val="standardContextual"/>
             </w:rPr>
           </w:pPr>
-          <w:hyperlink w:anchor="_Toc243396779" w:history="1">
+          <w:hyperlink w:anchor="_Toc243402646" w:history="1">
             <w:r>
               <w:rPr>
                 <w:rStyle w:val="Hipervnculo"/>
@@ -2721,7 +2721,7 @@
                 <w:noProof/>
                 <w:webHidden/>
               </w:rPr>
-              <w:instrText xml:space="preserve"> PAGEREF _Toc243396779 \h </w:instrText>
+              <w:instrText xml:space="preserve"> PAGEREF _Toc243402646 \h </w:instrText>
             </w:r>
             <w:r>
               <w:rPr>
@@ -2768,7 +2768,7 @@
               <w14:ligatures w14:val="standardContextual"/>
             </w:rPr>
           </w:pPr>
-          <w:hyperlink w:anchor="_Toc243396780" w:history="1">
+          <w:hyperlink w:anchor="_Toc243402647" w:history="1">
             <w:r>
               <w:rPr>
                 <w:rStyle w:val="Hipervnculo"/>
@@ -2795,7 +2795,7 @@
                 <w:noProof/>
                 <w:webHidden/>
               </w:rPr>
-              <w:instrText xml:space="preserve"> PAGEREF _Toc243396780 \h </w:instrText>
+              <w:instrText xml:space="preserve"> PAGEREF _Toc243402647 \h </w:instrText>
             </w:r>
             <w:r>
               <w:rPr>
@@ -2815,7 +2815,7 @@
                 <w:noProof/>
                 <w:webHidden/>
               </w:rPr>
-              <w:t>16</w:t>
+              <w:t>17</w:t>
             </w:r>
             <w:r>
               <w:rPr>
@@ -2842,7 +2842,7 @@
               <w14:ligatures w14:val="standardContextual"/>
             </w:rPr>
           </w:pPr>
-          <w:hyperlink w:anchor="_Toc243396781" w:history="1">
+          <w:hyperlink w:anchor="_Toc243402648" w:history="1">
             <w:r>
               <w:rPr>
                 <w:rStyle w:val="Hipervnculo"/>
@@ -2869,7 +2869,7 @@
                 <w:noProof/>
                 <w:webHidden/>
               </w:rPr>
-              <w:instrText xml:space="preserve"> PAGEREF _Toc243396781 \h </w:instrText>
+              <w:instrText xml:space="preserve"> PAGEREF _Toc243402648 \h </w:instrText>
             </w:r>
             <w:r>
               <w:rPr>
@@ -2916,7 +2916,7 @@
               <w14:ligatures w14:val="standardContextual"/>
             </w:rPr>
           </w:pPr>
-          <w:hyperlink w:anchor="_Toc243396782" w:history="1">
+          <w:hyperlink w:anchor="_Toc243402649" w:history="1">
             <w:r>
               <w:rPr>
                 <w:rStyle w:val="Hipervnculo"/>
@@ -2943,7 +2943,7 @@
                 <w:noProof/>
                 <w:webHidden/>
               </w:rPr>
-              <w:instrText xml:space="preserve"> PAGEREF _Toc243396782 \h </w:instrText>
+              <w:instrText xml:space="preserve"> PAGEREF _Toc243402649 \h </w:instrText>
             </w:r>
             <w:r>
               <w:rPr>
@@ -2990,7 +2990,7 @@
               <w14:ligatures w14:val="standardContextual"/>
             </w:rPr>
           </w:pPr>
-          <w:hyperlink w:anchor="_Toc243396783" w:history="1">
+          <w:hyperlink w:anchor="_Toc243402650" w:history="1">
             <w:r>
               <w:rPr>
                 <w:rStyle w:val="Hipervnculo"/>
@@ -3017,7 +3017,7 @@
                 <w:noProof/>
                 <w:webHidden/>
               </w:rPr>
-              <w:instrText xml:space="preserve"> PAGEREF _Toc243396783 \h </w:instrText>
+              <w:instrText xml:space="preserve"> PAGEREF _Toc243402650 \h </w:instrText>
             </w:r>
             <w:r>
               <w:rPr>
@@ -3064,7 +3064,7 @@
               <w14:ligatures w14:val="standardContextual"/>
             </w:rPr>
           </w:pPr>
-          <w:hyperlink w:anchor="_Toc243396784" w:history="1">
+          <w:hyperlink w:anchor="_Toc243402651" w:history="1">
             <w:r>
               <w:rPr>
                 <w:rStyle w:val="Hipervnculo"/>
@@ -3091,7 +3091,7 @@
                 <w:noProof/>
                 <w:webHidden/>
               </w:rPr>
-              <w:instrText xml:space="preserve"> PAGEREF _Toc243396784 \h </w:instrText>
+              <w:instrText xml:space="preserve"> PAGEREF _Toc243402651 \h </w:instrText>
             </w:r>
             <w:r>
               <w:rPr>
@@ -3138,7 +3138,7 @@
               <w14:ligatures w14:val="standardContextual"/>
             </w:rPr>
           </w:pPr>
-          <w:hyperlink w:anchor="_Toc243396785" w:history="1">
+          <w:hyperlink w:anchor="_Toc243402652" w:history="1">
             <w:r>
               <w:rPr>
                 <w:rStyle w:val="Hipervnculo"/>
@@ -3165,7 +3165,7 @@
                 <w:noProof/>
                 <w:webHidden/>
               </w:rPr>
-              <w:instrText xml:space="preserve"> PAGEREF _Toc243396785 \h </w:instrText>
+              <w:instrText xml:space="preserve"> PAGEREF _Toc243402652 \h </w:instrText>
             </w:r>
             <w:r>
               <w:rPr>
@@ -3212,7 +3212,7 @@
               <w14:ligatures w14:val="standardContextual"/>
             </w:rPr>
           </w:pPr>
-          <w:hyperlink w:anchor="_Toc243396786" w:history="1">
+          <w:hyperlink w:anchor="_Toc243402653" w:history="1">
             <w:r>
               <w:rPr>
                 <w:rStyle w:val="Hipervnculo"/>
@@ -3239,7 +3239,7 @@
                 <w:noProof/>
                 <w:webHidden/>
               </w:rPr>
-              <w:instrText xml:space="preserve"> PAGEREF _Toc243396786 \h </w:instrText>
+              <w:instrText xml:space="preserve"> PAGEREF _Toc243402653 \h </w:instrText>
             </w:r>
             <w:r>
               <w:rPr>
@@ -3259,7 +3259,7 @@
                 <w:noProof/>
                 <w:webHidden/>
               </w:rPr>
-              <w:t>19</w:t>
+              <w:t>20</w:t>
             </w:r>
             <w:r>
               <w:rPr>
@@ -3286,7 +3286,7 @@
               <w14:ligatures w14:val="standardContextual"/>
             </w:rPr>
           </w:pPr>
-          <w:hyperlink w:anchor="_Toc243396787" w:history="1">
+          <w:hyperlink w:anchor="_Toc243402654" w:history="1">
             <w:r>
               <w:rPr>
                 <w:rStyle w:val="Hipervnculo"/>
@@ -3313,7 +3313,7 @@
                 <w:noProof/>
                 <w:webHidden/>
               </w:rPr>
-              <w:instrText xml:space="preserve"> PAGEREF _Toc243396787 \h </w:instrText>
+              <w:instrText xml:space="preserve"> PAGEREF _Toc243402654 \h </w:instrText>
             </w:r>
             <w:r>
               <w:rPr>
@@ -3360,7 +3360,7 @@
               <w14:ligatures w14:val="standardContextual"/>
             </w:rPr>
           </w:pPr>
-          <w:hyperlink w:anchor="_Toc243396788" w:history="1">
+          <w:hyperlink w:anchor="_Toc243402655" w:history="1">
             <w:r>
               <w:rPr>
                 <w:rStyle w:val="Hipervnculo"/>
@@ -3387,7 +3387,7 @@
                 <w:noProof/>
                 <w:webHidden/>
               </w:rPr>
-              <w:instrText xml:space="preserve"> PAGEREF _Toc243396788 \h </w:instrText>
+              <w:instrText xml:space="preserve"> PAGEREF _Toc243402655 \h </w:instrText>
             </w:r>
             <w:r>
               <w:rPr>
@@ -3434,7 +3434,7 @@
               <w14:ligatures w14:val="standardContextual"/>
             </w:rPr>
           </w:pPr>
-          <w:hyperlink w:anchor="_Toc243396789" w:history="1">
+          <w:hyperlink w:anchor="_Toc243402656" w:history="1">
             <w:r>
               <w:rPr>
                 <w:rStyle w:val="Hipervnculo"/>
@@ -3461,7 +3461,7 @@
                 <w:noProof/>
                 <w:webHidden/>
               </w:rPr>
-              <w:instrText xml:space="preserve"> PAGEREF _Toc243396789 \h </w:instrText>
+              <w:instrText xml:space="preserve"> PAGEREF _Toc243402656 \h </w:instrText>
             </w:r>
             <w:r>
               <w:rPr>
@@ -3508,7 +3508,7 @@
               <w14:ligatures w14:val="standardContextual"/>
             </w:rPr>
           </w:pPr>
-          <w:hyperlink w:anchor="_Toc243396790" w:history="1">
+          <w:hyperlink w:anchor="_Toc243402657" w:history="1">
             <w:r>
               <w:rPr>
                 <w:rStyle w:val="Hipervnculo"/>
@@ -3535,7 +3535,7 @@
                 <w:noProof/>
                 <w:webHidden/>
               </w:rPr>
-              <w:instrText xml:space="preserve"> PAGEREF _Toc243396790 \h </w:instrText>
+              <w:instrText xml:space="preserve"> PAGEREF _Toc243402657 \h </w:instrText>
             </w:r>
             <w:r>
               <w:rPr>
@@ -3582,7 +3582,7 @@
               <w14:ligatures w14:val="standardContextual"/>
             </w:rPr>
           </w:pPr>
-          <w:hyperlink w:anchor="_Toc243396791" w:history="1">
+          <w:hyperlink w:anchor="_Toc243402658" w:history="1">
             <w:r>
               <w:rPr>
                 <w:rStyle w:val="Hipervnculo"/>
@@ -3609,7 +3609,7 @@
                 <w:noProof/>
                 <w:webHidden/>
               </w:rPr>
-              <w:instrText xml:space="preserve"> PAGEREF _Toc243396791 \h </w:instrText>
+              <w:instrText xml:space="preserve"> PAGEREF _Toc243402658 \h </w:instrText>
             </w:r>
             <w:r>
               <w:rPr>
@@ -3629,7 +3629,7 @@
                 <w:noProof/>
                 <w:webHidden/>
               </w:rPr>
-              <w:t>22</w:t>
+              <w:t>23</w:t>
             </w:r>
             <w:r>
               <w:rPr>
@@ -3656,7 +3656,7 @@
               <w14:ligatures w14:val="standardContextual"/>
             </w:rPr>
           </w:pPr>
-          <w:hyperlink w:anchor="_Toc243396792" w:history="1">
+          <w:hyperlink w:anchor="_Toc243402659" w:history="1">
             <w:r>
               <w:rPr>
                 <w:rStyle w:val="Hipervnculo"/>
@@ -3683,7 +3683,7 @@
                 <w:noProof/>
                 <w:webHidden/>
               </w:rPr>
-              <w:instrText xml:space="preserve"> PAGEREF _Toc243396792 \h </w:instrText>
+              <w:instrText xml:space="preserve"> PAGEREF _Toc243402659 \h </w:instrText>
             </w:r>
             <w:r>
               <w:rPr>
@@ -3730,7 +3730,7 @@
               <w14:ligatures w14:val="standardContextual"/>
             </w:rPr>
           </w:pPr>
-          <w:hyperlink w:anchor="_Toc243396793" w:history="1">
+          <w:hyperlink w:anchor="_Toc243402660" w:history="1">
             <w:r>
               <w:rPr>
                 <w:rStyle w:val="Hipervnculo"/>
@@ -3757,7 +3757,7 @@
                 <w:noProof/>
                 <w:webHidden/>
               </w:rPr>
-              <w:instrText xml:space="preserve"> PAGEREF _Toc243396793 \h </w:instrText>
+              <w:instrText xml:space="preserve"> PAGEREF _Toc243402660 \h </w:instrText>
             </w:r>
             <w:r>
               <w:rPr>
@@ -3804,7 +3804,7 @@
               <w14:ligatures w14:val="standardContextual"/>
             </w:rPr>
           </w:pPr>
-          <w:hyperlink w:anchor="_Toc243396794" w:history="1">
+          <w:hyperlink w:anchor="_Toc243402661" w:history="1">
             <w:r>
               <w:rPr>
                 <w:rStyle w:val="Hipervnculo"/>
@@ -3831,7 +3831,7 @@
                 <w:noProof/>
                 <w:webHidden/>
               </w:rPr>
-              <w:instrText xml:space="preserve"> PAGEREF _Toc243396794 \h </w:instrText>
+              <w:instrText xml:space="preserve"> PAGEREF _Toc243402661 \h </w:instrText>
             </w:r>
             <w:r>
               <w:rPr>
@@ -3851,7 +3851,7 @@
                 <w:noProof/>
                 <w:webHidden/>
               </w:rPr>
-              <w:t>24</w:t>
+              <w:t>25</w:t>
             </w:r>
             <w:r>
               <w:rPr>
@@ -3878,7 +3878,7 @@
               <w14:ligatures w14:val="standardContextual"/>
             </w:rPr>
           </w:pPr>
-          <w:hyperlink w:anchor="_Toc243396795" w:history="1">
+          <w:hyperlink w:anchor="_Toc243402662" w:history="1">
             <w:r>
               <w:rPr>
                 <w:rStyle w:val="Hipervnculo"/>
@@ -3905,7 +3905,7 @@
                 <w:noProof/>
                 <w:webHidden/>
               </w:rPr>
-              <w:instrText xml:space="preserve"> PAGEREF _Toc243396795 \h </w:instrText>
+              <w:instrText xml:space="preserve"> PAGEREF _Toc243402662 \h </w:instrText>
             </w:r>
             <w:r>
               <w:rPr>
@@ -3952,7 +3952,7 @@
               <w14:ligatures w14:val="standardContextual"/>
             </w:rPr>
           </w:pPr>
-          <w:hyperlink w:anchor="_Toc243396796" w:history="1">
+          <w:hyperlink w:anchor="_Toc243402663" w:history="1">
             <w:r>
               <w:rPr>
                 <w:rStyle w:val="Hipervnculo"/>
@@ -3979,7 +3979,7 @@
                 <w:noProof/>
                 <w:webHidden/>
               </w:rPr>
-              <w:instrText xml:space="preserve"> PAGEREF _Toc243396796 \h </w:instrText>
+              <w:instrText xml:space="preserve"> PAGEREF _Toc243402663 \h </w:instrText>
             </w:r>
             <w:r>
               <w:rPr>
@@ -4026,7 +4026,7 @@
               <w14:ligatures w14:val="standardContextual"/>
             </w:rPr>
           </w:pPr>
-          <w:hyperlink w:anchor="_Toc243396797" w:history="1">
+          <w:hyperlink w:anchor="_Toc243402664" w:history="1">
             <w:r>
               <w:rPr>
                 <w:rStyle w:val="Hipervnculo"/>
@@ -4053,7 +4053,7 @@
                 <w:noProof/>
                 <w:webHidden/>
               </w:rPr>
-              <w:instrText xml:space="preserve"> PAGEREF _Toc243396797 \h </w:instrText>
+              <w:instrText xml:space="preserve"> PAGEREF _Toc243402664 \h </w:instrText>
             </w:r>
             <w:r>
               <w:rPr>
@@ -4100,7 +4100,7 @@
               <w14:ligatures w14:val="standardContextual"/>
             </w:rPr>
           </w:pPr>
-          <w:hyperlink w:anchor="_Toc243396798" w:history="1">
+          <w:hyperlink w:anchor="_Toc243402665" w:history="1">
             <w:r>
               <w:rPr>
                 <w:rStyle w:val="Hipervnculo"/>
@@ -4127,7 +4127,7 @@
                 <w:noProof/>
                 <w:webHidden/>
               </w:rPr>
-              <w:instrText xml:space="preserve"> PAGEREF _Toc243396798 \h </w:instrText>
+              <w:instrText xml:space="preserve"> PAGEREF _Toc243402665 \h </w:instrText>
             </w:r>
             <w:r>
               <w:rPr>
@@ -4174,7 +4174,7 @@
               <w14:ligatures w14:val="standardContextual"/>
             </w:rPr>
           </w:pPr>
-          <w:hyperlink w:anchor="_Toc243396799" w:history="1">
+          <w:hyperlink w:anchor="_Toc243402666" w:history="1">
             <w:r>
               <w:rPr>
                 <w:rStyle w:val="Hipervnculo"/>
@@ -4201,7 +4201,7 @@
                 <w:noProof/>
                 <w:webHidden/>
               </w:rPr>
-              <w:instrText xml:space="preserve"> PAGEREF _Toc243396799 \h </w:instrText>
+              <w:instrText xml:space="preserve"> PAGEREF _Toc243402666 \h </w:instrText>
             </w:r>
             <w:r>
               <w:rPr>
@@ -4248,7 +4248,7 @@
               <w14:ligatures w14:val="standardContextual"/>
             </w:rPr>
           </w:pPr>
-          <w:hyperlink w:anchor="_Toc243396800" w:history="1">
+          <w:hyperlink w:anchor="_Toc243402667" w:history="1">
             <w:r>
               <w:rPr>
                 <w:rStyle w:val="Hipervnculo"/>
@@ -4275,7 +4275,7 @@
                 <w:noProof/>
                 <w:webHidden/>
               </w:rPr>
-              <w:instrText xml:space="preserve"> PAGEREF _Toc243396800 \h </w:instrText>
+              <w:instrText xml:space="preserve"> PAGEREF _Toc243402667 \h </w:instrText>
             </w:r>
             <w:r>
               <w:rPr>
@@ -4295,7 +4295,7 @@
                 <w:noProof/>
                 <w:webHidden/>
               </w:rPr>
-              <w:t>27</w:t>
+              <w:t>28</w:t>
             </w:r>
             <w:r>
               <w:rPr>
@@ -4322,7 +4322,7 @@
               <w14:ligatures w14:val="standardContextual"/>
             </w:rPr>
           </w:pPr>
-          <w:hyperlink w:anchor="_Toc243396801" w:history="1">
+          <w:hyperlink w:anchor="_Toc243402668" w:history="1">
             <w:r>
               <w:rPr>
                 <w:rStyle w:val="Hipervnculo"/>
@@ -4349,7 +4349,7 @@
                 <w:noProof/>
                 <w:webHidden/>
               </w:rPr>
-              <w:instrText xml:space="preserve"> PAGEREF _Toc243396801 \h </w:instrText>
+              <w:instrText xml:space="preserve"> PAGEREF _Toc243402668 \h </w:instrText>
             </w:r>
             <w:r>
               <w:rPr>
@@ -4369,7 +4369,7 @@
                 <w:noProof/>
                 <w:webHidden/>
               </w:rPr>
-              <w:t>27</w:t>
+              <w:t>28</w:t>
             </w:r>
             <w:r>
               <w:rPr>
@@ -4396,7 +4396,7 @@
               <w14:ligatures w14:val="standardContextual"/>
             </w:rPr>
           </w:pPr>
-          <w:hyperlink w:anchor="_Toc243396802" w:history="1">
+          <w:hyperlink w:anchor="_Toc243402669" w:history="1">
             <w:r>
               <w:rPr>
                 <w:rStyle w:val="Hipervnculo"/>
@@ -4423,7 +4423,7 @@
                 <w:noProof/>
                 <w:webHidden/>
               </w:rPr>
-              <w:instrText xml:space="preserve"> PAGEREF _Toc243396802 \h </w:instrText>
+              <w:instrText xml:space="preserve"> PAGEREF _Toc243402669 \h </w:instrText>
             </w:r>
             <w:r>
               <w:rPr>
@@ -4470,7 +4470,7 @@
               <w14:ligatures w14:val="standardContextual"/>
             </w:rPr>
           </w:pPr>
-          <w:hyperlink w:anchor="_Toc243396803" w:history="1">
+          <w:hyperlink w:anchor="_Toc243402670" w:history="1">
             <w:r>
               <w:rPr>
                 <w:rStyle w:val="Hipervnculo"/>
@@ -4497,7 +4497,7 @@
                 <w:noProof/>
                 <w:webHidden/>
               </w:rPr>
-              <w:instrText xml:space="preserve"> PAGEREF _Toc243396803 \h </w:instrText>
+              <w:instrText xml:space="preserve"> PAGEREF _Toc243402670 \h </w:instrText>
             </w:r>
             <w:r>
               <w:rPr>
@@ -4544,7 +4544,7 @@
               <w14:ligatures w14:val="standardContextual"/>
             </w:rPr>
           </w:pPr>
-          <w:hyperlink w:anchor="_Toc243396804" w:history="1">
+          <w:hyperlink w:anchor="_Toc243402671" w:history="1">
             <w:r>
               <w:rPr>
                 <w:rStyle w:val="Hipervnculo"/>
@@ -4571,7 +4571,7 @@
                 <w:noProof/>
                 <w:webHidden/>
               </w:rPr>
-              <w:instrText xml:space="preserve"> PAGEREF _Toc243396804 \h </w:instrText>
+              <w:instrText xml:space="preserve"> PAGEREF _Toc243402671 \h </w:instrText>
             </w:r>
             <w:r>
               <w:rPr>
@@ -4591,7 +4591,7 @@
                 <w:noProof/>
                 <w:webHidden/>
               </w:rPr>
-              <w:t>28</w:t>
+              <w:t>29</w:t>
             </w:r>
             <w:r>
               <w:rPr>
@@ -4618,7 +4618,7 @@
               <w14:ligatures w14:val="standardContextual"/>
             </w:rPr>
           </w:pPr>
-          <w:hyperlink w:anchor="_Toc243396805" w:history="1">
+          <w:hyperlink w:anchor="_Toc243402672" w:history="1">
             <w:r>
               <w:rPr>
                 <w:rStyle w:val="Hipervnculo"/>
@@ -4645,7 +4645,7 @@
                 <w:noProof/>
                 <w:webHidden/>
               </w:rPr>
-              <w:instrText xml:space="preserve"> PAGEREF _Toc243396805 \h </w:instrText>
+              <w:instrText xml:space="preserve"> PAGEREF _Toc243402672 \h </w:instrText>
             </w:r>
             <w:r>
               <w:rPr>
@@ -4693,7 +4693,7 @@
         <w:pStyle w:val="Ttulo1"/>
       </w:pPr>
       <w:bookmarkStart w:id="0" w:name="sobre-este-documento"/>
-      <w:bookmarkStart w:id="1" w:name="_Toc243396744"/>
+      <w:bookmarkStart w:id="1" w:name="_Toc243402611"/>
       <w:r>
         <w:t>Sobre este documento</w:t>
       </w:r>
@@ -4944,7 +4944,7 @@
         <w:pStyle w:val="Ttulo1"/>
       </w:pPr>
       <w:bookmarkStart w:id="2" w:name="introducción-y-alcance"/>
-      <w:bookmarkStart w:id="3" w:name="_Toc243396745"/>
+      <w:bookmarkStart w:id="3" w:name="_Toc243402612"/>
       <w:bookmarkEnd w:id="0"/>
       <w:r>
         <w:t>1. Introducción y alcance</w:t>
@@ -4956,7 +4956,7 @@
         <w:pStyle w:val="Ttulo2"/>
       </w:pPr>
       <w:bookmarkStart w:id="4" w:name="pregunta-central"/>
-      <w:bookmarkStart w:id="5" w:name="_Toc243396746"/>
+      <w:bookmarkStart w:id="5" w:name="_Toc243402613"/>
       <w:r>
         <w:t>1.1. Pregunta central</w:t>
       </w:r>
@@ -5066,7 +5066,7 @@
         <w:pStyle w:val="Ttulo2"/>
       </w:pPr>
       <w:bookmarkStart w:id="6" w:name="metas-del-sistema"/>
-      <w:bookmarkStart w:id="7" w:name="_Toc243396747"/>
+      <w:bookmarkStart w:id="7" w:name="_Toc243402614"/>
       <w:bookmarkEnd w:id="4"/>
       <w:r>
         <w:t>1.2. Metas del sistema</w:t>
@@ -5173,7 +5173,7 @@
         <w:pStyle w:val="Ttulo2"/>
       </w:pPr>
       <w:bookmarkStart w:id="8" w:name="alcance"/>
-      <w:bookmarkStart w:id="9" w:name="_Toc243396748"/>
+      <w:bookmarkStart w:id="9" w:name="_Toc243402615"/>
       <w:bookmarkEnd w:id="6"/>
       <w:r>
         <w:t>1.3. Alcance</w:t>
@@ -5242,7 +5242,7 @@
         <w:pStyle w:val="Ttulo2"/>
       </w:pPr>
       <w:bookmarkStart w:id="10" w:name="matriz-de-cumplimiento-del-enunciado"/>
-      <w:bookmarkStart w:id="11" w:name="_Toc243396749"/>
+      <w:bookmarkStart w:id="11" w:name="_Toc243402616"/>
       <w:bookmarkEnd w:id="8"/>
       <w:r>
         <w:t>1.4. Matriz de cumplimiento del enunciado</w:t>
@@ -6306,7 +6306,7 @@
         <w:pStyle w:val="Ttulo1"/>
       </w:pPr>
       <w:bookmarkStart w:id="12" w:name="visión-general-y-arquitectura"/>
-      <w:bookmarkStart w:id="13" w:name="_Toc243396750"/>
+      <w:bookmarkStart w:id="13" w:name="_Toc243402617"/>
       <w:bookmarkEnd w:id="2"/>
       <w:bookmarkEnd w:id="10"/>
       <w:r>
@@ -6319,7 +6319,7 @@
         <w:pStyle w:val="Ttulo2"/>
       </w:pPr>
       <w:bookmarkStart w:id="14" w:name="capas"/>
-      <w:bookmarkStart w:id="15" w:name="_Toc243396751"/>
+      <w:bookmarkStart w:id="15" w:name="_Toc243402618"/>
       <w:r>
         <w:t>2.1. Capas</w:t>
       </w:r>
@@ -6989,7 +6989,7 @@
         <w:pStyle w:val="Ttulo2"/>
       </w:pPr>
       <w:bookmarkStart w:id="16" w:name="flujo-de-datos"/>
-      <w:bookmarkStart w:id="17" w:name="_Toc243396752"/>
+      <w:bookmarkStart w:id="17" w:name="_Toc243402619"/>
       <w:bookmarkEnd w:id="14"/>
       <w:r>
         <w:t>2.2. Flujo de datos</w:t>
@@ -7147,7 +7147,7 @@
         <w:pStyle w:val="Ttulo2"/>
       </w:pPr>
       <w:bookmarkStart w:id="18" w:name="recorrido-del-usuario"/>
-      <w:bookmarkStart w:id="19" w:name="_Toc243396753"/>
+      <w:bookmarkStart w:id="19" w:name="_Toc243402620"/>
       <w:bookmarkEnd w:id="16"/>
       <w:r>
         <w:t>2.3. Recorrido del usuario</w:t>
@@ -7215,7 +7215,16 @@
         <w:t>E</w:t>
       </w:r>
       <w:r>
-        <w:t xml:space="preserve"> muestra u oculta la exploración.</w:t>
+        <w:t xml:space="preserve"> muestra u oculta la exploración. </w:t>
+      </w:r>
+      <w:r>
+        <w:rPr>
+          <w:rStyle w:val="VerbatimChar"/>
+        </w:rPr>
+        <w:t>O</w:t>
+      </w:r>
+      <w:r>
+        <w:t xml:space="preserve"> abre un escenario JSON con el selector de archivos; también se puede soltar el archivo sobre la ventana.</w:t>
       </w:r>
     </w:p>
     <w:p>
@@ -7342,7 +7351,7 @@
         <w:pStyle w:val="Ttulo2"/>
       </w:pPr>
       <w:bookmarkStart w:id="20" w:name="stack-técnico"/>
-      <w:bookmarkStart w:id="21" w:name="_Toc243396754"/>
+      <w:bookmarkStart w:id="21" w:name="_Toc243402621"/>
       <w:bookmarkEnd w:id="18"/>
       <w:r>
         <w:t>2.4. Stack técnico</w:t>
@@ -7498,7 +7507,7 @@
         <w:pStyle w:val="Ttulo1"/>
       </w:pPr>
       <w:bookmarkStart w:id="22" w:name="modelado-del-problema"/>
-      <w:bookmarkStart w:id="23" w:name="_Toc243396755"/>
+      <w:bookmarkStart w:id="23" w:name="_Toc243402622"/>
       <w:bookmarkEnd w:id="12"/>
       <w:bookmarkEnd w:id="20"/>
       <w:r>
@@ -7519,7 +7528,7 @@
         <w:pStyle w:val="Ttulo2"/>
       </w:pPr>
       <w:bookmarkStart w:id="24" w:name="navegación"/>
-      <w:bookmarkStart w:id="25" w:name="_Toc243396756"/>
+      <w:bookmarkStart w:id="25" w:name="_Toc243402623"/>
       <w:r>
         <w:t>3.1. Navegación</w:t>
       </w:r>
@@ -7738,7 +7747,7 @@
         <w:pStyle w:val="Ttulo2"/>
       </w:pPr>
       <w:bookmarkStart w:id="26" w:name="partida-adversarial"/>
-      <w:bookmarkStart w:id="27" w:name="_Toc243396757"/>
+      <w:bookmarkStart w:id="27" w:name="_Toc243402624"/>
       <w:bookmarkEnd w:id="24"/>
       <w:r>
         <w:t>3.2. Partida adversarial</w:t>
@@ -7919,7 +7928,7 @@
         <w:pStyle w:val="Ttulo1"/>
       </w:pPr>
       <w:bookmarkStart w:id="28" w:name="representación-de-estados"/>
-      <w:bookmarkStart w:id="29" w:name="_Toc243396758"/>
+      <w:bookmarkStart w:id="29" w:name="_Toc243402625"/>
       <w:bookmarkEnd w:id="22"/>
       <w:bookmarkEnd w:id="26"/>
       <w:r>
@@ -7932,7 +7941,7 @@
         <w:pStyle w:val="Ttulo2"/>
       </w:pPr>
       <w:bookmarkStart w:id="30" w:name="lo-estático-y-lo-dinámico"/>
-      <w:bookmarkStart w:id="31" w:name="_Toc243396759"/>
+      <w:bookmarkStart w:id="31" w:name="_Toc243402626"/>
       <w:r>
         <w:t>4.1. Lo estático y lo dinámico</w:t>
       </w:r>
@@ -8247,7 +8256,7 @@
         <w:pStyle w:val="Ttulo2"/>
       </w:pPr>
       <w:bookmarkStart w:id="32" w:name="por-qué-la-representación-es-suficiente"/>
-      <w:bookmarkStart w:id="33" w:name="_Toc243396760"/>
+      <w:bookmarkStart w:id="33" w:name="_Toc243402627"/>
       <w:bookmarkEnd w:id="30"/>
       <w:r>
         <w:t>4.2. Por qué la representación es suficiente</w:t>
@@ -8388,7 +8397,7 @@
         <w:pStyle w:val="Ttulo2"/>
       </w:pPr>
       <w:bookmarkStart w:id="34" w:name="estado-compuesto-caso-mínimo-6"/>
-      <w:bookmarkStart w:id="35" w:name="_Toc243396761"/>
+      <w:bookmarkStart w:id="35" w:name="_Toc243402628"/>
       <w:bookmarkEnd w:id="32"/>
       <w:r>
         <w:t>4.3. Estado compuesto (caso mínimo 6)</w:t>
@@ -8523,7 +8532,7 @@
         <w:pStyle w:val="Ttulo1"/>
       </w:pPr>
       <w:bookmarkStart w:id="36" w:name="reglas-del-juego"/>
-      <w:bookmarkStart w:id="37" w:name="_Toc243396762"/>
+      <w:bookmarkStart w:id="37" w:name="_Toc243402629"/>
       <w:bookmarkEnd w:id="28"/>
       <w:bookmarkEnd w:id="34"/>
       <w:r>
@@ -8536,7 +8545,7 @@
         <w:pStyle w:val="Ttulo2"/>
       </w:pPr>
       <w:bookmarkStart w:id="38" w:name="mecánicas"/>
-      <w:bookmarkStart w:id="39" w:name="_Toc243396763"/>
+      <w:bookmarkStart w:id="39" w:name="_Toc243402630"/>
       <w:r>
         <w:t>5.1. Mecánicas</w:t>
       </w:r>
@@ -8736,7 +8745,7 @@
         <w:pStyle w:val="Ttulo2"/>
       </w:pPr>
       <w:bookmarkStart w:id="40" w:name="reglas-deterministas-de-borde"/>
-      <w:bookmarkStart w:id="41" w:name="_Toc243396764"/>
+      <w:bookmarkStart w:id="41" w:name="_Toc243402631"/>
       <w:bookmarkEnd w:id="38"/>
       <w:r>
         <w:t>5.2. Reglas deterministas de borde</w:t>
@@ -8932,7 +8941,7 @@
         <w:pStyle w:val="Ttulo2"/>
       </w:pPr>
       <w:bookmarkStart w:id="42" w:name="tácticas"/>
-      <w:bookmarkStart w:id="43" w:name="_Toc243396765"/>
+      <w:bookmarkStart w:id="43" w:name="_Toc243402632"/>
       <w:bookmarkEnd w:id="40"/>
       <w:r>
         <w:t>5.3. Tácticas</w:t>
@@ -9060,7 +9069,7 @@
         <w:pStyle w:val="Ttulo1"/>
       </w:pPr>
       <w:bookmarkStart w:id="44" w:name="costos"/>
-      <w:bookmarkStart w:id="45" w:name="_Toc243396766"/>
+      <w:bookmarkStart w:id="45" w:name="_Toc243402633"/>
       <w:bookmarkEnd w:id="36"/>
       <w:bookmarkEnd w:id="42"/>
       <w:r>
@@ -9223,7 +9232,7 @@
         <w:pStyle w:val="Ttulo1"/>
       </w:pPr>
       <w:bookmarkStart w:id="46" w:name="algoritmos-de-búsqueda"/>
-      <w:bookmarkStart w:id="47" w:name="_Toc243396767"/>
+      <w:bookmarkStart w:id="47" w:name="_Toc243402634"/>
       <w:bookmarkEnd w:id="44"/>
       <w:r>
         <w:t>7. Algoritmos de búsqueda</w:t>
@@ -10064,7 +10073,7 @@
         <w:pStyle w:val="Ttulo1"/>
       </w:pPr>
       <w:bookmarkStart w:id="48" w:name="heurísticas"/>
-      <w:bookmarkStart w:id="49" w:name="_Toc243396768"/>
+      <w:bookmarkStart w:id="49" w:name="_Toc243402635"/>
       <w:bookmarkEnd w:id="46"/>
       <w:r>
         <w:t>8. Heurísticas</w:t>
@@ -10076,7 +10085,7 @@
         <w:pStyle w:val="Ttulo2"/>
       </w:pPr>
       <w:bookmarkStart w:id="50" w:name="manhattan-escalada-e6.1"/>
-      <w:bookmarkStart w:id="51" w:name="_Toc243396769"/>
+      <w:bookmarkStart w:id="51" w:name="_Toc243402636"/>
       <w:r>
         <w:t>8.1. Manhattan escalada (E6.1)</w:t>
       </w:r>
@@ -10098,7 +10107,7 @@
         <w:pStyle w:val="Ttulo2"/>
       </w:pPr>
       <w:bookmarkStart w:id="52" w:name="distancia-con-obstáculos-hto-e6.2-propia"/>
-      <w:bookmarkStart w:id="53" w:name="_Toc243396770"/>
+      <w:bookmarkStart w:id="53" w:name="_Toc243402637"/>
       <w:bookmarkEnd w:id="50"/>
       <w:r>
         <w:t>8.2. Distancia con obstáculos, HTO (E6.2, propia)</w:t>
@@ -10163,7 +10172,7 @@
         <w:pStyle w:val="Ttulo2"/>
       </w:pPr>
       <w:bookmarkStart w:id="54" w:name="las-cinco-preguntas-del-enunciado"/>
-      <w:bookmarkStart w:id="55" w:name="_Toc243396771"/>
+      <w:bookmarkStart w:id="55" w:name="_Toc243402638"/>
       <w:bookmarkEnd w:id="52"/>
       <w:r>
         <w:t>8.3. Las cinco preguntas del enunciado</w:t>
@@ -10670,7 +10679,7 @@
         <w:pStyle w:val="Ttulo1"/>
       </w:pPr>
       <w:bookmarkStart w:id="56" w:name="Xc460eedbd2461790e1bf2cbac354ded6450a312"/>
-      <w:bookmarkStart w:id="57" w:name="_Toc243396772"/>
+      <w:bookmarkStart w:id="57" w:name="_Toc243402639"/>
       <w:bookmarkEnd w:id="48"/>
       <w:bookmarkEnd w:id="54"/>
       <w:r>
@@ -10683,7 +10692,7 @@
         <w:pStyle w:val="Ttulo2"/>
       </w:pPr>
       <w:bookmarkStart w:id="58" w:name="max-min-y-suma-cero"/>
-      <w:bookmarkStart w:id="59" w:name="_Toc243396773"/>
+      <w:bookmarkStart w:id="59" w:name="_Toc243402640"/>
       <w:r>
         <w:t>9.1. MAX, MIN y suma cero</w:t>
       </w:r>
@@ -10733,7 +10742,7 @@
         <w:pStyle w:val="Ttulo2"/>
       </w:pPr>
       <w:bookmarkStart w:id="60" w:name="criterios-y-pesos"/>
-      <w:bookmarkStart w:id="61" w:name="_Toc243396774"/>
+      <w:bookmarkStart w:id="61" w:name="_Toc243402641"/>
       <w:bookmarkEnd w:id="58"/>
       <w:r>
         <w:t>9.2. Criterios y pesos</w:t>
@@ -11455,7 +11464,7 @@
         <w:pStyle w:val="Ttulo2"/>
       </w:pPr>
       <w:bookmarkStart w:id="62" w:name="minimax-con-profundidad-limitada"/>
-      <w:bookmarkStart w:id="63" w:name="_Toc243396775"/>
+      <w:bookmarkStart w:id="63" w:name="_Toc243402642"/>
       <w:bookmarkEnd w:id="60"/>
       <w:r>
         <w:t>9.3. Minimax con profundidad limitada</w:t>
@@ -11518,7 +11527,7 @@
         <w:pStyle w:val="Ttulo2"/>
       </w:pPr>
       <w:bookmarkStart w:id="64" w:name="poda-alfa-beta"/>
-      <w:bookmarkStart w:id="65" w:name="_Toc243396776"/>
+      <w:bookmarkStart w:id="65" w:name="_Toc243402643"/>
       <w:bookmarkEnd w:id="62"/>
       <w:r>
         <w:t>9.4. Poda alfa-beta</w:t>
@@ -11564,7 +11573,7 @@
         <w:pStyle w:val="Ttulo2"/>
       </w:pPr>
       <w:bookmarkStart w:id="66" w:name="orden-de-las-acciones"/>
-      <w:bookmarkStart w:id="67" w:name="_Toc243396777"/>
+      <w:bookmarkStart w:id="67" w:name="_Toc243402644"/>
       <w:bookmarkEnd w:id="64"/>
       <w:r>
         <w:t>9.5. Orden de las acciones</w:t>
@@ -11708,7 +11717,7 @@
         <w:pStyle w:val="Ttulo1"/>
       </w:pPr>
       <w:bookmarkStart w:id="68" w:name="escenarios-validación-y-verificación"/>
-      <w:bookmarkStart w:id="69" w:name="_Toc243396778"/>
+      <w:bookmarkStart w:id="69" w:name="_Toc243402645"/>
       <w:bookmarkEnd w:id="56"/>
       <w:bookmarkEnd w:id="66"/>
       <w:r>
@@ -11721,7 +11730,7 @@
         <w:pStyle w:val="Ttulo2"/>
       </w:pPr>
       <w:bookmarkStart w:id="70" w:name="formato-json-común"/>
-      <w:bookmarkStart w:id="71" w:name="_Toc243396779"/>
+      <w:bookmarkStart w:id="71" w:name="_Toc243402646"/>
       <w:r>
         <w:t>10.1. Formato JSON común</w:t>
       </w:r>
@@ -12073,7 +12082,7 @@
         <w:pStyle w:val="Ttulo2"/>
       </w:pPr>
       <w:bookmarkStart w:id="72" w:name="validación-atómica"/>
-      <w:bookmarkStart w:id="73" w:name="_Toc243396780"/>
+      <w:bookmarkStart w:id="73" w:name="_Toc243402647"/>
       <w:bookmarkEnd w:id="70"/>
       <w:r>
         <w:t>10.2. Validación atómica</w:t>
@@ -12243,7 +12252,7 @@
         <w:pStyle w:val="Ttulo2"/>
       </w:pPr>
       <w:bookmarkStart w:id="74" w:name="modos-de-prueba"/>
-      <w:bookmarkStart w:id="75" w:name="_Toc243396781"/>
+      <w:bookmarkStart w:id="75" w:name="_Toc243402648"/>
       <w:bookmarkEnd w:id="72"/>
       <w:r>
         <w:t>10.3. Modos de prueba</w:t>
@@ -12558,7 +12567,7 @@
         <w:pStyle w:val="Ttulo2"/>
       </w:pPr>
       <w:bookmarkStart w:id="76" w:name="verificador-de-soluciones"/>
-      <w:bookmarkStart w:id="77" w:name="_Toc243396782"/>
+      <w:bookmarkStart w:id="77" w:name="_Toc243402649"/>
       <w:bookmarkEnd w:id="74"/>
       <w:r>
         <w:t>10.4. Verificador de soluciones</w:t>
@@ -12738,7 +12747,7 @@
         <w:pStyle w:val="Ttulo1"/>
       </w:pPr>
       <w:bookmarkStart w:id="78" w:name="metodología-experimental"/>
-      <w:bookmarkStart w:id="79" w:name="_Toc243396783"/>
+      <w:bookmarkStart w:id="79" w:name="_Toc243402650"/>
       <w:bookmarkEnd w:id="68"/>
       <w:bookmarkEnd w:id="76"/>
       <w:r>
@@ -12968,7 +12977,7 @@
         <w:pStyle w:val="Ttulo1"/>
       </w:pPr>
       <w:bookmarkStart w:id="80" w:name="resultados"/>
-      <w:bookmarkStart w:id="81" w:name="_Toc243396784"/>
+      <w:bookmarkStart w:id="81" w:name="_Toc243402651"/>
       <w:bookmarkEnd w:id="78"/>
       <w:r>
         <w:t>12. Resultados</w:t>
@@ -12980,7 +12989,7 @@
         <w:pStyle w:val="Ttulo2"/>
       </w:pPr>
       <w:bookmarkStart w:id="82" w:name="casos-mínimos"/>
-      <w:bookmarkStart w:id="83" w:name="_Toc243396785"/>
+      <w:bookmarkStart w:id="83" w:name="_Toc243402652"/>
       <w:r>
         <w:t>12.1. Casos mínimos</w:t>
       </w:r>
@@ -14008,7 +14017,7 @@
         <w:pStyle w:val="Ttulo2"/>
       </w:pPr>
       <w:bookmarkStart w:id="84" w:name="búsquedas-por-escenario"/>
-      <w:bookmarkStart w:id="85" w:name="_Toc243396786"/>
+      <w:bookmarkStart w:id="85" w:name="_Toc243402653"/>
       <w:bookmarkEnd w:id="82"/>
       <w:r>
         <w:t>12.2. Búsquedas por escenario</w:t>
@@ -14768,7 +14777,7 @@
         <w:pStyle w:val="Ttulo2"/>
       </w:pPr>
       <w:bookmarkStart w:id="86" w:name="beam-search-efecto-de-k"/>
-      <w:bookmarkStart w:id="87" w:name="_Toc243396787"/>
+      <w:bookmarkStart w:id="87" w:name="_Toc243402654"/>
       <w:bookmarkEnd w:id="84"/>
       <w:r>
         <w:t>12.3. Beam Search: efecto de k</w:t>
@@ -15538,7 +15547,7 @@
         <w:pStyle w:val="Ttulo2"/>
       </w:pPr>
       <w:bookmarkStart w:id="88" w:name="minimax-y-alfa-beta"/>
-      <w:bookmarkStart w:id="89" w:name="_Toc243396788"/>
+      <w:bookmarkStart w:id="89" w:name="_Toc243402655"/>
       <w:bookmarkEnd w:id="86"/>
       <w:r>
         <w:t>12.4. Minimax y alfa-beta</w:t>
@@ -16637,7 +16646,7 @@
         <w:pStyle w:val="Ttulo2"/>
       </w:pPr>
       <w:bookmarkStart w:id="90" w:name="partidas-completas"/>
-      <w:bookmarkStart w:id="91" w:name="_Toc243396789"/>
+      <w:bookmarkStart w:id="91" w:name="_Toc243402656"/>
       <w:bookmarkEnd w:id="88"/>
       <w:r>
         <w:t>12.5. Partidas completas</w:t>
@@ -16774,7 +16783,7 @@
         <w:pStyle w:val="Ttulo2"/>
       </w:pPr>
       <w:bookmarkStart w:id="92" w:name="X4839b1143085a05863a2c719a5bbcbfc4cc6515"/>
-      <w:bookmarkStart w:id="93" w:name="_Toc243396790"/>
+      <w:bookmarkStart w:id="93" w:name="_Toc243402657"/>
       <w:bookmarkEnd w:id="90"/>
       <w:r>
         <w:t>12.6. Prueba de adaptación: pantano de costo 7 a 15</w:t>
@@ -17252,7 +17261,7 @@
         <w:pStyle w:val="Ttulo1"/>
       </w:pPr>
       <w:bookmarkStart w:id="94" w:name="análisis-de-complejidad"/>
-      <w:bookmarkStart w:id="95" w:name="_Toc243396791"/>
+      <w:bookmarkStart w:id="95" w:name="_Toc243402658"/>
       <w:bookmarkEnd w:id="80"/>
       <w:bookmarkEnd w:id="92"/>
       <w:r>
@@ -18454,7 +18463,7 @@
         <w:pStyle w:val="Ttulo1"/>
       </w:pPr>
       <w:bookmarkStart w:id="96" w:name="pruebas-y-control-de-calidad"/>
-      <w:bookmarkStart w:id="97" w:name="_Toc243396792"/>
+      <w:bookmarkStart w:id="97" w:name="_Toc243402659"/>
       <w:bookmarkEnd w:id="94"/>
       <w:r>
         <w:t>14. Pruebas y control de calidad</w:t>
@@ -18466,7 +18475,7 @@
         <w:pStyle w:val="Ttulo2"/>
       </w:pPr>
       <w:bookmarkStart w:id="98" w:name="pruebas-automatizadas"/>
-      <w:bookmarkStart w:id="99" w:name="_Toc243396793"/>
+      <w:bookmarkStart w:id="99" w:name="_Toc243402660"/>
       <w:r>
         <w:t>14.1. Pruebas automatizadas</w:t>
       </w:r>
@@ -18483,7 +18492,7 @@
         <w:t>python -m pytest</w:t>
       </w:r>
       <w:r>
-        <w:t xml:space="preserve"> ejecuta 914 pruebas. Son independientes de Pygame, salvo las de la interfaz, que usan el controlador de video </w:t>
+        <w:t xml:space="preserve"> ejecuta 930 pruebas. Son independientes de Pygame, salvo las de la interfaz, que usan el controlador de video </w:t>
       </w:r>
       <w:r>
         <w:rPr>
@@ -18805,7 +18814,7 @@
               <w:rPr>
                 <w:sz w:val="17"/>
               </w:rPr>
-              <w:t>85</w:t>
+              <w:t>101</w:t>
             </w:r>
           </w:p>
         </w:tc>
@@ -18822,7 +18831,7 @@
               <w:rPr>
                 <w:sz w:val="17"/>
               </w:rPr>
-              <w:t>Render, controles, caminos y capa de exploración.</w:t>
+              <w:t>Render, controles, caminos, capa de exploración y apertura de escenarios JSON.</w:t>
             </w:r>
           </w:p>
         </w:tc>
@@ -19078,7 +19087,7 @@
         <w:pStyle w:val="Ttulo2"/>
       </w:pPr>
       <w:bookmarkStart w:id="100" w:name="verificación-en-tiempo-de-ejecución"/>
-      <w:bookmarkStart w:id="101" w:name="_Toc243396794"/>
+      <w:bookmarkStart w:id="101" w:name="_Toc243402661"/>
       <w:bookmarkEnd w:id="98"/>
       <w:r>
         <w:t>14.2. Verificación en tiempo de ejecución</w:t>
@@ -19104,7 +19113,7 @@
         <w:pStyle w:val="Ttulo2"/>
       </w:pPr>
       <w:bookmarkStart w:id="102" w:name="documentación-de-métodos"/>
-      <w:bookmarkStart w:id="103" w:name="_Toc243396795"/>
+      <w:bookmarkStart w:id="103" w:name="_Toc243402662"/>
       <w:bookmarkEnd w:id="100"/>
       <w:r>
         <w:t>14.3. Documentación de métodos</w:t>
@@ -19162,7 +19171,7 @@
         <w:pStyle w:val="Ttulo1"/>
       </w:pPr>
       <w:bookmarkStart w:id="104" w:name="limitaciones"/>
-      <w:bookmarkStart w:id="105" w:name="_Toc243396796"/>
+      <w:bookmarkStart w:id="105" w:name="_Toc243402663"/>
       <w:bookmarkEnd w:id="96"/>
       <w:bookmarkEnd w:id="102"/>
       <w:r>
@@ -20001,7 +20010,7 @@
         <w:pStyle w:val="Ttulo1"/>
       </w:pPr>
       <w:bookmarkStart w:id="106" w:name="reproducibilidad"/>
-      <w:bookmarkStart w:id="107" w:name="_Toc243396797"/>
+      <w:bookmarkStart w:id="107" w:name="_Toc243402664"/>
       <w:bookmarkEnd w:id="104"/>
       <w:r>
         <w:t>16. Reproducibilidad</w:t>
@@ -20262,7 +20271,7 @@
         <w:pStyle w:val="Ttulo1"/>
       </w:pPr>
       <w:bookmarkStart w:id="108" w:name="reporte-del-uso-de-ia"/>
-      <w:bookmarkStart w:id="109" w:name="_Toc243396798"/>
+      <w:bookmarkStart w:id="109" w:name="_Toc243402665"/>
       <w:bookmarkEnd w:id="106"/>
       <w:r>
         <w:t>17. Reporte del uso de IA</w:t>
@@ -20274,7 +20283,7 @@
         <w:pStyle w:val="Ttulo2"/>
       </w:pPr>
       <w:bookmarkStart w:id="110" w:name="declaración"/>
-      <w:bookmarkStart w:id="111" w:name="_Toc243396799"/>
+      <w:bookmarkStart w:id="111" w:name="_Toc243402666"/>
       <w:r>
         <w:t>17.1. Declaración</w:t>
       </w:r>
@@ -20366,7 +20375,7 @@
         <w:pStyle w:val="Ttulo2"/>
       </w:pPr>
       <w:bookmarkStart w:id="112" w:name="tipo-de-intervención"/>
-      <w:bookmarkStart w:id="113" w:name="_Toc243396800"/>
+      <w:bookmarkStart w:id="113" w:name="_Toc243402667"/>
       <w:bookmarkEnd w:id="110"/>
       <w:r>
         <w:t>17.2. Tipo de intervención</w:t>
@@ -20473,7 +20482,7 @@
         <w:pStyle w:val="Ttulo2"/>
       </w:pPr>
       <w:bookmarkStart w:id="114" w:name="cómo-se-validó-el-aporte"/>
-      <w:bookmarkStart w:id="115" w:name="_Toc243396801"/>
+      <w:bookmarkStart w:id="115" w:name="_Toc243402668"/>
       <w:bookmarkEnd w:id="112"/>
       <w:r>
         <w:t>17.3. Cómo se validó el aporte</w:t>
@@ -20524,7 +20533,7 @@
         <w:t>Pruebas automatizadas.</w:t>
       </w:r>
       <w:r>
-        <w:t xml:space="preserve"> Ningún aporte se aceptó sin pruebas. En esta versión pasan 914.</w:t>
+        <w:t xml:space="preserve"> Ningún aporte se aceptó sin pruebas. En esta versión pasan 930.</w:t>
       </w:r>
     </w:p>
     <w:p>
@@ -20589,7 +20598,7 @@
         <w:pStyle w:val="Ttulo2"/>
       </w:pPr>
       <w:bookmarkStart w:id="116" w:name="responsabilidad"/>
-      <w:bookmarkStart w:id="117" w:name="_Toc243396802"/>
+      <w:bookmarkStart w:id="117" w:name="_Toc243402669"/>
       <w:bookmarkEnd w:id="114"/>
       <w:r>
         <w:t>17.4. Responsabilidad</w:t>
@@ -20617,7 +20626,7 @@
         <w:pStyle w:val="Ttulo2"/>
       </w:pPr>
       <w:bookmarkStart w:id="118" w:name="uso-de-ia-en-este-documento"/>
-      <w:bookmarkStart w:id="119" w:name="_Toc243396803"/>
+      <w:bookmarkStart w:id="119" w:name="_Toc243402670"/>
       <w:bookmarkEnd w:id="116"/>
       <w:r>
         <w:t>17.5. Uso de IA en este documento</w:t>
@@ -20706,7 +20715,7 @@
         <w:pStyle w:val="Ttulo1"/>
       </w:pPr>
       <w:bookmarkStart w:id="120" w:name="anexo-a.-glosario"/>
-      <w:bookmarkStart w:id="121" w:name="_Toc243396804"/>
+      <w:bookmarkStart w:id="121" w:name="_Toc243402671"/>
       <w:bookmarkEnd w:id="108"/>
       <w:bookmarkEnd w:id="118"/>
       <w:r>
@@ -20861,7 +20870,7 @@
         <w:pStyle w:val="Ttulo1"/>
       </w:pPr>
       <w:bookmarkStart w:id="122" w:name="anexo-b.-escenarios-del-repositorio"/>
-      <w:bookmarkStart w:id="123" w:name="_Toc243396805"/>
+      <w:bookmarkStart w:id="123" w:name="_Toc243402672"/>
       <w:bookmarkEnd w:id="120"/>
       <w:r>
         <w:t>Anexo B. Escenarios del repositorio</w:t>
@@ -21476,7 +21485,11 @@
       </w:tr>
       <w:bookmarkEnd w:id="122"/>
     </w:tbl>
-    <w:p/>
+    <w:p>
+      <w:pPr>
+        <w:spacing w:after="0" w:line="20" w:lineRule="exact"/>
+      </w:pPr>
+    </w:p>
     <w:sectPr>
       <w:footerReference w:type="default" r:id="rId21"/>
       <w:footnotePr>

</xml_diff>

<commit_message>
fix de errores generales
</commit_message>
<xml_diff>
--- a/docs/entregables/documento-tecnico.docx
+++ b/docs/entregables/documento-tecnico.docx
@@ -1,6 +1,7 @@
 
 <file path=word/document.xml><?xml version="1.0" encoding="utf-8"?>
 <w:document xmlns:wpc="http://schemas.microsoft.com/office/word/2010/wordprocessingCanvas" xmlns:cx="http://schemas.microsoft.com/office/drawing/2014/chartex" xmlns:cx1="http://schemas.microsoft.com/office/drawing/2015/9/8/chartex" xmlns:cx2="http://schemas.microsoft.com/office/drawing/2015/10/21/chartex" xmlns:cx3="http://schemas.microsoft.com/office/drawing/2016/5/9/chartex" xmlns:cx4="http://schemas.microsoft.com/office/drawing/2016/5/10/chartex" xmlns:cx5="http://schemas.microsoft.com/office/drawing/2016/5/11/chartex" xmlns:cx6="http://schemas.microsoft.com/office/drawing/2016/5/12/chartex" xmlns:cx7="http://schemas.microsoft.com/office/drawing/2016/5/13/chartex" xmlns:cx8="http://schemas.microsoft.com/office/drawing/2016/5/14/chartex" xmlns:mc="http://schemas.openxmlformats.org/markup-compatibility/2006" xmlns:aink="http://schemas.microsoft.com/office/drawing/2016/ink" xmlns:am3d="http://schemas.microsoft.com/office/drawing/2017/model3d" xmlns:o="urn:schemas-microsoft-com:office:office" xmlns:oel="http://schemas.microsoft.com/office/2019/extlst" xmlns:r="http://schemas.openxmlformats.org/officeDocument/2006/relationships" xmlns:m="http://schemas.openxmlformats.org/officeDocument/2006/math" xmlns:v="urn:schemas-microsoft-com:vml" xmlns:wp14="http://schemas.microsoft.com/office/word/2010/wordprocessingDrawing" xmlns:wp="http://schemas.openxmlformats.org/drawingml/2006/wordprocessingDrawing" xmlns:w10="urn:schemas-microsoft-com:office:word" xmlns:w="http://schemas.openxmlformats.org/wordprocessingml/2006/main" xmlns:w14="http://schemas.microsoft.com/office/word/2010/wordml" xmlns:w15="http://schemas.microsoft.com/office/word/2012/wordml" xmlns:w16cex="http://schemas.microsoft.com/office/word/2018/wordml/cex" xmlns:w16cid="http://schemas.microsoft.com/office/word/2016/wordml/cid" xmlns:w16="http://schemas.microsoft.com/office/word/2018/wordml" xmlns:w16du="http://schemas.microsoft.com/office/word/2023/wordml/word16du" xmlns:w16sdtdh="http://schemas.microsoft.com/office/word/2020/wordml/sdtdatahash" xmlns:w16sdtfl="http://schemas.microsoft.com/office/word/2024/wordml/sdtformatlock" xmlns:w16se="http://schemas.microsoft.com/office/word/2015/wordml/symex" xmlns:wpg="http://schemas.microsoft.com/office/word/2010/wordprocessingGroup" xmlns:wpi="http://schemas.microsoft.com/office/word/2010/wordprocessingInk" xmlns:wne="http://schemas.microsoft.com/office/word/2006/wordml" xmlns:wps="http://schemas.microsoft.com/office/word/2010/wordprocessingShape" mc:Ignorable="w14 w15 w16se w16cid w16 w16cex w16sdtdh w16sdtfl w16du wp14">
+  6 w16cex w16sdtdh w16sdtfl w16du wp14"&gt;
   <w:body>
     <w:p>
       <w:pPr>
@@ -31,7 +32,7 @@
         <w:pStyle w:val="Author"/>
       </w:pPr>
       <w:r>
-        <w:t>Ana Suárez</w:t>
+        <w:t>Ana Isabella Suárez Cardona</w:t>
       </w:r>
     </w:p>
     <w:p>
@@ -39,7 +40,7 @@
         <w:pStyle w:val="Author"/>
       </w:pPr>
       <w:r>
-        <w:t>Santiago Silva</w:t>
+        <w:t>Santiago Silva Guarnizo</w:t>
       </w:r>
     </w:p>
     <w:p>
@@ -4743,7 +4744,7 @@
         <w:t>diego-juan3112</w:t>
       </w:r>
       <w:r>
-        <w:t>), Ana Suárez (</w:t>
+        <w:t>), Ana Isabella Suárez Cardona (</w:t>
       </w:r>
       <w:r>
         <w:rPr>
@@ -4752,7 +4753,7 @@
         <w:t>Aisc07</w:t>
       </w:r>
       <w:r>
-        <w:t>) y Santiago Silva (</w:t>
+        <w:t>) y Santiago Silva Guarnizo (</w:t>
       </w:r>
       <w:r>
         <w:rPr>
@@ -4807,19 +4808,19 @@
           <w:b/>
           <w:bCs/>
         </w:rPr>
-        <w:t>Versión descrita:</w:t>
-      </w:r>
-      <w:r>
-        <w:t xml:space="preserve"> rama </w:t>
+        <w:t xml:space="preserve">Versión base: consolidación E11.2 y documentación E11.1; actualización de integración, registro y experimentos al 20 de octubre de 2026.</w:t>
+      </w:r>
+      <w:r>
+        <w:t xml:space="preserve"/>
       </w:r>
       <w:r>
         <w:rPr>
           <w:rStyle w:val="VerbatimChar"/>
         </w:rPr>
-        <w:t>main</w:t>
-      </w:r>
-      <w:r>
-        <w:t xml:space="preserve"> tras integrar E11.2, con la documentación de métodos de E11.1.</w:t>
+        <w:t/>
+      </w:r>
+      <w:r>
+        <w:t xml:space="preserve"/>
       </w:r>
     </w:p>
     <w:p>
@@ -4846,26 +4847,26 @@
         <w:pStyle w:val="FirstParagraph"/>
       </w:pPr>
       <w:r>
-        <w:t xml:space="preserve">El documento sigue la estructura de un </w:t>
+        <w:t xml:space="preserve">El documento sigue la estructura de un informe de diseño técnico y conserva el contenido académico consolidado en la versión 1.0. Esta actualización agrega evidencia posterior de la integración Pygame y de los experimentos actuales; conserva las cifras anteriores identificándolas como históricas cuando difieren.</w:t>
       </w:r>
       <w:r>
         <w:rPr>
           <w:i/>
           <w:iCs/>
         </w:rPr>
-        <w:t>documento de diseño técnico</w:t>
-      </w:r>
-      <w:r>
-        <w:t xml:space="preserve">. Combina tres plantillas: visión general del sistema, diseño de arquitectura, y pruebas y validación. Sobre esa base agrega, en el orden del enunciado, las secciones propias de un sistema inteligente. Su diseño editorial está en </w:t>
+        <w:t/>
+      </w:r>
+      <w:r>
+        <w:t xml:space="preserve"/>
       </w:r>
       <w:r>
         <w:rPr>
           <w:rStyle w:val="VerbatimChar"/>
         </w:rPr>
-        <w:t>DESIGN.md</w:t>
-      </w:r>
-      <w:r>
-        <w:t>.</w:t>
+        <w:t/>
+      </w:r>
+      <w:r>
+        <w:t/>
       </w:r>
     </w:p>
     <w:p>
@@ -4878,54 +4879,54 @@
           <w:bCs/>
           <w:color w:val="1E293B"/>
         </w:rPr>
-        <w:t>Nota:</w:t>
-      </w:r>
-      <w:r>
-        <w:t xml:space="preserve"> Este documento consolida y resume. El detalle de cada historia está en el </w:t>
+        <w:t xml:space="preserve">Nota: Los resultados de la versión 1.0 y los experimentos de continuación tienen escenarios y ejecuciones identificables por separado. El registro actual se conserva en docs/experimentos/resultados-casos-minimos.json; los tiempos son muestras de una ejecución, no cifras de rendimiento estadístico.</w:t>
+      </w:r>
+      <w:r>
+        <w:t xml:space="preserve"/>
       </w:r>
       <w:hyperlink r:id="rId8" w:anchor="documentación">
         <w:r>
           <w:rPr>
             <w:rStyle w:val="Hipervnculo"/>
           </w:rPr>
-          <w:t>índice de la documentación</w:t>
+          <w:t/>
         </w:r>
       </w:hyperlink>
       <w:r>
-        <w:t xml:space="preserve">, en </w:t>
+        <w:t xml:space="preserve"/>
       </w:r>
       <w:hyperlink r:id="rId9">
         <w:r>
           <w:rPr>
             <w:rStyle w:val="Hipervnculo"/>
           </w:rPr>
-          <w:t>E6.2</w:t>
+          <w:t/>
         </w:r>
       </w:hyperlink>
       <w:r>
-        <w:t xml:space="preserve">, en los </w:t>
+        <w:t xml:space="preserve"/>
       </w:r>
       <w:hyperlink r:id="rId10">
         <w:r>
           <w:rPr>
             <w:rStyle w:val="Hipervnculo"/>
           </w:rPr>
-          <w:t>casos mínimos 3 y 4</w:t>
+          <w:t/>
         </w:r>
       </w:hyperlink>
       <w:r>
-        <w:t xml:space="preserve"> y en los </w:t>
+        <w:t xml:space="preserve"/>
       </w:r>
       <w:hyperlink r:id="rId11">
         <w:r>
           <w:rPr>
             <w:rStyle w:val="Hipervnculo"/>
           </w:rPr>
-          <w:t>casos mínimos 6 a 10</w:t>
+          <w:t/>
         </w:r>
       </w:hyperlink>
       <w:r>
-        <w:t>. Todas las cifras, salvo los tiempos, se regeneraron con el código de esta versión y están fijadas en pruebas automatizadas.</w:t>
+        <w:t/>
       </w:r>
     </w:p>
     <w:p>
@@ -7167,64 +7168,64 @@
           <w:b/>
           <w:bCs/>
         </w:rPr>
-        <w:t>Interfaz gráfica:</w:t>
-      </w:r>
-      <w:r>
-        <w:t xml:space="preserve"> </w:t>
+        <w:t xml:space="preserve">Interfaz gráfica: python main.py abre Pygame. La GUI ofrece búsqueda, partida manual y evaluación adversarial; carga JSON con O o arrastrando el archivo, permite verificar con V, exportar con J y reiniciar la partida con R. Q evalúa, C compara y A confirma una recomendación adversarial.</w:t>
+      </w:r>
+      <w:r>
+        <w:t xml:space="preserve"/>
       </w:r>
       <w:r>
         <w:rPr>
           <w:rStyle w:val="VerbatimChar"/>
         </w:rPr>
-        <w:t>python main.py</w:t>
-      </w:r>
-      <w:r>
-        <w:t xml:space="preserve"> abre </w:t>
+        <w:t/>
+      </w:r>
+      <w:r>
+        <w:t xml:space="preserve"/>
       </w:r>
       <w:r>
         <w:rPr>
           <w:rStyle w:val="VerbatimChar"/>
         </w:rPr>
-        <w:t>campo_20x20.json</w:t>
-      </w:r>
-      <w:r>
-        <w:t xml:space="preserve">. Permite cambiar de escenario y elegir algoritmo, unidad, </w:t>
+        <w:t/>
+      </w:r>
+      <w:r>
+        <w:t xml:space="preserve"/>
       </w:r>
       <w:r>
         <w:rPr>
           <w:rStyle w:val="VerbatimChar"/>
         </w:rPr>
-        <w:t>k</w:t>
-      </w:r>
-      <w:r>
-        <w:t xml:space="preserve"> y objetivo (con un clic en una celda). </w:t>
+        <w:t/>
+      </w:r>
+      <w:r>
+        <w:t xml:space="preserve"/>
       </w:r>
       <w:r>
         <w:rPr>
           <w:rStyle w:val="VerbatimChar"/>
         </w:rPr>
-        <w:t>Enter</w:t>
-      </w:r>
-      <w:r>
-        <w:t xml:space="preserve"> ejecuta la búsqueda; </w:t>
+        <w:t/>
+      </w:r>
+      <w:r>
+        <w:t xml:space="preserve"/>
       </w:r>
       <w:r>
         <w:rPr>
           <w:rStyle w:val="VerbatimChar"/>
         </w:rPr>
-        <w:t>E</w:t>
-      </w:r>
-      <w:r>
-        <w:t xml:space="preserve"> muestra u oculta la exploración. </w:t>
+        <w:t/>
+      </w:r>
+      <w:r>
+        <w:t xml:space="preserve"/>
       </w:r>
       <w:r>
         <w:rPr>
           <w:rStyle w:val="VerbatimChar"/>
         </w:rPr>
-        <w:t>O</w:t>
-      </w:r>
-      <w:r>
-        <w:t xml:space="preserve"> abre un escenario JSON con el selector de archivos; también se puede soltar el archivo sobre la ventana.</w:t>
+        <w:t/>
+      </w:r>
+      <w:r>
+        <w:t xml:space="preserve"/>
       </w:r>
     </w:p>
     <w:p>
@@ -12776,37 +12777,37 @@
           <w:b/>
           <w:bCs/>
         </w:rPr>
-        <w:t>Elegir el escenario.</w:t>
-      </w:r>
-      <w:r>
-        <w:t xml:space="preserve"> Hay nueve escenarios propios en </w:t>
+        <w:t xml:space="preserve">Elegir el escenario. El catálogo incluye nueve escenarios didácticos y un fixture de GUI. Dos mapas principales son de 20 × 20; los mapas menores preservan propiedades experimentales concretas. La clasificación y validación está en docs/tecnico/catalogo-escenarios.md.</w:t>
+      </w:r>
+      <w:r>
+        <w:t xml:space="preserve"/>
       </w:r>
       <w:r>
         <w:rPr>
           <w:rStyle w:val="VerbatimChar"/>
         </w:rPr>
-        <w:t>escenarios/</w:t>
-      </w:r>
-      <w:r>
-        <w:t>, cada uno con su propósito. Dos son de 20 × 20 (</w:t>
+        <w:t/>
+      </w:r>
+      <w:r>
+        <w:t/>
       </w:r>
       <w:r>
         <w:rPr>
           <w:rStyle w:val="VerbatimChar"/>
         </w:rPr>
-        <w:t>campo_20x20.json</w:t>
-      </w:r>
-      <w:r>
-        <w:t xml:space="preserve"> y </w:t>
+        <w:t/>
+      </w:r>
+      <w:r>
+        <w:t xml:space="preserve"/>
       </w:r>
       <w:r>
         <w:rPr>
           <w:rStyle w:val="VerbatimChar"/>
         </w:rPr>
-        <w:t>arquitectura_basica.json</w:t>
-      </w:r>
-      <w:r>
-        <w:t>) y cumplen el mínimo del enunciado. Los pequeños permiten verificar a mano cada transición.</w:t>
+        <w:t/>
+      </w:r>
+      <w:r>
+        <w:t/>
       </w:r>
     </w:p>
     <w:p>
@@ -12980,7 +12981,7 @@
       <w:bookmarkStart w:id="81" w:name="_Toc243402651"/>
       <w:bookmarkEnd w:id="78"/>
       <w:r>
-        <w:t>12. Resultados</w:t>
+        <w:t>12. Resultados de versión 1.0 (referencia histórica)</w:t>
       </w:r>
       <w:bookmarkEnd w:id="81"/>
     </w:p>
@@ -18489,20 +18490,20 @@
         <w:rPr>
           <w:rStyle w:val="VerbatimChar"/>
         </w:rPr>
-        <w:t>python -m pytest</w:t>
-      </w:r>
-      <w:r>
-        <w:t xml:space="preserve"> ejecuta 930 pruebas. Son independientes de Pygame, salvo las de la interfaz, que usan el controlador de video </w:t>
+        <w:t xml:space="preserve">El 20 de octubre de 2026, .venv/bin/python -m pytest ejecutó 974 pruebas: todas aprobadas. Las pruebas de interfaz usan SDL dummy y no sustituyen la inspección visual en escritorio.</w:t>
+      </w:r>
+      <w:r>
+        <w:t xml:space="preserve"/>
       </w:r>
       <w:r>
         <w:rPr>
           <w:i/>
           <w:iCs/>
         </w:rPr>
-        <w:t>dummy</w:t>
-      </w:r>
-      <w:r>
-        <w:t>.</w:t>
+        <w:t/>
+      </w:r>
+      <w:r>
+        <w:t/>
       </w:r>
     </w:p>
     <w:tbl>
@@ -20294,14 +20295,14 @@
         <w:pStyle w:val="FirstParagraph"/>
       </w:pPr>
       <w:r>
-        <w:t xml:space="preserve">El equipo usó IA generativa como herramienta de apoyo durante todo el proyecto. Lo declara en cada método y en este informe, como exige el enunciado. </w:t>
+        <w:t xml:space="preserve">El equipo usó IA generativa como herramienta de apoyo durante todo el proyecto. Lo declara en cada método y en este informe, como exige el enunciado. La versión 1.0 reportaba 139 docstrings con los siete elementos. En el árbol actual hay 164 declaraciones Uso de IA: Si y ninguna Uso de IA: No; tests/test_documentacion_metodos.py comprueba la convención formal, no la exactitud de cada atribución.</w:t>
       </w:r>
       <w:r>
         <w:rPr>
           <w:b/>
           <w:bCs/>
         </w:rPr>
-        <w:t xml:space="preserve">Los 139 docstrings con los siete elementos (métodos y clases) declaran </w:t>
+        <w:t xml:space="preserve"/>
       </w:r>
       <w:r>
         <w:rPr>
@@ -20309,19 +20310,19 @@
           <w:b/>
           <w:bCs/>
         </w:rPr>
-        <w:t>Uso de IA: Si</w:t>
-      </w:r>
-      <w:r>
-        <w:t xml:space="preserve">; ninguno declara </w:t>
+        <w:t/>
+      </w:r>
+      <w:r>
+        <w:t xml:space="preserve"/>
       </w:r>
       <w:r>
         <w:rPr>
           <w:rStyle w:val="VerbatimChar"/>
         </w:rPr>
-        <w:t>No</w:t>
-      </w:r>
-      <w:r>
-        <w:t>.</w:t>
+        <w:t/>
+      </w:r>
+      <w:r>
+        <w:t/>
       </w:r>
     </w:p>
     <w:p>
@@ -20709,6 +20710,278 @@
           <w:sz w:val="4"/>
         </w:rPr>
       </w:pPr>
+    </w:p>
+    <w:p>
+      <w:pPr>
+        <w:pStyle w:val="Ttulo1"/>
+      </w:pPr>
+      <w:r>
+        <w:t xml:space="preserve">18. Integración actual de la interfaz, historial y experimentos</w:t>
+      </w:r>
+    </w:p>
+    <w:p>
+      <w:pPr>
+        <w:pStyle w:val="FirstParagraph"/>
+      </w:pPr>
+      <w:r>
+        <w:t xml:space="preserve">Esta sección complementa la versión técnica 1.0. La integración descrita corresponde al código del árbol revisado el 20 de octubre de 2026; no reemplaza ni mezcla las mediciones históricas de las secciones 12.2 a 12.6.</w:t>
+      </w:r>
+    </w:p>
+    <w:p>
+      <w:pPr>
+        <w:pStyle w:val="Ttulo2"/>
+      </w:pPr>
+      <w:r>
+        <w:t xml:space="preserve">18.1. Escenario, estado y reglas de partida</w:t>
+      </w:r>
+    </w:p>
+    <w:p>
+      <w:pPr>
+        <w:pStyle w:val="Compact"/>
+      </w:pPr>
+      <w:r>
+        <w:t xml:space="preserve">El cargador valida el JSON completo antes de construir Escenario. Escenario conserva dimensiones, terrenos, costos, bases y configuración; EstadoJuego conserva posiciones, bando en turno, ubicación del recurso libre o su portador y terminalidad.</w:t>
+      </w:r>
+    </w:p>
+    <w:p>
+      <w:pPr>
+        <w:pStyle w:val="Compact"/>
+      </w:pPr>
+      <w:r>
+        <w:t xml:space="preserve">Una acción legal mueve una unidad ortogonal del bando activo a una celda transitable y libre. El costo es el del terreno destino leído del JSON. El turno alterna tras una acción; preparar_turno gestiona bloqueos sin inventar un movimiento.</w:t>
+      </w:r>
+    </w:p>
+    <w:p>
+      <w:pPr>
+        <w:pStyle w:val="Compact"/>
+      </w:pPr>
+      <w:r>
+        <w:t xml:space="preserve">Al entrar en la celda del recurso libre, la unidad lo recoge; el recurso acompaña al portador. Una intercepción legal transfiere el portador sin desplazar unidades. Gana el bando cuyo portador llega a su propia base; después de un estado terminal no se aceptan acciones nuevas.</w:t>
+      </w:r>
+    </w:p>
+    <w:p>
+      <w:pPr>
+        <w:pStyle w:val="Ttulo2"/>
+      </w:pPr>
+      <w:r>
+        <w:t xml:space="preserve">18.2. Algoritmos, parámetros y métricas</w:t>
+      </w:r>
+    </w:p>
+    <w:p>
+      <w:pPr>
+        <w:pStyle w:val="Compact"/>
+      </w:pPr>
+      <w:r>
+        <w:t xml:space="preserve">BFS y DFS exploran por número de movimientos y por profundidad; UCS acumula costos del JSON. A* combina g(n) con Manhattan escalada o HTO, que calcula distancia por celdas transitables respetando obstáculos. Las garantías dependen del contrato de movimientos ortogonales y costos positivos descrito en las secciones 7 y 8.</w:t>
+      </w:r>
+    </w:p>
+    <w:p>
+      <w:pPr>
+        <w:pStyle w:val="Compact"/>
+      </w:pPr>
+      <w:r>
+        <w:t xml:space="preserve">Beam Search limita la frontera con k. La interfaz permite ajustar k con &lt; y &gt;; la experimentación académica compara k = 1, 2, 4 y 8. Un haz mayor no garantiza una solución de menor costo.</w:t>
+      </w:r>
+    </w:p>
+    <w:p>
+      <w:pPr>
+        <w:pStyle w:val="Compact"/>
+      </w:pPr>
+      <w:r>
+        <w:t xml:space="preserve">Minimax y alfa-beta consumen las acciones tácticas legales y la misma función de utilidad de suma cero. La profundidad se configura desde el JSON o desde el control gráfico; los órdenes generación, inverso y táctico cambian la cantidad de poda y pueden cambiar el desempate, no el valor Minimax.</w:t>
+      </w:r>
+    </w:p>
+    <w:p>
+      <w:pPr>
+        <w:pStyle w:val="Compact"/>
+      </w:pPr>
+      <w:r>
+        <w:t xml:space="preserve">Búsqueda expone algoritmo, éxito, camino, longitud, costo, estados generados y expandidos, frontera máxima y tiempo. Decisión expone algoritmo, bando, profundidades configurada y alcanzada, acción, unidad, valor, nodos generados/evaluados/podados y tiempo. Los contadores provienen de los resultados de los algoritmos.</w:t>
+      </w:r>
+    </w:p>
+    <w:p>
+      <w:pPr>
+        <w:pStyle w:val="Ttulo2"/>
+      </w:pPr>
+      <w:r>
+        <w:t xml:space="preserve">18.3. Partida gráfica y verificación</w:t>
+      </w:r>
+    </w:p>
+    <w:p>
+      <w:pPr>
+        <w:pStyle w:val="Compact"/>
+      </w:pPr>
+      <w:r>
+        <w:t xml:space="preserve">En modo partida, la persona selecciona una unidad del bando activo y ejecuta únicamente destinos que derivan de acciones legales del dominio. El panel muestra turno, portador, estado y acciones; el tablero representa el recurso libre o la insignia del portador. La GUI no introduce un número de turno porque EstadoJuego no lo contiene.</w:t>
+      </w:r>
+    </w:p>
+    <w:p>
+      <w:pPr>
+        <w:pStyle w:val="Compact"/>
+      </w:pPr>
+      <w:r>
+        <w:t xml:space="preserve">El historial guarda estado inicial y eventos efectivamente aplicados: bando, unidad, acción y parámetros, costo, pase de turno, estados y huellas SHA-256. Clics ilegales y evaluaciones no aplicadas quedan fuera. V construye el resultado de partida manual y verificar_partida reproduce las transiciones con las reglas reales.</w:t>
+      </w:r>
+    </w:p>
+    <w:p>
+      <w:pPr>
+        <w:pStyle w:val="Compact"/>
+      </w:pPr>
+      <w:r>
+        <w:t xml:space="preserve">Evaluar Minimax o alfa-beta no modifica el tablero ni el historial. La recomendación requiere verificación y confirmación explícita antes de aplicar. Al aplicarla, la transición se registra como jugada y se invalida el resultado calculado sobre el estado anterior.</w:t>
+      </w:r>
+    </w:p>
+    <w:p>
+      <w:pPr>
+        <w:pStyle w:val="Ttulo2"/>
+      </w:pPr>
+      <w:r>
+        <w:t xml:space="preserve">18.4. Exportación y reproducción</w:t>
+      </w:r>
+    </w:p>
+    <w:p>
+      <w:pPr>
+        <w:pStyle w:val="Compact"/>
+      </w:pPr>
+      <w:r>
+        <w:t xml:space="preserve">J exporta búsqueda y decisiones originales mediante E10.3. Una partida manual o decisión adversarial posterior a jugadas utiliza el formato adicional tacticalgrid.partida/1, independiente del contrato del profesor. Incluye copia Base64 del JSON, hashes del escenario/registro, estado inicial y final, acciones ordenadas, costos, huellas, resultado y evaluación opcional.</w:t>
+      </w:r>
+    </w:p>
+    <w:p>
+      <w:pPr>
+        <w:pStyle w:val="Compact"/>
+      </w:pPr>
+      <w:r>
+        <w:t xml:space="preserve">python main.py --consola --reproducir-registro ARCHIVO valida formato e integridad, carga la copia del escenario, vuelve a aplicar cada acción legal y compara estados, costos y resultado. Si existe decisión, la reejecuta y coteja propiedades deterministas; solo excluye tiempo. Registros alterados, truncados o incompatibles se rechazan.</w:t>
+      </w:r>
+    </w:p>
+    <w:p>
+      <w:pPr>
+        <w:pStyle w:val="Ttulo2"/>
+      </w:pPr>
+      <w:r>
+        <w:t xml:space="preserve">18.5. Diez experimentos actuales</w:t>
+      </w:r>
+    </w:p>
+    <w:p>
+      <w:pPr>
+        <w:pStyle w:val="FirstParagraph"/>
+      </w:pPr>
+      <w:r>
+        <w:t xml:space="preserve">Las cifras siguientes proceden de la ejecución del 20 de octubre de 2026 con Python 3.12.3. Cada ejecución incluye hash de JSON, parámetros, resultado y reporte del verificador en docs/experimentos/resultados-casos-minimos.json; el informe interpretativo es docs/experimentos/casos-minimos.md.</w:t>
+      </w:r>
+    </w:p>
+    <w:p>
+      <w:pPr>
+        <w:pStyle w:val="Compact"/>
+      </w:pPr>
+      <w:r>
+        <w:t xml:space="preserve">Caso 1, campo_20x20: BFS 16 pasos/costo 45/205 generados/186 expandidos/frontera 20; DFS 98/283/206/102/104. Ambos reportes válidos.</w:t>
+      </w:r>
+    </w:p>
+    <w:p>
+      <w:pPr>
+        <w:pStyle w:val="Compact"/>
+      </w:pPr>
+      <w:r>
+        <w:t xml:space="preserve">Caso 2, ruta_corta_vs_economica: BFS 8 pasos y costo 50; UCS 12 pasos y costo 12. Esto contrasta cantidad de movimientos y costo acumulado en este mapa.</w:t>
+      </w:r>
+    </w:p>
+    <w:p>
+      <w:pPr>
+        <w:pStyle w:val="Compact"/>
+      </w:pPr>
+      <w:r>
+        <w:t xml:space="preserve">Caso 3, obstaculo_rodeo: A* Manhattan y UCS rodean la barrera; ambos registran 15 pasos y costo 16, con verificación válida.</w:t>
+      </w:r>
+    </w:p>
+    <w:p>
+      <w:pPr>
+        <w:pStyle w:val="Compact"/>
+      </w:pPr>
+      <w:r>
+        <w:t xml:space="preserve">Caso 4, mismo mapa: A* Manhattan genera/expande 40/33, HTO 38/26 y UCS 41/39; las tres rutas son de 15 pasos y costo 16. En esta instancia HTO expande menos que Manhattan; no es una prueba universal de admisibilidad.</w:t>
+      </w:r>
+    </w:p>
+    <w:p>
+      <w:pPr>
+        <w:pStyle w:val="Compact"/>
+      </w:pPr>
+      <w:r>
+        <w:t xml:space="preserve">Caso 5, campo_20x20: Beam k=1 y k=2 no encuentran solución (74 y 137 expandidos); k=4 encuentra ruta de 34 pasos/costo 40/133 expandidos; k=8, 36/costo 46/276. Los cuatro resultados se verificaron estructuralmente.</w:t>
+      </w:r>
+    </w:p>
+    <w:p>
+      <w:pPr>
+        <w:pStyle w:val="Compact"/>
+      </w:pPr>
+      <w:r>
+        <w:t xml:space="preserve">Caso 6, estado compuesto: las seis posiciones unitarias coinciden, pero cambia portador y huella; utilidades iniciales 4 y 92. Alfa-beta profundidad 4 entrega decisiones distintas y reportes válidos.</w:t>
+      </w:r>
+    </w:p>
+    <w:p>
+      <w:pPr>
+        <w:pStyle w:val="Compact"/>
+      </w:pPr>
+      <w:r>
+        <w:t xml:space="preserve">Caso 7, decision_adversarial: a profundidad 1 Minimax recomienda recoger con A1 (valor 37); entre profundidades 2 y 4 recomienda A3 en (2,2), con valores −37, 37 y −39. Es evidencia del escenario, no una regla general.</w:t>
+      </w:r>
+    </w:p>
+    <w:p>
+      <w:pPr>
+        <w:pStyle w:val="Compact"/>
+      </w:pPr>
+      <w:r>
+        <w:t xml:space="preserve">Caso 8, recurso_en_transporte profundidad 4/generación: Minimax y alfa-beta coinciden en A1 a (0,3), valor 72. Minimax evalúa 5238 hojas; alfa-beta 600 y cuenta 907 ramas podadas.</w:t>
+      </w:r>
+    </w:p>
+    <w:p>
+      <w:pPr>
+        <w:pStyle w:val="Compact"/>
+      </w:pPr>
+      <w:r>
+        <w:t xml:space="preserve">Caso 9: cambiar el orden en recurso_en_transporte produce 600/721/428 hojas evaluadas y 907/1115/843 podas para generación/inverso/táctico; el valor es 72. En campo_20x20 los conteos evaluados son 569/1570/465 y el valor −36. Las decisiones empatadas pueden diferir por orden.</w:t>
+      </w:r>
+    </w:p>
+    <w:p>
+      <w:pPr>
+        <w:pStyle w:val="Compact"/>
+      </w:pPr>
+      <w:r>
+        <w:t xml:space="preserve">Caso 10: en recurso_en_transporte, profundidades 1 a 4 producen valores 74, 72, 76 y 72. Minimax evalúa 8, 71, 582 y 5238 hojas; alfa-beta 8, 31, 191 y 600. Las decisiones pueden cambiar con el horizonte.</w:t>
+      </w:r>
+    </w:p>
+    <w:p>
+      <w:pPr>
+        <w:pStyle w:val="Ttulo2"/>
+      </w:pPr>
+      <w:r>
+        <w:t xml:space="preserve">18.6. Complejidad, límites y procedencia</w:t>
+      </w:r>
+    </w:p>
+    <w:p>
+      <w:pPr>
+        <w:pStyle w:val="Compact"/>
+      </w:pPr>
+      <w:r>
+        <w:t xml:space="preserve">Sobre el grafo explícito: BFS y DFS tienen O(V + E) tiempo y O(V) memoria; UCS y A* con cola de prioridad tienen O((V + E) log V), más la preparación/costo de la heurística. Beam expande como máximo k estados por nivel, pero reúne candidatos de sus sucesores antes de recortar: memoria del haz O(k), candidatos O(kb) por nivel y visitados hasta O(V). Minimax explora O(b^d) nodos y usa O(d) niveles en búsqueda en profundidad; alfa-beta conserva ese peor caso y con orden favorable reduce el trabajo hacia O(b^(d/2)). En el código, construcción, igualdad y hash de EstadoJuego agregan el costo asociado a U unidades; las complejidades por método y supuestos constan en sus docstrings.</w:t>
+      </w:r>
+    </w:p>
+    <w:p>
+      <w:pPr>
+        <w:pStyle w:val="Compact"/>
+      </w:pPr>
+      <w:r>
+        <w:t xml:space="preserve">Los tiempos guardados son de una ejecución por configuración y dependen del equipo. No son una comparación estadística. No se comprobó aquí una ventana de escritorio ni se recibió el JSON oficial externo; la GUI se probó automáticamente con SDL dummy. La guía manual mantiene ambas tareas pendientes.</w:t>
+      </w:r>
+    </w:p>
+    <w:p>
+      <w:pPr>
+        <w:pStyle w:val="Textodebloque"/>
+      </w:pPr>
+      <w:r>
+        <w:t xml:space="preserve">Uso de IA en esta actualización: Codex integró historial/verificación y registro/reproducción, ejecutó el script de los diez casos y redactó esta actualización a partir del código y la evidencia guardada. Validación estudiantil y revisión visual de este documento: pendientes; no se atribuyen al equipo.</w:t>
+      </w:r>
     </w:p>
     <w:p>
       <w:pPr>

</xml_diff>

<commit_message>
docs: actualiza la documentación al estado actual del proyecto y repara los docx
</commit_message>
<xml_diff>
--- a/docs/entregables/documento-tecnico.docx
+++ b/docs/entregables/documento-tecnico.docx
@@ -7168,7 +7168,7 @@
           <w:b/>
           <w:bCs/>
         </w:rPr>
-        <w:t xml:space="preserve">Interfaz gráfica: python main.py abre Pygame. La GUI ofrece búsqueda, partida manual y evaluación adversarial; carga JSON con O o arrastrando el archivo, permite verificar con V, exportar con J y reiniciar la partida con R. Q evalúa, C compara y A confirma una recomendación adversarial.</w:t>
+        <w:t xml:space="preserve">Interfaz gráfica: python main.py abre Pygame. La GUI ofrece búsqueda, partida manual o controlada por algoritmos y evaluación adversarial; carga JSON con O o arrastrando el archivo, permite verificar con V, exportar con J y reiniciar la partida con R. Q evalúa, C compara y A confirma una recomendación adversarial. En la partida controlada por algoritmos, N aplica la jugada del bando en turno.</w:t>
       </w:r>
       <w:r>
         <w:t xml:space="preserve"/>
@@ -7280,7 +7280,7 @@
         <w:t>--algoritmo</w:t>
       </w:r>
       <w:r>
-        <w:t xml:space="preserve">. Acepta profundidad, orden de acciones, </w:t>
+        <w:t xml:space="preserve">. Acepta heurística de A*, profundidad, orden de acciones, </w:t>
       </w:r>
       <w:r>
         <w:rPr>
@@ -7375,7 +7375,28 @@
         <w:t>Python 3.12 o 3.13:</w:t>
       </w:r>
       <w:r>
-        <w:t xml:space="preserve"> Pygame aún no publica una versión para 3.14.</w:t>
+        <w:t xml:space="preserve"> </w:t>
+      </w:r>
+      <w:r>
+        <w:t xml:space="preserve">es el rango que declara </w:t>
+      </w:r>
+      <w:r>
+        <w:rPr>
+          <w:rStyle w:val="VerbatimChar"/>
+        </w:rPr>
+        <w:t>requires-python</w:t>
+      </w:r>
+      <w:r>
+        <w:t xml:space="preserve"> en </w:t>
+      </w:r>
+      <w:r>
+        <w:rPr>
+          <w:rStyle w:val="VerbatimChar"/>
+        </w:rPr>
+        <w:t>pyproject.toml</w:t>
+      </w:r>
+      <w:r>
+        <w:t>.</w:t>
       </w:r>
     </w:p>
     <w:p>
@@ -8721,7 +8742,7 @@
         <w:t>Simetría:</w:t>
       </w:r>
       <w:r>
-        <w:t xml:space="preserve"> A y B usan exactamente las mismas reglas. Todas las unidades son del tipo </w:t>
+        <w:t xml:space="preserve"> A y B usan exactamente las mismas reglas. Todas las unidades se comportan igual; casi todas son del tipo </w:t>
       </w:r>
       <w:r>
         <w:rPr>
@@ -10156,7 +10177,22 @@
         <w:t>respetando los muros</w:t>
       </w:r>
       <w:r>
-        <w:t xml:space="preserve">. Se calcula una sola vez por problema, con un BFS inverso desde el objetivo. Cada consulta cuesta O(1) promedio, más O(U) para localizar la unidad. Se usa desde la API: </w:t>
+        <w:t xml:space="preserve">. Se calcula una sola vez por problema, con un BFS inverso desde el objetivo. Cada consulta cuesta O(1) promedio, más O(U) para localizar la unidad. </w:t>
+      </w:r>
+      <w:r>
+        <w:t xml:space="preserve">Se elige con </w:t>
+      </w:r>
+      <w:r>
+        <w:rPr>
+          <w:rStyle w:val="VerbatimChar"/>
+        </w:rPr>
+        <w:t>--heuristica hto</w:t>
+      </w:r>
+      <w:r>
+        <w:t xml:space="preserve"> en la consola</w:t>
+      </w:r>
+      <w:r>
+        <w:t xml:space="preserve">, con el control Heurística A* en la interfaz o desde la API: </w:t>
       </w:r>
       <w:r>
         <w:rPr>
@@ -12777,7 +12813,7 @@
           <w:b/>
           <w:bCs/>
         </w:rPr>
-        <w:t xml:space="preserve">Elegir el escenario. El catálogo incluye nueve escenarios didácticos y un fixture de GUI. Dos mapas principales son de 20 × 20; los mapas menores preservan propiedades experimentales concretas. La clasificación y validación está en docs/tecnico/catalogo-escenarios.md.</w:t>
+        <w:t xml:space="preserve">Elegir el escenario. El catálogo incluye nueve escenarios didácticos, cinco variantes académicas de 20 × 20 y un fixture de GUI. Dos mapas principales son de 20 × 20; los mapas menores preservan propiedades experimentales concretas. La clasificación y validación está en docs/tecnico/catalogo-escenarios.md.</w:t>
       </w:r>
       <w:r>
         <w:t xml:space="preserve"/>
@@ -18490,7 +18526,7 @@
         <w:rPr>
           <w:rStyle w:val="VerbatimChar"/>
         </w:rPr>
-        <w:t xml:space="preserve">El 20 de octubre de 2026, .venv/bin/python -m pytest ejecutó 974 pruebas: todas aprobadas. Las pruebas de interfaz usan SDL dummy y no sustituyen la inspección visual en escritorio.</w:t>
+        <w:t xml:space="preserve">El 20 de octubre de 2026, python -m pytest ejecutó 1071 pruebas: todas aprobadas. Las pruebas de interfaz usan SDL dummy y no sustituyen la inspección visual en escritorio.</w:t>
       </w:r>
       <w:r>
         <w:t xml:space="preserve"/>
@@ -18644,7 +18680,7 @@
               <w:rPr>
                 <w:sz w:val="17"/>
               </w:rPr>
-              <w:t>454</w:t>
+              <w:t>477</w:t>
             </w:r>
           </w:p>
         </w:tc>
@@ -18701,7 +18737,7 @@
               <w:rPr>
                 <w:sz w:val="17"/>
               </w:rPr>
-              <w:t>178</w:t>
+              <w:t>190</w:t>
             </w:r>
           </w:p>
         </w:tc>
@@ -18815,7 +18851,7 @@
               <w:rPr>
                 <w:sz w:val="17"/>
               </w:rPr>
-              <w:t>101</w:t>
+              <w:t>171</w:t>
             </w:r>
           </w:p>
         </w:tc>
@@ -18832,7 +18868,7 @@
               <w:rPr>
                 <w:sz w:val="17"/>
               </w:rPr>
-              <w:t>Render, controles, caminos, capa de exploración y apertura de escenarios JSON.</w:t>
+              <w:t>Render, controles, caminos, capa de exploración, apertura de escenarios JSON, partida manual y por algoritmos, y evaluación adversarial.</w:t>
             </w:r>
           </w:p>
         </w:tc>
@@ -18872,7 +18908,7 @@
               <w:rPr>
                 <w:sz w:val="17"/>
               </w:rPr>
-              <w:t>77</w:t>
+              <w:t>113</w:t>
             </w:r>
           </w:p>
         </w:tc>
@@ -18901,7 +18937,7 @@
               <w:rPr>
                 <w:sz w:val="17"/>
               </w:rPr>
-              <w:t>, precedencia consola–JSON, partidas y registro reproducible.</w:t>
+              <w:t>, precedencia consola–JSON, partidas, agentes de la partida por algoritmos, registro reproducible y reproducción de partidas.</w:t>
             </w:r>
           </w:p>
         </w:tc>
@@ -19299,7 +19335,7 @@
               <w:rPr>
                 <w:sz w:val="17"/>
               </w:rPr>
-              <w:t>HTO solo se elige desde la API y el script experimental; la consola y la interfaz usan Manhattan en A*.</w:t>
+              <w:t>En la partida por algoritmos, BFS, DFS, UCS, A* y Beam planean hacia una meta táctica fija y aplican solo el primer paso del camino.</w:t>
             </w:r>
           </w:p>
         </w:tc>
@@ -19316,19 +19352,7 @@
               <w:rPr>
                 <w:sz w:val="17"/>
               </w:rPr>
-              <w:t xml:space="preserve">Comparar heurísticas exige </w:t>
-            </w:r>
-            <w:r>
-              <w:rPr>
-                <w:rStyle w:val="VerbatimChar"/>
-              </w:rPr>
-              <w:t>scripts/comparar_heuristicas_e62.py</w:t>
-            </w:r>
-            <w:r>
-              <w:rPr>
-                <w:sz w:val="17"/>
-              </w:rPr>
-              <w:t xml:space="preserve"> o código Python.</w:t>
+              <w:t>Un bando controlado por un algoritmo de búsqueda no anticipa la respuesta del rival.</w:t>
             </w:r>
           </w:p>
         </w:tc>
@@ -19345,19 +19369,7 @@
               <w:rPr>
                 <w:sz w:val="17"/>
               </w:rPr>
-              <w:t xml:space="preserve">Agregar </w:t>
-            </w:r>
-            <w:r>
-              <w:rPr>
-                <w:rStyle w:val="VerbatimChar"/>
-              </w:rPr>
-              <w:t>--heuristica</w:t>
-            </w:r>
-            <w:r>
-              <w:rPr>
-                <w:sz w:val="17"/>
-              </w:rPr>
-              <w:t xml:space="preserve"> a la consola y a la interfaz.</w:t>
+              <w:t>Usar Minimax o alfa-beta cuando se deba considerar al adversario.</w:t>
             </w:r>
           </w:p>
         </w:tc>
@@ -19379,7 +19391,7 @@
               <w:rPr>
                 <w:sz w:val="17"/>
               </w:rPr>
-              <w:t>La interfaz gráfica muestra búsquedas, no decisiones adversariales ni partidas.</w:t>
+              <w:t>La interfaz no dibuja el árbol de Minimax ni la frontera de las búsquedas.</w:t>
             </w:r>
           </w:p>
         </w:tc>
@@ -19396,7 +19408,7 @@
               <w:rPr>
                 <w:sz w:val="17"/>
               </w:rPr>
-              <w:t>Minimax, alfa-beta y las partidas se observan por consola o JSON.</w:t>
+              <w:t>Las decisiones se explican con la acción recomendada, los valores y las métricas; la capa de exploración solo muestra estados expandidos.</w:t>
             </w:r>
           </w:p>
         </w:tc>
@@ -19413,7 +19425,7 @@
               <w:rPr>
                 <w:sz w:val="17"/>
               </w:rPr>
-              <w:t>Visualizar el árbol o la secuencia de jugadas.</w:t>
+              <w:t>Visualizar el árbol de decisión o la frontera.</w:t>
             </w:r>
           </w:p>
         </w:tc>
@@ -19807,7 +19819,7 @@
               <w:rPr>
                 <w:sz w:val="17"/>
               </w:rPr>
-              <w:t xml:space="preserve">Todas las unidades son del tipo </w:t>
+              <w:t xml:space="preserve">Todas las unidades se comportan igual; casi todas son del tipo </w:t>
             </w:r>
             <w:r>
               <w:rPr>
@@ -20295,7 +20307,7 @@
         <w:pStyle w:val="FirstParagraph"/>
       </w:pPr>
       <w:r>
-        <w:t xml:space="preserve">El equipo usó IA generativa como herramienta de apoyo durante todo el proyecto. Lo declara en cada método y en este informe, como exige el enunciado. La versión 1.0 reportaba 139 docstrings con los siete elementos. En el árbol actual hay 164 declaraciones Uso de IA: Si y ninguna Uso de IA: No; tests/test_documentacion_metodos.py comprueba la convención formal, no la exactitud de cada atribución.</w:t>
+        <w:t xml:space="preserve">El equipo usó IA generativa como herramienta de apoyo durante todo el proyecto. Lo declara en cada método y en este informe, como exige el enunciado. La versión 1.0 reportaba 139 docstrings con los siete elementos. En el árbol actual hay 233 declaraciones Uso de IA: Si y ninguna Uso de IA: No; tests/test_documentacion_metodos.py comprueba la convención formal, no la exactitud de cada atribución.</w:t>
       </w:r>
       <w:r>
         <w:rPr>
@@ -20360,7 +20372,7 @@
         <w:t>Claude (Anthropic: Opus 5.5, Sonnet 5.5 y Sonnet 5):</w:t>
       </w:r>
       <w:r>
-        <w:t xml:space="preserve"> recurso y transporte (E3.2); intercepción y tácticas (E8.1); Beam Search (E7); utilidad, Minimax, alfa-beta, comparación y orden de acciones (E8.2 a E8.6); modos de prueba, verificador y registro (E10); y la unificación de la documentación de métodos (E11.1).</w:t>
+        <w:t xml:space="preserve"> recurso y transporte (E3.2); intercepción y tácticas (E8.1); Beam Search (E7); utilidad, Minimax, alfa-beta, comparación y orden de acciones (E8.2 a E8.6); modos de prueba, verificador y registro (E10); la partida por turnos entre algoritmos en la interfaz (E9.5); y la unificación de la documentación de métodos (E11.1).</w:t>
       </w:r>
     </w:p>
     <w:p>
@@ -20534,7 +20546,7 @@
         <w:t>Pruebas automatizadas.</w:t>
       </w:r>
       <w:r>
-        <w:t xml:space="preserve"> Ningún aporte se aceptó sin pruebas. En esta versión pasan 930.</w:t>
+        <w:t xml:space="preserve"> Ningún aporte se aceptó sin pruebas. En esta versión pasan 1071.</w:t>
       </w:r>
     </w:p>
     <w:p>
@@ -20669,16 +20681,7 @@
         <w:t>Intervención:</w:t>
       </w:r>
       <w:r>
-        <w:t xml:space="preserve"> Claude (Opus 5.5) eligió la estructura a partir de plantillas de documentos de diseño técnico y redactó el borrador a partir del código, el README y los documentos de detalle. También regeneró todas las cifras con el código de esta versión y ejecutó el experimento del pantano. Por último, aplicó el diseño editorial de </w:t>
-      </w:r>
-      <w:r>
-        <w:rPr>
-          <w:rStyle w:val="VerbatimChar"/>
-        </w:rPr>
-        <w:t>DESIGN.md</w:t>
-      </w:r>
-      <w:r>
-        <w:t xml:space="preserve"> al Word.</w:t>
+        <w:t xml:space="preserve"> Claude (Opus 5.5) eligió la estructura a partir de plantillas de documentos de diseño técnico y redactó el borrador a partir del código, el README y los documentos de detalle. También regeneró todas las cifras con el código de esta versión y ejecutó el experimento del pantano. Por último, aplicó el diseño editorial al Word.</w:t>
       </w:r>
     </w:p>
     <w:p>
@@ -20788,7 +20791,22 @@
         <w:pStyle w:val="Compact"/>
       </w:pPr>
       <w:r>
-        <w:t xml:space="preserve">Minimax y alfa-beta consumen las acciones tácticas legales y la misma función de utilidad de suma cero. La profundidad se configura desde el JSON o desde el control gráfico; los órdenes generación, inverso y táctico cambian la cantidad de poda y pueden cambiar el desempate, no el valor Minimax.</w:t>
+        <w:t xml:space="preserve">Minimax y alfa-beta consumen las acciones tácticas legales y la misma función de utilidad de suma cero. La profundidad se configura desde el JSON, </w:t>
+      </w:r>
+      <w:r>
+        <w:t>la consola (</w:t>
+      </w:r>
+      <w:r>
+        <w:rPr>
+          <w:rStyle w:val="VerbatimChar"/>
+        </w:rPr>
+        <w:t>--profundidad</w:t>
+      </w:r>
+      <w:r>
+        <w:t>) o el control gráfico;</w:t>
+      </w:r>
+      <w:r>
+        <w:t xml:space="preserve"> los órdenes generación, inverso y táctico cambian la cantidad de poda y pueden cambiar el desempate, no el valor Minimax.</w:t>
       </w:r>
     </w:p>
     <w:p>
@@ -20812,7 +20830,7 @@
         <w:pStyle w:val="Compact"/>
       </w:pPr>
       <w:r>
-        <w:t xml:space="preserve">En modo partida, la persona selecciona una unidad del bando activo y ejecuta únicamente destinos que derivan de acciones legales del dominio. El panel muestra turno, portador, estado y acciones; el tablero representa el recurso libre o la insignia del portador. La GUI no introduce un número de turno porque EstadoJuego no lo contiene.</w:t>
+        <w:t xml:space="preserve">En modo partida, la persona selecciona una unidad del bando activo y ejecuta únicamente destinos que derivan de acciones legales del dominio. El panel muestra turno, portador, estado y acciones; el tablero representa el recurso libre o la insignia del portador. La GUI no introduce un número de turno porque EstadoJuego no lo contiene. Con control por algoritmos, N aplica la jugada que decide el algoritmo elegido para el bando en turno y la registra en el mismo historial.</w:t>
       </w:r>
     </w:p>
     <w:p>
@@ -21752,6 +21770,342 @@
                 <w:sz w:val="17"/>
               </w:rPr>
               <w:t>Caso 7.</w:t>
+            </w:r>
+          </w:p>
+        </w:tc>
+      </w:tr>
+      <w:tr>
+        <w:trPr>
+          <w:cantSplit/>
+        </w:trPr>
+        <w:tc>
+          <w:tcPr>
+            <w:tcW w:w="3168" w:type="dxa"/>
+          </w:tcPr>
+          <w:p>
+            <w:pPr>
+              <w:pStyle w:val="Compact"/>
+              <w:spacing w:before="40" w:after="40" w:line="288" w:lineRule="auto"/>
+            </w:pPr>
+            <w:r>
+              <w:rPr>
+                <w:rStyle w:val="VerbatimChar"/>
+              </w:rPr>
+              <w:t>escenarios/caso_06_estado_compuesto_libre_20x20.json</w:t>
+            </w:r>
+          </w:p>
+        </w:tc>
+        <w:tc>
+          <w:tcPr>
+            <w:tcW w:w="792" w:type="dxa"/>
+          </w:tcPr>
+          <w:p>
+            <w:pPr>
+              <w:pStyle w:val="Compact"/>
+              <w:spacing w:before="40" w:after="40" w:line="288" w:lineRule="auto"/>
+            </w:pPr>
+            <w:r>
+              <w:rPr>
+                <w:sz w:val="17"/>
+              </w:rPr>
+              <w:t>20 × 20</w:t>
+            </w:r>
+          </w:p>
+        </w:tc>
+        <w:tc>
+          <w:tcPr>
+            <w:tcW w:w="3960" w:type="dxa"/>
+          </w:tcPr>
+          <w:p>
+            <w:pPr>
+              <w:pStyle w:val="Compact"/>
+              <w:spacing w:before="40" w:after="40" w:line="288" w:lineRule="auto"/>
+            </w:pPr>
+            <w:r>
+              <w:rPr>
+                <w:sz w:val="17"/>
+              </w:rPr>
+              <w:t>Caso 6, variante académica sin portador.</w:t>
+            </w:r>
+          </w:p>
+        </w:tc>
+      </w:tr>
+      <w:tr>
+        <w:trPr>
+          <w:cantSplit/>
+        </w:trPr>
+        <w:tc>
+          <w:tcPr>
+            <w:tcW w:w="3168" w:type="dxa"/>
+          </w:tcPr>
+          <w:p>
+            <w:pPr>
+              <w:pStyle w:val="Compact"/>
+              <w:spacing w:before="40" w:after="40" w:line="288" w:lineRule="auto"/>
+            </w:pPr>
+            <w:r>
+              <w:rPr>
+                <w:rStyle w:val="VerbatimChar"/>
+              </w:rPr>
+              <w:t>escenarios/caso_06_estado_compuesto_portador_20x20.json</w:t>
+            </w:r>
+          </w:p>
+        </w:tc>
+        <w:tc>
+          <w:tcPr>
+            <w:tcW w:w="792" w:type="dxa"/>
+          </w:tcPr>
+          <w:p>
+            <w:pPr>
+              <w:pStyle w:val="Compact"/>
+              <w:spacing w:before="40" w:after="40" w:line="288" w:lineRule="auto"/>
+            </w:pPr>
+            <w:r>
+              <w:rPr>
+                <w:sz w:val="17"/>
+              </w:rPr>
+              <w:t>20 × 20</w:t>
+            </w:r>
+          </w:p>
+        </w:tc>
+        <w:tc>
+          <w:tcPr>
+            <w:tcW w:w="3960" w:type="dxa"/>
+          </w:tcPr>
+          <w:p>
+            <w:pPr>
+              <w:pStyle w:val="Compact"/>
+              <w:spacing w:before="40" w:after="40" w:line="288" w:lineRule="auto"/>
+            </w:pPr>
+            <w:r>
+              <w:rPr>
+                <w:sz w:val="17"/>
+              </w:rPr>
+              <w:t>Caso 6, variante académica con portador.</w:t>
+            </w:r>
+          </w:p>
+        </w:tc>
+      </w:tr>
+      <w:tr>
+        <w:trPr>
+          <w:cantSplit/>
+        </w:trPr>
+        <w:tc>
+          <w:tcPr>
+            <w:tcW w:w="3168" w:type="dxa"/>
+          </w:tcPr>
+          <w:p>
+            <w:pPr>
+              <w:pStyle w:val="Compact"/>
+              <w:spacing w:before="40" w:after="40" w:line="288" w:lineRule="auto"/>
+            </w:pPr>
+            <w:r>
+              <w:rPr>
+                <w:rStyle w:val="VerbatimChar"/>
+              </w:rPr>
+              <w:t>escenarios/caso_07_decision_adversarial_20x20.json</w:t>
+            </w:r>
+          </w:p>
+        </w:tc>
+        <w:tc>
+          <w:tcPr>
+            <w:tcW w:w="792" w:type="dxa"/>
+          </w:tcPr>
+          <w:p>
+            <w:pPr>
+              <w:pStyle w:val="Compact"/>
+              <w:spacing w:before="40" w:after="40" w:line="288" w:lineRule="auto"/>
+            </w:pPr>
+            <w:r>
+              <w:rPr>
+                <w:sz w:val="17"/>
+              </w:rPr>
+              <w:t>20 × 20</w:t>
+            </w:r>
+          </w:p>
+        </w:tc>
+        <w:tc>
+          <w:tcPr>
+            <w:tcW w:w="3960" w:type="dxa"/>
+          </w:tcPr>
+          <w:p>
+            <w:pPr>
+              <w:pStyle w:val="Compact"/>
+              <w:spacing w:before="40" w:after="40" w:line="288" w:lineRule="auto"/>
+            </w:pPr>
+            <w:r>
+              <w:rPr>
+                <w:sz w:val="17"/>
+              </w:rPr>
+              <w:t>Caso 7, variante académica.</w:t>
+            </w:r>
+          </w:p>
+        </w:tc>
+      </w:tr>
+      <w:tr>
+        <w:trPr>
+          <w:cantSplit/>
+        </w:trPr>
+        <w:tc>
+          <w:tcPr>
+            <w:tcW w:w="3168" w:type="dxa"/>
+          </w:tcPr>
+          <w:p>
+            <w:pPr>
+              <w:pStyle w:val="Compact"/>
+              <w:spacing w:before="40" w:after="40" w:line="288" w:lineRule="auto"/>
+            </w:pPr>
+            <w:r>
+              <w:rPr>
+                <w:rStyle w:val="VerbatimChar"/>
+              </w:rPr>
+              <w:t>escenarios/caso_08_minimax_alfa_beta_20x20.json</w:t>
+            </w:r>
+          </w:p>
+        </w:tc>
+        <w:tc>
+          <w:tcPr>
+            <w:tcW w:w="792" w:type="dxa"/>
+          </w:tcPr>
+          <w:p>
+            <w:pPr>
+              <w:pStyle w:val="Compact"/>
+              <w:spacing w:before="40" w:after="40" w:line="288" w:lineRule="auto"/>
+            </w:pPr>
+            <w:r>
+              <w:rPr>
+                <w:sz w:val="17"/>
+              </w:rPr>
+              <w:t>20 × 20</w:t>
+            </w:r>
+          </w:p>
+        </w:tc>
+        <w:tc>
+          <w:tcPr>
+            <w:tcW w:w="3960" w:type="dxa"/>
+          </w:tcPr>
+          <w:p>
+            <w:pPr>
+              <w:pStyle w:val="Compact"/>
+              <w:spacing w:before="40" w:after="40" w:line="288" w:lineRule="auto"/>
+            </w:pPr>
+            <w:r>
+              <w:rPr>
+                <w:sz w:val="17"/>
+              </w:rPr>
+              <w:t>Caso 8, variante académica.</w:t>
+            </w:r>
+          </w:p>
+        </w:tc>
+      </w:tr>
+      <w:tr>
+        <w:trPr>
+          <w:cantSplit/>
+        </w:trPr>
+        <w:tc>
+          <w:tcPr>
+            <w:tcW w:w="3168" w:type="dxa"/>
+          </w:tcPr>
+          <w:p>
+            <w:pPr>
+              <w:pStyle w:val="Compact"/>
+              <w:spacing w:before="40" w:after="40" w:line="288" w:lineRule="auto"/>
+            </w:pPr>
+            <w:r>
+              <w:rPr>
+                <w:rStyle w:val="VerbatimChar"/>
+              </w:rPr>
+              <w:t>escenarios/caso_10_profundidad_20x20.json</w:t>
+            </w:r>
+          </w:p>
+        </w:tc>
+        <w:tc>
+          <w:tcPr>
+            <w:tcW w:w="792" w:type="dxa"/>
+          </w:tcPr>
+          <w:p>
+            <w:pPr>
+              <w:pStyle w:val="Compact"/>
+              <w:spacing w:before="40" w:after="40" w:line="288" w:lineRule="auto"/>
+            </w:pPr>
+            <w:r>
+              <w:rPr>
+                <w:sz w:val="17"/>
+              </w:rPr>
+              <w:t>20 × 20</w:t>
+            </w:r>
+          </w:p>
+        </w:tc>
+        <w:tc>
+          <w:tcPr>
+            <w:tcW w:w="3960" w:type="dxa"/>
+          </w:tcPr>
+          <w:p>
+            <w:pPr>
+              <w:pStyle w:val="Compact"/>
+              <w:spacing w:before="40" w:after="40" w:line="288" w:lineRule="auto"/>
+            </w:pPr>
+            <w:r>
+              <w:rPr>
+                <w:sz w:val="17"/>
+              </w:rPr>
+              <w:t>Caso 10, variante académica.</w:t>
+            </w:r>
+          </w:p>
+        </w:tc>
+      </w:tr>
+      <w:tr>
+        <w:trPr>
+          <w:cantSplit/>
+        </w:trPr>
+        <w:tc>
+          <w:tcPr>
+            <w:tcW w:w="3168" w:type="dxa"/>
+          </w:tcPr>
+          <w:p>
+            <w:pPr>
+              <w:pStyle w:val="Compact"/>
+              <w:spacing w:before="40" w:after="40" w:line="288" w:lineRule="auto"/>
+            </w:pPr>
+            <w:r>
+              <w:rPr>
+                <w:rStyle w:val="VerbatimChar"/>
+              </w:rPr>
+              <w:t>escenarios/prueba_gui_partida.json</w:t>
+            </w:r>
+          </w:p>
+        </w:tc>
+        <w:tc>
+          <w:tcPr>
+            <w:tcW w:w="792" w:type="dxa"/>
+          </w:tcPr>
+          <w:p>
+            <w:pPr>
+              <w:pStyle w:val="Compact"/>
+              <w:spacing w:before="40" w:after="40" w:line="288" w:lineRule="auto"/>
+            </w:pPr>
+            <w:r>
+              <w:rPr>
+                <w:sz w:val="17"/>
+              </w:rPr>
+              <w:t>5 × 5</w:t>
+            </w:r>
+          </w:p>
+        </w:tc>
+        <w:tc>
+          <w:tcPr>
+            <w:tcW w:w="3960" w:type="dxa"/>
+          </w:tcPr>
+          <w:p>
+            <w:pPr>
+              <w:pStyle w:val="Compact"/>
+              <w:spacing w:before="40" w:after="40" w:line="288" w:lineRule="auto"/>
+            </w:pPr>
+            <w:r>
+              <w:rPr>
+                <w:sz w:val="17"/>
+              </w:rPr>
+              <w:t>Validación manual de la partida en la interfaz.</w:t>
             </w:r>
           </w:p>
         </w:tc>

</xml_diff>

<commit_message>
feat:  se agregaron imagenes y documento hto
</commit_message>
<xml_diff>
--- a/docs/entregables/documento-tecnico.docx
+++ b/docs/entregables/documento-tecnico.docx
@@ -14758,20 +14758,15 @@
           <w:b/>
           <w:bCs/>
         </w:rPr>
-        <w:t>HTO</w:t>
-      </w:r>
-      <w:r>
-        <w:t xml:space="preserve"> solo mejora a Manhattan cuando un muro obliga a rodear. En los demás mapas se comporta igual y paga una preparación. En la campaña de E6.2, su tiempo total mediano fue mejor en </w:t>
-      </w:r>
+        <w:t>HTO redujo expansiones en obstaculo_rodeo.json, donde el muro obliga a rodear, y tuvo una mediana total de 1,192 ms frente a 1,285 ms de Manhattan. En ruta_corta_vs_economica.json y campo_20x20.json, la preparación no se compensó y la mediana total fue mayor. La campaña definitiva E6.2, su identificador, procedencia y SHA-256 se documentan en docs/tecnico/03-heuristica-hto.md, §11.4; la evidencia permanece en almacenamiento local externo al repositorio.</w:t>
+      </w:r>
+      <w:r/>
       <w:r>
         <w:rPr>
           <w:rStyle w:val="VerbatimChar"/>
         </w:rPr>
-        <w:t>obstaculo_rodeo.json</w:t>
-      </w:r>
-      <w:r>
-        <w:t xml:space="preserve"> (1,19 ms frente a 1,28 ms) y peor en los otros dos escenarios.</w:t>
-      </w:r>
+      </w:r>
+      <w:r/>
     </w:p>
     <w:p>
       <w:pPr>
@@ -19299,7 +19294,7 @@
               <w:rPr>
                 <w:sz w:val="17"/>
               </w:rPr>
-              <w:t>HTO solo se elige desde la API y el script experimental; la consola y la interfaz usan Manhattan en A*.</w:t>
+              <w:t>HTO puede añadir preparación sin reducir el trabajo ni el tiempo total en todos los escenarios.</w:t>
             </w:r>
           </w:p>
         </w:tc>
@@ -19316,19 +19311,17 @@
               <w:rPr>
                 <w:sz w:val="17"/>
               </w:rPr>
-              <w:t xml:space="preserve">Comparar heurísticas exige </w:t>
+              <w:t>En dos de los tres escenarios de la campaña definitiva, la mediana total HTO superó a Manhattan; ver docs/tecnico/03-heuristica-hto.md, §11.4 y §11.6.</w:t>
             </w:r>
             <w:r>
               <w:rPr>
                 <w:rStyle w:val="VerbatimChar"/>
               </w:rPr>
-              <w:t>scripts/comparar_heuristicas_e62.py</w:t>
-            </w:r>
-            <w:r>
-              <w:rPr>
-                <w:sz w:val="17"/>
-              </w:rPr>
-              <w:t xml:space="preserve"> o código Python.</w:t>
+            </w:r>
+            <w:r>
+              <w:rPr>
+                <w:sz w:val="17"/>
+              </w:rPr>
             </w:r>
           </w:p>
         </w:tc>
@@ -19345,19 +19338,17 @@
               <w:rPr>
                 <w:sz w:val="17"/>
               </w:rPr>
-              <w:t xml:space="preserve">Agregar </w:t>
+              <w:t>Comparar por escenario e incluir preparación y búsqueda en el tiempo total.</w:t>
             </w:r>
             <w:r>
               <w:rPr>
                 <w:rStyle w:val="VerbatimChar"/>
               </w:rPr>
-              <w:t>--heuristica</w:t>
-            </w:r>
-            <w:r>
-              <w:rPr>
-                <w:sz w:val="17"/>
-              </w:rPr>
-              <w:t xml:space="preserve"> a la consola y a la interfaz.</w:t>
+            </w:r>
+            <w:r>
+              <w:rPr>
+                <w:sz w:val="17"/>
+              </w:rPr>
             </w:r>
           </w:p>
         </w:tc>
@@ -19379,7 +19370,7 @@
               <w:rPr>
                 <w:sz w:val="17"/>
               </w:rPr>
-              <w:t>La interfaz gráfica muestra búsquedas, no decisiones adversariales ni partidas.</w:t>
+              <w:t>La GUI muestra búsquedas, partidas manuales y evaluaciones Minimax/alfa-beta; no visualiza el árbol completo.</w:t>
             </w:r>
           </w:p>
         </w:tc>
@@ -19396,7 +19387,7 @@
               <w:rPr>
                 <w:sz w:val="17"/>
               </w:rPr>
-              <w:t>Minimax, alfa-beta y las partidas se observan por consola o JSON.</w:t>
+              <w:t>La recomendación y sus métricas se muestran sin aplicar la acción automáticamente.</w:t>
             </w:r>
           </w:p>
         </w:tc>
@@ -19413,7 +19404,7 @@
               <w:rPr>
                 <w:sz w:val="17"/>
               </w:rPr>
-              <w:t>Visualizar el árbol o la secuencia de jugadas.</w:t>
+              <w:t>Visualizar el árbol completo, si el análisis lo requiere.</w:t>
             </w:r>
           </w:p>
         </w:tc>

</xml_diff>